<commit_message>
ci+docs: 기획서를 검사 뒤 GitHub Pages로 배포 · README 재작성 · PLAN 수 묶기 (D-0222)
</commit_message>
<xml_diff>
--- a/docs/proposal.docx
+++ b/docs/proposal.docx
@@ -50017,7 +50017,25 @@
         <w:t xml:space="preserve"> </w:t>
       </w:r>
       <w:r>
-        <w:t xml:space="preserve">(D-0221). 결정마다</w:t>
+        <w:t xml:space="preserve">(D-0221). main에 들어가면 검사를 지난 뒤 GitHub Pages로 배포하고</w:t>
+      </w:r>
+      <w:r>
+        <w:t xml:space="preserve"> </w:t>
+      </w:r>
+      <w:r>
+        <w:rPr>
+          <w:rStyle w:val="VerbatimChar"/>
+        </w:rPr>
+        <w:t xml:space="preserve">site/proposal.html</w:t>
+      </w:r>
+      <w:r>
+        <w:t xml:space="preserve">이</w:t>
+      </w:r>
+      <w:r>
+        <w:t xml:space="preserve"> </w:t>
+      </w:r>
+      <w:r>
+        <w:t xml:space="preserve">그 docx를 변환 없이 그린다 (D-0222). 결정마다</w:t>
       </w:r>
       <w:r>
         <w:t xml:space="preserve"> </w:t>
@@ -50507,8 +50525,8 @@
         <w:tblLook w:firstRow="1" w:lastRow="0" w:firstColumn="0" w:lastColumn="0" w:noHBand="0" w:noVBand="0" w:val="0020"/>
       </w:tblPr>
       <w:tblGrid>
-        <w:gridCol w:w="3105"/>
-        <w:gridCol w:w="5966"/>
+        <w:gridCol w:w="3039"/>
+        <w:gridCol w:w="6032"/>
       </w:tblGrid>
       <w:tr>
         <w:trPr>
@@ -50516,7 +50534,7 @@
         </w:trPr>
         <w:tc>
           <w:tcPr>
-            <w:tcW w:type="dxa" w:w="3105"/>
+            <w:tcW w:type="dxa" w:w="3039"/>
             <w:shd w:val="clear" w:color="auto" w:fill="E8EEF5"/>
           </w:tcPr>
           <w:p>
@@ -50536,7 +50554,7 @@
         </w:tc>
         <w:tc>
           <w:tcPr>
-            <w:tcW w:type="dxa" w:w="5967"/>
+            <w:tcW w:type="dxa" w:w="6033"/>
             <w:shd w:val="clear" w:color="auto" w:fill="E8EEF5"/>
           </w:tcPr>
           <w:p>
@@ -50558,7 +50576,7 @@
       <w:tr>
         <w:tc>
           <w:tcPr>
-            <w:tcW w:type="dxa" w:w="3105"/>
+            <w:tcW w:type="dxa" w:w="3039"/>
           </w:tcPr>
           <w:p>
             <w:pPr>
@@ -50575,7 +50593,7 @@
         </w:tc>
         <w:tc>
           <w:tcPr>
-            <w:tcW w:type="dxa" w:w="5967"/>
+            <w:tcW w:type="dxa" w:w="6033"/>
           </w:tcPr>
           <w:p>
             <w:pPr>
@@ -50594,7 +50612,7 @@
       <w:tr>
         <w:tc>
           <w:tcPr>
-            <w:tcW w:type="dxa" w:w="3105"/>
+            <w:tcW w:type="dxa" w:w="3039"/>
           </w:tcPr>
           <w:p>
             <w:pPr>
@@ -50611,7 +50629,7 @@
         </w:tc>
         <w:tc>
           <w:tcPr>
-            <w:tcW w:type="dxa" w:w="5967"/>
+            <w:tcW w:type="dxa" w:w="6033"/>
           </w:tcPr>
           <w:p>
             <w:pPr>
@@ -50630,7 +50648,7 @@
       <w:tr>
         <w:tc>
           <w:tcPr>
-            <w:tcW w:type="dxa" w:w="3105"/>
+            <w:tcW w:type="dxa" w:w="3039"/>
           </w:tcPr>
           <w:p>
             <w:pPr>
@@ -50647,7 +50665,7 @@
         </w:tc>
         <w:tc>
           <w:tcPr>
-            <w:tcW w:type="dxa" w:w="5967"/>
+            <w:tcW w:type="dxa" w:w="6033"/>
           </w:tcPr>
           <w:p>
             <w:pPr>
@@ -50659,6 +50677,63 @@
                 <w:sz w:val="16"/>
               </w:rPr>
               <w:t xml:space="preserve">동일 시드 2회 실행 산출물 일치</w:t>
+            </w:r>
+          </w:p>
+        </w:tc>
+      </w:tr>
+      <w:tr>
+        <w:tc>
+          <w:tcPr>
+            <w:tcW w:type="dxa" w:w="3039"/>
+          </w:tcPr>
+          <w:p>
+            <w:pPr>
+              <w:pStyle w:val="Compact"/>
+              <w:spacing w:after="0" w:line="264" w:lineRule="auto"/>
+            </w:pPr>
+            <w:r>
+              <w:rPr>
+                <w:b/>
+                <w:bCs/>
+                <w:sz w:val="16"/>
+              </w:rPr>
+              <w:t xml:space="preserve">proposal</w:t>
+            </w:r>
+            <w:r>
+              <w:rPr>
+                <w:sz w:val="16"/>
+              </w:rPr>
+              <w:t xml:space="preserve"> </w:t>
+            </w:r>
+            <w:r>
+              <w:rPr>
+                <w:sz w:val="16"/>
+              </w:rPr>
+              <w:t xml:space="preserve">(배포)</w:t>
+            </w:r>
+          </w:p>
+        </w:tc>
+        <w:tc>
+          <w:tcPr>
+            <w:tcW w:type="dxa" w:w="6033"/>
+          </w:tcPr>
+          <w:p>
+            <w:pPr>
+              <w:pStyle w:val="Compact"/>
+              <w:spacing w:after="0" w:line="264" w:lineRule="auto"/>
+            </w:pPr>
+            <w:r>
+              <w:rPr>
+                <w:rStyle w:val="VerbatimChar"/>
+                <w:sz w:val="16"/>
+              </w:rPr>
+              <w:t xml:space="preserve">ci.yml</w:t>
+            </w:r>
+            <w:r>
+              <w:rPr>
+                <w:sz w:val="16"/>
+              </w:rPr>
+              <w:t xml:space="preserve">을 그대로 부른 뒤 기획서 지문 대조 → GitHub Pages. 검사를 지나야 올라간다 (D-0222)</w:t>
             </w:r>
           </w:p>
         </w:tc>

</xml_diff>

<commit_message>
tools+ci: MLflow · Prefect 연결 · GPU 러너는 손으로만 (D-0224)
</commit_message>
<xml_diff>
--- a/docs/proposal.docx
+++ b/docs/proposal.docx
@@ -15966,12 +15966,12 @@
         <w:tblLook w:firstRow="1" w:lastRow="0" w:firstColumn="0" w:lastColumn="0" w:noHBand="0" w:noVBand="0" w:val="0020"/>
       </w:tblPr>
       <w:tblGrid>
-        <w:gridCol w:w="2364"/>
-        <w:gridCol w:w="2235"/>
-        <w:gridCol w:w="547"/>
-        <w:gridCol w:w="598"/>
-        <w:gridCol w:w="776"/>
-        <w:gridCol w:w="2549"/>
+        <w:gridCol w:w="2345"/>
+        <w:gridCol w:w="2198"/>
+        <w:gridCol w:w="544"/>
+        <w:gridCol w:w="593"/>
+        <w:gridCol w:w="771"/>
+        <w:gridCol w:w="2619"/>
       </w:tblGrid>
       <w:tr>
         <w:trPr>
@@ -15979,7 +15979,7 @@
         </w:trPr>
         <w:tc>
           <w:tcPr>
-            <w:tcW w:type="dxa" w:w="2365"/>
+            <w:tcW w:type="dxa" w:w="2345"/>
             <w:shd w:val="clear" w:color="auto" w:fill="E8EEF5"/>
           </w:tcPr>
           <w:p>
@@ -15999,7 +15999,7 @@
         </w:tc>
         <w:tc>
           <w:tcPr>
-            <w:tcW w:type="dxa" w:w="2235"/>
+            <w:tcW w:type="dxa" w:w="2198"/>
             <w:shd w:val="clear" w:color="auto" w:fill="E8EEF5"/>
           </w:tcPr>
           <w:p>
@@ -16019,7 +16019,7 @@
         </w:tc>
         <w:tc>
           <w:tcPr>
-            <w:tcW w:type="dxa" w:w="547"/>
+            <w:tcW w:type="dxa" w:w="544"/>
             <w:shd w:val="clear" w:color="auto" w:fill="E8EEF5"/>
           </w:tcPr>
           <w:p>
@@ -16039,7 +16039,7 @@
         </w:tc>
         <w:tc>
           <w:tcPr>
-            <w:tcW w:type="dxa" w:w="598"/>
+            <w:tcW w:type="dxa" w:w="594"/>
             <w:shd w:val="clear" w:color="auto" w:fill="E8EEF5"/>
           </w:tcPr>
           <w:p>
@@ -16059,7 +16059,7 @@
         </w:tc>
         <w:tc>
           <w:tcPr>
-            <w:tcW w:type="dxa" w:w="777"/>
+            <w:tcW w:type="dxa" w:w="771"/>
             <w:shd w:val="clear" w:color="auto" w:fill="E8EEF5"/>
           </w:tcPr>
           <w:p>
@@ -16079,7 +16079,7 @@
         </w:tc>
         <w:tc>
           <w:tcPr>
-            <w:tcW w:type="dxa" w:w="2550"/>
+            <w:tcW w:type="dxa" w:w="2619"/>
             <w:shd w:val="clear" w:color="auto" w:fill="E8EEF5"/>
           </w:tcPr>
           <w:p>
@@ -16101,7 +16101,7 @@
       <w:tr>
         <w:tc>
           <w:tcPr>
-            <w:tcW w:type="dxa" w:w="2365"/>
+            <w:tcW w:type="dxa" w:w="2345"/>
           </w:tcPr>
           <w:p>
             <w:pPr>
@@ -16118,7 +16118,7 @@
         </w:tc>
         <w:tc>
           <w:tcPr>
-            <w:tcW w:type="dxa" w:w="2235"/>
+            <w:tcW w:type="dxa" w:w="2198"/>
           </w:tcPr>
           <w:p>
             <w:pPr>
@@ -16137,7 +16137,7 @@
         </w:tc>
         <w:tc>
           <w:tcPr>
-            <w:tcW w:type="dxa" w:w="547"/>
+            <w:tcW w:type="dxa" w:w="544"/>
           </w:tcPr>
           <w:p>
             <w:pPr>
@@ -16154,7 +16154,7 @@
         </w:tc>
         <w:tc>
           <w:tcPr>
-            <w:tcW w:type="dxa" w:w="598"/>
+            <w:tcW w:type="dxa" w:w="594"/>
           </w:tcPr>
           <w:p>
             <w:pPr>
@@ -16171,7 +16171,7 @@
         </w:tc>
         <w:tc>
           <w:tcPr>
-            <w:tcW w:type="dxa" w:w="777"/>
+            <w:tcW w:type="dxa" w:w="771"/>
           </w:tcPr>
           <w:p>
             <w:pPr>
@@ -16188,26 +16188,26 @@
         </w:tc>
         <w:tc>
           <w:tcPr>
-            <w:tcW w:type="dxa" w:w="2550"/>
-          </w:tcPr>
-          <w:p>
-            <w:pPr>
-              <w:pStyle w:val="Compact"/>
-              <w:spacing w:after="0" w:line="264" w:lineRule="auto"/>
-            </w:pPr>
-            <w:r>
-              <w:rPr>
-                <w:sz w:val="16"/>
-              </w:rPr>
-              <w:t xml:space="preserve">계층 계약 5번 · 망 접점 허용 2곳 (D-0134)</w:t>
-            </w:r>
-          </w:p>
-        </w:tc>
-      </w:tr>
-      <w:tr>
-        <w:tc>
-          <w:tcPr>
-            <w:tcW w:type="dxa" w:w="2365"/>
+            <w:tcW w:type="dxa" w:w="2619"/>
+          </w:tcPr>
+          <w:p>
+            <w:pPr>
+              <w:pStyle w:val="Compact"/>
+              <w:spacing w:after="0" w:line="264" w:lineRule="auto"/>
+            </w:pPr>
+            <w:r>
+              <w:rPr>
+                <w:sz w:val="16"/>
+              </w:rPr>
+              <w:t xml:space="preserve">계층 계약 5번 · 망 접점 허용 4곳 — 밖 2 · 로컬 2 (D-0134 · D-0224)</w:t>
+            </w:r>
+          </w:p>
+        </w:tc>
+      </w:tr>
+      <w:tr>
+        <w:tc>
+          <w:tcPr>
+            <w:tcW w:type="dxa" w:w="2345"/>
           </w:tcPr>
           <w:p>
             <w:pPr>
@@ -16224,7 +16224,7 @@
         </w:tc>
         <w:tc>
           <w:tcPr>
-            <w:tcW w:type="dxa" w:w="2235"/>
+            <w:tcW w:type="dxa" w:w="2198"/>
           </w:tcPr>
           <w:p>
             <w:pPr>
@@ -16241,7 +16241,7 @@
         </w:tc>
         <w:tc>
           <w:tcPr>
-            <w:tcW w:type="dxa" w:w="547"/>
+            <w:tcW w:type="dxa" w:w="544"/>
           </w:tcPr>
           <w:p>
             <w:pPr>
@@ -16258,7 +16258,7 @@
         </w:tc>
         <w:tc>
           <w:tcPr>
-            <w:tcW w:type="dxa" w:w="598"/>
+            <w:tcW w:type="dxa" w:w="594"/>
           </w:tcPr>
           <w:p>
             <w:pPr>
@@ -16275,7 +16275,7 @@
         </w:tc>
         <w:tc>
           <w:tcPr>
-            <w:tcW w:type="dxa" w:w="777"/>
+            <w:tcW w:type="dxa" w:w="771"/>
           </w:tcPr>
           <w:p>
             <w:pPr>
@@ -16292,7 +16292,7 @@
         </w:tc>
         <w:tc>
           <w:tcPr>
-            <w:tcW w:type="dxa" w:w="2550"/>
+            <w:tcW w:type="dxa" w:w="2619"/>
           </w:tcPr>
           <w:p>
             <w:pPr>
@@ -16311,7 +16311,7 @@
       <w:tr>
         <w:tc>
           <w:tcPr>
-            <w:tcW w:type="dxa" w:w="2365"/>
+            <w:tcW w:type="dxa" w:w="2345"/>
           </w:tcPr>
           <w:p>
             <w:pPr>
@@ -16328,7 +16328,7 @@
         </w:tc>
         <w:tc>
           <w:tcPr>
-            <w:tcW w:type="dxa" w:w="2235"/>
+            <w:tcW w:type="dxa" w:w="2198"/>
           </w:tcPr>
           <w:p>
             <w:pPr>
@@ -16345,7 +16345,7 @@
         </w:tc>
         <w:tc>
           <w:tcPr>
-            <w:tcW w:type="dxa" w:w="547"/>
+            <w:tcW w:type="dxa" w:w="544"/>
           </w:tcPr>
           <w:p>
             <w:pPr>
@@ -16362,7 +16362,7 @@
         </w:tc>
         <w:tc>
           <w:tcPr>
-            <w:tcW w:type="dxa" w:w="598"/>
+            <w:tcW w:type="dxa" w:w="594"/>
           </w:tcPr>
           <w:p>
             <w:pPr>
@@ -16379,7 +16379,7 @@
         </w:tc>
         <w:tc>
           <w:tcPr>
-            <w:tcW w:type="dxa" w:w="777"/>
+            <w:tcW w:type="dxa" w:w="771"/>
           </w:tcPr>
           <w:p>
             <w:pPr>
@@ -16396,7 +16396,7 @@
         </w:tc>
         <w:tc>
           <w:tcPr>
-            <w:tcW w:type="dxa" w:w="2550"/>
+            <w:tcW w:type="dxa" w:w="2619"/>
           </w:tcPr>
           <w:p>
             <w:pPr>
@@ -16415,7 +16415,7 @@
       <w:tr>
         <w:tc>
           <w:tcPr>
-            <w:tcW w:type="dxa" w:w="2365"/>
+            <w:tcW w:type="dxa" w:w="2345"/>
           </w:tcPr>
           <w:p>
             <w:pPr>
@@ -16432,7 +16432,7 @@
         </w:tc>
         <w:tc>
           <w:tcPr>
-            <w:tcW w:type="dxa" w:w="2235"/>
+            <w:tcW w:type="dxa" w:w="2198"/>
           </w:tcPr>
           <w:p>
             <w:pPr>
@@ -16449,7 +16449,7 @@
         </w:tc>
         <w:tc>
           <w:tcPr>
-            <w:tcW w:type="dxa" w:w="547"/>
+            <w:tcW w:type="dxa" w:w="544"/>
           </w:tcPr>
           <w:p>
             <w:pPr>
@@ -16466,7 +16466,7 @@
         </w:tc>
         <w:tc>
           <w:tcPr>
-            <w:tcW w:type="dxa" w:w="598"/>
+            <w:tcW w:type="dxa" w:w="594"/>
           </w:tcPr>
           <w:p>
             <w:pPr>
@@ -16483,7 +16483,7 @@
         </w:tc>
         <w:tc>
           <w:tcPr>
-            <w:tcW w:type="dxa" w:w="777"/>
+            <w:tcW w:type="dxa" w:w="771"/>
           </w:tcPr>
           <w:p>
             <w:pPr>
@@ -16500,7 +16500,7 @@
         </w:tc>
         <w:tc>
           <w:tcPr>
-            <w:tcW w:type="dxa" w:w="2550"/>
+            <w:tcW w:type="dxa" w:w="2619"/>
           </w:tcPr>
           <w:p>
             <w:pPr>
@@ -16519,7 +16519,7 @@
       <w:tr>
         <w:tc>
           <w:tcPr>
-            <w:tcW w:type="dxa" w:w="2365"/>
+            <w:tcW w:type="dxa" w:w="2345"/>
           </w:tcPr>
           <w:p>
             <w:pPr>
@@ -16536,7 +16536,7 @@
         </w:tc>
         <w:tc>
           <w:tcPr>
-            <w:tcW w:type="dxa" w:w="2235"/>
+            <w:tcW w:type="dxa" w:w="2198"/>
           </w:tcPr>
           <w:p>
             <w:pPr>
@@ -16553,7 +16553,7 @@
         </w:tc>
         <w:tc>
           <w:tcPr>
-            <w:tcW w:type="dxa" w:w="547"/>
+            <w:tcW w:type="dxa" w:w="544"/>
           </w:tcPr>
           <w:p>
             <w:pPr>
@@ -16570,7 +16570,7 @@
         </w:tc>
         <w:tc>
           <w:tcPr>
-            <w:tcW w:type="dxa" w:w="598"/>
+            <w:tcW w:type="dxa" w:w="594"/>
           </w:tcPr>
           <w:p>
             <w:pPr>
@@ -16587,7 +16587,7 @@
         </w:tc>
         <w:tc>
           <w:tcPr>
-            <w:tcW w:type="dxa" w:w="777"/>
+            <w:tcW w:type="dxa" w:w="771"/>
           </w:tcPr>
           <w:p>
             <w:pPr>
@@ -16604,20 +16604,20 @@
         </w:tc>
         <w:tc>
           <w:tcPr>
-            <w:tcW w:type="dxa" w:w="2550"/>
-          </w:tcPr>
-          <w:p>
-            <w:pPr>
-              <w:pStyle w:val="Compact"/>
-              <w:spacing w:after="0" w:line="264" w:lineRule="auto"/>
-            </w:pPr>
-          </w:p>
-        </w:tc>
-      </w:tr>
-      <w:tr>
-        <w:tc>
-          <w:tcPr>
-            <w:tcW w:type="dxa" w:w="2365"/>
+            <w:tcW w:type="dxa" w:w="2619"/>
+          </w:tcPr>
+          <w:p>
+            <w:pPr>
+              <w:pStyle w:val="Compact"/>
+              <w:spacing w:after="0" w:line="264" w:lineRule="auto"/>
+            </w:pPr>
+          </w:p>
+        </w:tc>
+      </w:tr>
+      <w:tr>
+        <w:tc>
+          <w:tcPr>
+            <w:tcW w:type="dxa" w:w="2345"/>
           </w:tcPr>
           <w:p>
             <w:pPr>
@@ -16634,7 +16634,7 @@
         </w:tc>
         <w:tc>
           <w:tcPr>
-            <w:tcW w:type="dxa" w:w="2235"/>
+            <w:tcW w:type="dxa" w:w="2198"/>
           </w:tcPr>
           <w:p>
             <w:pPr>
@@ -16651,7 +16651,7 @@
         </w:tc>
         <w:tc>
           <w:tcPr>
-            <w:tcW w:type="dxa" w:w="547"/>
+            <w:tcW w:type="dxa" w:w="544"/>
           </w:tcPr>
           <w:p>
             <w:pPr>
@@ -16668,7 +16668,7 @@
         </w:tc>
         <w:tc>
           <w:tcPr>
-            <w:tcW w:type="dxa" w:w="598"/>
+            <w:tcW w:type="dxa" w:w="594"/>
           </w:tcPr>
           <w:p>
             <w:pPr>
@@ -16685,7 +16685,7 @@
         </w:tc>
         <w:tc>
           <w:tcPr>
-            <w:tcW w:type="dxa" w:w="777"/>
+            <w:tcW w:type="dxa" w:w="771"/>
           </w:tcPr>
           <w:p>
             <w:pPr>
@@ -16702,7 +16702,7 @@
         </w:tc>
         <w:tc>
           <w:tcPr>
-            <w:tcW w:type="dxa" w:w="2550"/>
+            <w:tcW w:type="dxa" w:w="2619"/>
           </w:tcPr>
           <w:p>
             <w:pPr>
@@ -16721,7 +16721,7 @@
       <w:tr>
         <w:tc>
           <w:tcPr>
-            <w:tcW w:type="dxa" w:w="2365"/>
+            <w:tcW w:type="dxa" w:w="2345"/>
           </w:tcPr>
           <w:p>
             <w:pPr>
@@ -16738,7 +16738,7 @@
         </w:tc>
         <w:tc>
           <w:tcPr>
-            <w:tcW w:type="dxa" w:w="2235"/>
+            <w:tcW w:type="dxa" w:w="2198"/>
           </w:tcPr>
           <w:p>
             <w:pPr>
@@ -16755,7 +16755,7 @@
         </w:tc>
         <w:tc>
           <w:tcPr>
-            <w:tcW w:type="dxa" w:w="547"/>
+            <w:tcW w:type="dxa" w:w="544"/>
           </w:tcPr>
           <w:p>
             <w:pPr>
@@ -16772,7 +16772,7 @@
         </w:tc>
         <w:tc>
           <w:tcPr>
-            <w:tcW w:type="dxa" w:w="598"/>
+            <w:tcW w:type="dxa" w:w="594"/>
           </w:tcPr>
           <w:p>
             <w:pPr>
@@ -16789,7 +16789,7 @@
         </w:tc>
         <w:tc>
           <w:tcPr>
-            <w:tcW w:type="dxa" w:w="777"/>
+            <w:tcW w:type="dxa" w:w="771"/>
           </w:tcPr>
           <w:p>
             <w:pPr>
@@ -16806,7 +16806,7 @@
         </w:tc>
         <w:tc>
           <w:tcPr>
-            <w:tcW w:type="dxa" w:w="2550"/>
+            <w:tcW w:type="dxa" w:w="2619"/>
           </w:tcPr>
           <w:p>
             <w:pPr>
@@ -16825,7 +16825,7 @@
       <w:tr>
         <w:tc>
           <w:tcPr>
-            <w:tcW w:type="dxa" w:w="2365"/>
+            <w:tcW w:type="dxa" w:w="2345"/>
           </w:tcPr>
           <w:p>
             <w:pPr>
@@ -16842,7 +16842,7 @@
         </w:tc>
         <w:tc>
           <w:tcPr>
-            <w:tcW w:type="dxa" w:w="2235"/>
+            <w:tcW w:type="dxa" w:w="2198"/>
           </w:tcPr>
           <w:p>
             <w:pPr>
@@ -16859,7 +16859,7 @@
         </w:tc>
         <w:tc>
           <w:tcPr>
-            <w:tcW w:type="dxa" w:w="547"/>
+            <w:tcW w:type="dxa" w:w="544"/>
           </w:tcPr>
           <w:p>
             <w:pPr>
@@ -16876,7 +16876,7 @@
         </w:tc>
         <w:tc>
           <w:tcPr>
-            <w:tcW w:type="dxa" w:w="598"/>
+            <w:tcW w:type="dxa" w:w="594"/>
           </w:tcPr>
           <w:p>
             <w:pPr>
@@ -16893,7 +16893,7 @@
         </w:tc>
         <w:tc>
           <w:tcPr>
-            <w:tcW w:type="dxa" w:w="777"/>
+            <w:tcW w:type="dxa" w:w="771"/>
           </w:tcPr>
           <w:p>
             <w:pPr>
@@ -16910,20 +16910,20 @@
         </w:tc>
         <w:tc>
           <w:tcPr>
-            <w:tcW w:type="dxa" w:w="2550"/>
-          </w:tcPr>
-          <w:p>
-            <w:pPr>
-              <w:pStyle w:val="Compact"/>
-              <w:spacing w:after="0" w:line="264" w:lineRule="auto"/>
-            </w:pPr>
-          </w:p>
-        </w:tc>
-      </w:tr>
-      <w:tr>
-        <w:tc>
-          <w:tcPr>
-            <w:tcW w:type="dxa" w:w="2365"/>
+            <w:tcW w:type="dxa" w:w="2619"/>
+          </w:tcPr>
+          <w:p>
+            <w:pPr>
+              <w:pStyle w:val="Compact"/>
+              <w:spacing w:after="0" w:line="264" w:lineRule="auto"/>
+            </w:pPr>
+          </w:p>
+        </w:tc>
+      </w:tr>
+      <w:tr>
+        <w:tc>
+          <w:tcPr>
+            <w:tcW w:type="dxa" w:w="2345"/>
           </w:tcPr>
           <w:p>
             <w:pPr>
@@ -16940,7 +16940,7 @@
         </w:tc>
         <w:tc>
           <w:tcPr>
-            <w:tcW w:type="dxa" w:w="2235"/>
+            <w:tcW w:type="dxa" w:w="2198"/>
           </w:tcPr>
           <w:p>
             <w:pPr>
@@ -16957,7 +16957,7 @@
         </w:tc>
         <w:tc>
           <w:tcPr>
-            <w:tcW w:type="dxa" w:w="547"/>
+            <w:tcW w:type="dxa" w:w="544"/>
           </w:tcPr>
           <w:p>
             <w:pPr>
@@ -16974,7 +16974,7 @@
         </w:tc>
         <w:tc>
           <w:tcPr>
-            <w:tcW w:type="dxa" w:w="598"/>
+            <w:tcW w:type="dxa" w:w="594"/>
           </w:tcPr>
           <w:p>
             <w:pPr>
@@ -16991,7 +16991,7 @@
         </w:tc>
         <w:tc>
           <w:tcPr>
-            <w:tcW w:type="dxa" w:w="777"/>
+            <w:tcW w:type="dxa" w:w="771"/>
           </w:tcPr>
           <w:p>
             <w:pPr>
@@ -17008,7 +17008,7 @@
         </w:tc>
         <w:tc>
           <w:tcPr>
-            <w:tcW w:type="dxa" w:w="2550"/>
+            <w:tcW w:type="dxa" w:w="2619"/>
           </w:tcPr>
           <w:p>
             <w:pPr>
@@ -21425,12 +21425,12 @@
         <w:tblLook w:firstRow="1" w:lastRow="0" w:firstColumn="0" w:lastColumn="0" w:noHBand="0" w:noVBand="0" w:val="0020"/>
       </w:tblPr>
       <w:tblGrid>
-        <w:gridCol w:w="2252"/>
-        <w:gridCol w:w="2648"/>
-        <w:gridCol w:w="529"/>
-        <w:gridCol w:w="570"/>
-        <w:gridCol w:w="570"/>
-        <w:gridCol w:w="2500"/>
+        <w:gridCol w:w="2231"/>
+        <w:gridCol w:w="2634"/>
+        <w:gridCol w:w="525"/>
+        <w:gridCol w:w="564"/>
+        <w:gridCol w:w="564"/>
+        <w:gridCol w:w="2551"/>
       </w:tblGrid>
       <w:tr>
         <w:trPr>
@@ -21438,7 +21438,7 @@
         </w:trPr>
         <w:tc>
           <w:tcPr>
-            <w:tcW w:type="dxa" w:w="2252"/>
+            <w:tcW w:type="dxa" w:w="2231"/>
             <w:shd w:val="clear" w:color="auto" w:fill="E8EEF5"/>
           </w:tcPr>
           <w:p>
@@ -21458,7 +21458,7 @@
         </w:tc>
         <w:tc>
           <w:tcPr>
-            <w:tcW w:type="dxa" w:w="2649"/>
+            <w:tcW w:type="dxa" w:w="2635"/>
             <w:shd w:val="clear" w:color="auto" w:fill="E8EEF5"/>
           </w:tcPr>
           <w:p>
@@ -21478,7 +21478,7 @@
         </w:tc>
         <w:tc>
           <w:tcPr>
-            <w:tcW w:type="dxa" w:w="530"/>
+            <w:tcW w:type="dxa" w:w="526"/>
             <w:shd w:val="clear" w:color="auto" w:fill="E8EEF5"/>
           </w:tcPr>
           <w:p>
@@ -21498,7 +21498,7 @@
         </w:tc>
         <w:tc>
           <w:tcPr>
-            <w:tcW w:type="dxa" w:w="570"/>
+            <w:tcW w:type="dxa" w:w="564"/>
             <w:shd w:val="clear" w:color="auto" w:fill="E8EEF5"/>
           </w:tcPr>
           <w:p>
@@ -21518,7 +21518,7 @@
         </w:tc>
         <w:tc>
           <w:tcPr>
-            <w:tcW w:type="dxa" w:w="570"/>
+            <w:tcW w:type="dxa" w:w="564"/>
             <w:shd w:val="clear" w:color="auto" w:fill="E8EEF5"/>
           </w:tcPr>
           <w:p>
@@ -21538,7 +21538,7 @@
         </w:tc>
         <w:tc>
           <w:tcPr>
-            <w:tcW w:type="dxa" w:w="2501"/>
+            <w:tcW w:type="dxa" w:w="2551"/>
             <w:shd w:val="clear" w:color="auto" w:fill="E8EEF5"/>
           </w:tcPr>
           <w:p>
@@ -21560,7 +21560,7 @@
       <w:tr>
         <w:tc>
           <w:tcPr>
-            <w:tcW w:type="dxa" w:w="2252"/>
+            <w:tcW w:type="dxa" w:w="2231"/>
           </w:tcPr>
           <w:p>
             <w:pPr>
@@ -21577,7 +21577,7 @@
         </w:tc>
         <w:tc>
           <w:tcPr>
-            <w:tcW w:type="dxa" w:w="2649"/>
+            <w:tcW w:type="dxa" w:w="2635"/>
           </w:tcPr>
           <w:p>
             <w:pPr>
@@ -21594,7 +21594,7 @@
         </w:tc>
         <w:tc>
           <w:tcPr>
-            <w:tcW w:type="dxa" w:w="530"/>
+            <w:tcW w:type="dxa" w:w="526"/>
           </w:tcPr>
           <w:p>
             <w:pPr>
@@ -21611,7 +21611,7 @@
         </w:tc>
         <w:tc>
           <w:tcPr>
-            <w:tcW w:type="dxa" w:w="570"/>
+            <w:tcW w:type="dxa" w:w="564"/>
           </w:tcPr>
           <w:p>
             <w:pPr>
@@ -21628,7 +21628,7 @@
         </w:tc>
         <w:tc>
           <w:tcPr>
-            <w:tcW w:type="dxa" w:w="570"/>
+            <w:tcW w:type="dxa" w:w="564"/>
           </w:tcPr>
           <w:p>
             <w:pPr>
@@ -21645,7 +21645,7 @@
         </w:tc>
         <w:tc>
           <w:tcPr>
-            <w:tcW w:type="dxa" w:w="2501"/>
+            <w:tcW w:type="dxa" w:w="2551"/>
           </w:tcPr>
           <w:p>
             <w:pPr>
@@ -21664,7 +21664,7 @@
       <w:tr>
         <w:tc>
           <w:tcPr>
-            <w:tcW w:type="dxa" w:w="2252"/>
+            <w:tcW w:type="dxa" w:w="2231"/>
           </w:tcPr>
           <w:p>
             <w:pPr>
@@ -21681,7 +21681,7 @@
         </w:tc>
         <w:tc>
           <w:tcPr>
-            <w:tcW w:type="dxa" w:w="2649"/>
+            <w:tcW w:type="dxa" w:w="2635"/>
           </w:tcPr>
           <w:p>
             <w:pPr>
@@ -21698,7 +21698,7 @@
         </w:tc>
         <w:tc>
           <w:tcPr>
-            <w:tcW w:type="dxa" w:w="530"/>
+            <w:tcW w:type="dxa" w:w="526"/>
           </w:tcPr>
           <w:p>
             <w:pPr>
@@ -21715,7 +21715,7 @@
         </w:tc>
         <w:tc>
           <w:tcPr>
-            <w:tcW w:type="dxa" w:w="570"/>
+            <w:tcW w:type="dxa" w:w="564"/>
           </w:tcPr>
           <w:p>
             <w:pPr>
@@ -21732,7 +21732,7 @@
         </w:tc>
         <w:tc>
           <w:tcPr>
-            <w:tcW w:type="dxa" w:w="570"/>
+            <w:tcW w:type="dxa" w:w="564"/>
           </w:tcPr>
           <w:p>
             <w:pPr>
@@ -21749,20 +21749,20 @@
         </w:tc>
         <w:tc>
           <w:tcPr>
-            <w:tcW w:type="dxa" w:w="2501"/>
-          </w:tcPr>
-          <w:p>
-            <w:pPr>
-              <w:pStyle w:val="Compact"/>
-              <w:spacing w:after="0" w:line="264" w:lineRule="auto"/>
-            </w:pPr>
-          </w:p>
-        </w:tc>
-      </w:tr>
-      <w:tr>
-        <w:tc>
-          <w:tcPr>
-            <w:tcW w:type="dxa" w:w="2252"/>
+            <w:tcW w:type="dxa" w:w="2551"/>
+          </w:tcPr>
+          <w:p>
+            <w:pPr>
+              <w:pStyle w:val="Compact"/>
+              <w:spacing w:after="0" w:line="264" w:lineRule="auto"/>
+            </w:pPr>
+          </w:p>
+        </w:tc>
+      </w:tr>
+      <w:tr>
+        <w:tc>
+          <w:tcPr>
+            <w:tcW w:type="dxa" w:w="2231"/>
           </w:tcPr>
           <w:p>
             <w:pPr>
@@ -21779,7 +21779,7 @@
         </w:tc>
         <w:tc>
           <w:tcPr>
-            <w:tcW w:type="dxa" w:w="2649"/>
+            <w:tcW w:type="dxa" w:w="2635"/>
           </w:tcPr>
           <w:p>
             <w:pPr>
@@ -21796,7 +21796,7 @@
         </w:tc>
         <w:tc>
           <w:tcPr>
-            <w:tcW w:type="dxa" w:w="530"/>
+            <w:tcW w:type="dxa" w:w="526"/>
           </w:tcPr>
           <w:p>
             <w:pPr>
@@ -21813,7 +21813,7 @@
         </w:tc>
         <w:tc>
           <w:tcPr>
-            <w:tcW w:type="dxa" w:w="570"/>
+            <w:tcW w:type="dxa" w:w="564"/>
           </w:tcPr>
           <w:p>
             <w:pPr>
@@ -21830,7 +21830,7 @@
         </w:tc>
         <w:tc>
           <w:tcPr>
-            <w:tcW w:type="dxa" w:w="570"/>
+            <w:tcW w:type="dxa" w:w="564"/>
           </w:tcPr>
           <w:p>
             <w:pPr>
@@ -21847,7 +21847,7 @@
         </w:tc>
         <w:tc>
           <w:tcPr>
-            <w:tcW w:type="dxa" w:w="2501"/>
+            <w:tcW w:type="dxa" w:w="2551"/>
           </w:tcPr>
           <w:p>
             <w:pPr>
@@ -21866,7 +21866,7 @@
       <w:tr>
         <w:tc>
           <w:tcPr>
-            <w:tcW w:type="dxa" w:w="2252"/>
+            <w:tcW w:type="dxa" w:w="2231"/>
           </w:tcPr>
           <w:p>
             <w:pPr>
@@ -21883,7 +21883,7 @@
         </w:tc>
         <w:tc>
           <w:tcPr>
-            <w:tcW w:type="dxa" w:w="2649"/>
+            <w:tcW w:type="dxa" w:w="2635"/>
           </w:tcPr>
           <w:p>
             <w:pPr>
@@ -21900,7 +21900,7 @@
         </w:tc>
         <w:tc>
           <w:tcPr>
-            <w:tcW w:type="dxa" w:w="530"/>
+            <w:tcW w:type="dxa" w:w="526"/>
           </w:tcPr>
           <w:p>
             <w:pPr>
@@ -21917,7 +21917,7 @@
         </w:tc>
         <w:tc>
           <w:tcPr>
-            <w:tcW w:type="dxa" w:w="570"/>
+            <w:tcW w:type="dxa" w:w="564"/>
           </w:tcPr>
           <w:p>
             <w:pPr>
@@ -21934,7 +21934,7 @@
         </w:tc>
         <w:tc>
           <w:tcPr>
-            <w:tcW w:type="dxa" w:w="570"/>
+            <w:tcW w:type="dxa" w:w="564"/>
           </w:tcPr>
           <w:p>
             <w:pPr>
@@ -21951,20 +21951,20 @@
         </w:tc>
         <w:tc>
           <w:tcPr>
-            <w:tcW w:type="dxa" w:w="2501"/>
-          </w:tcPr>
-          <w:p>
-            <w:pPr>
-              <w:pStyle w:val="Compact"/>
-              <w:spacing w:after="0" w:line="264" w:lineRule="auto"/>
-            </w:pPr>
-          </w:p>
-        </w:tc>
-      </w:tr>
-      <w:tr>
-        <w:tc>
-          <w:tcPr>
-            <w:tcW w:type="dxa" w:w="2252"/>
+            <w:tcW w:type="dxa" w:w="2551"/>
+          </w:tcPr>
+          <w:p>
+            <w:pPr>
+              <w:pStyle w:val="Compact"/>
+              <w:spacing w:after="0" w:line="264" w:lineRule="auto"/>
+            </w:pPr>
+          </w:p>
+        </w:tc>
+      </w:tr>
+      <w:tr>
+        <w:tc>
+          <w:tcPr>
+            <w:tcW w:type="dxa" w:w="2231"/>
           </w:tcPr>
           <w:p>
             <w:pPr>
@@ -21981,7 +21981,7 @@
         </w:tc>
         <w:tc>
           <w:tcPr>
-            <w:tcW w:type="dxa" w:w="2649"/>
+            <w:tcW w:type="dxa" w:w="2635"/>
           </w:tcPr>
           <w:p>
             <w:pPr>
@@ -21998,7 +21998,7 @@
         </w:tc>
         <w:tc>
           <w:tcPr>
-            <w:tcW w:type="dxa" w:w="530"/>
+            <w:tcW w:type="dxa" w:w="526"/>
           </w:tcPr>
           <w:p>
             <w:pPr>
@@ -22015,7 +22015,7 @@
         </w:tc>
         <w:tc>
           <w:tcPr>
-            <w:tcW w:type="dxa" w:w="570"/>
+            <w:tcW w:type="dxa" w:w="564"/>
           </w:tcPr>
           <w:p>
             <w:pPr>
@@ -22032,7 +22032,7 @@
         </w:tc>
         <w:tc>
           <w:tcPr>
-            <w:tcW w:type="dxa" w:w="570"/>
+            <w:tcW w:type="dxa" w:w="564"/>
           </w:tcPr>
           <w:p>
             <w:pPr>
@@ -22049,7 +22049,7 @@
         </w:tc>
         <w:tc>
           <w:tcPr>
-            <w:tcW w:type="dxa" w:w="2501"/>
+            <w:tcW w:type="dxa" w:w="2551"/>
           </w:tcPr>
           <w:p>
             <w:pPr>
@@ -22068,7 +22068,7 @@
       <w:tr>
         <w:tc>
           <w:tcPr>
-            <w:tcW w:type="dxa" w:w="2252"/>
+            <w:tcW w:type="dxa" w:w="2231"/>
           </w:tcPr>
           <w:p>
             <w:pPr>
@@ -22085,7 +22085,7 @@
         </w:tc>
         <w:tc>
           <w:tcPr>
-            <w:tcW w:type="dxa" w:w="2649"/>
+            <w:tcW w:type="dxa" w:w="2635"/>
           </w:tcPr>
           <w:p>
             <w:pPr>
@@ -22102,7 +22102,7 @@
         </w:tc>
         <w:tc>
           <w:tcPr>
-            <w:tcW w:type="dxa" w:w="530"/>
+            <w:tcW w:type="dxa" w:w="526"/>
           </w:tcPr>
           <w:p>
             <w:pPr>
@@ -22119,7 +22119,7 @@
         </w:tc>
         <w:tc>
           <w:tcPr>
-            <w:tcW w:type="dxa" w:w="570"/>
+            <w:tcW w:type="dxa" w:w="564"/>
           </w:tcPr>
           <w:p>
             <w:pPr>
@@ -22136,7 +22136,7 @@
         </w:tc>
         <w:tc>
           <w:tcPr>
-            <w:tcW w:type="dxa" w:w="570"/>
+            <w:tcW w:type="dxa" w:w="564"/>
           </w:tcPr>
           <w:p>
             <w:pPr>
@@ -22153,7 +22153,7 @@
         </w:tc>
         <w:tc>
           <w:tcPr>
-            <w:tcW w:type="dxa" w:w="2501"/>
+            <w:tcW w:type="dxa" w:w="2551"/>
           </w:tcPr>
           <w:p>
             <w:pPr>
@@ -22172,7 +22172,7 @@
       <w:tr>
         <w:tc>
           <w:tcPr>
-            <w:tcW w:type="dxa" w:w="2252"/>
+            <w:tcW w:type="dxa" w:w="2231"/>
           </w:tcPr>
           <w:p>
             <w:pPr>
@@ -22189,7 +22189,7 @@
         </w:tc>
         <w:tc>
           <w:tcPr>
-            <w:tcW w:type="dxa" w:w="2649"/>
+            <w:tcW w:type="dxa" w:w="2635"/>
           </w:tcPr>
           <w:p>
             <w:pPr>
@@ -22206,7 +22206,7 @@
         </w:tc>
         <w:tc>
           <w:tcPr>
-            <w:tcW w:type="dxa" w:w="530"/>
+            <w:tcW w:type="dxa" w:w="526"/>
           </w:tcPr>
           <w:p>
             <w:pPr>
@@ -22223,7 +22223,7 @@
         </w:tc>
         <w:tc>
           <w:tcPr>
-            <w:tcW w:type="dxa" w:w="570"/>
+            <w:tcW w:type="dxa" w:w="564"/>
           </w:tcPr>
           <w:p>
             <w:pPr>
@@ -22240,7 +22240,7 @@
         </w:tc>
         <w:tc>
           <w:tcPr>
-            <w:tcW w:type="dxa" w:w="570"/>
+            <w:tcW w:type="dxa" w:w="564"/>
           </w:tcPr>
           <w:p>
             <w:pPr>
@@ -22257,7 +22257,7 @@
         </w:tc>
         <w:tc>
           <w:tcPr>
-            <w:tcW w:type="dxa" w:w="2501"/>
+            <w:tcW w:type="dxa" w:w="2551"/>
           </w:tcPr>
           <w:p>
             <w:pPr>
@@ -22276,7 +22276,7 @@
       <w:tr>
         <w:tc>
           <w:tcPr>
-            <w:tcW w:type="dxa" w:w="2252"/>
+            <w:tcW w:type="dxa" w:w="2231"/>
           </w:tcPr>
           <w:p>
             <w:pPr>
@@ -22293,7 +22293,7 @@
         </w:tc>
         <w:tc>
           <w:tcPr>
-            <w:tcW w:type="dxa" w:w="2649"/>
+            <w:tcW w:type="dxa" w:w="2635"/>
           </w:tcPr>
           <w:p>
             <w:pPr>
@@ -22310,7 +22310,7 @@
         </w:tc>
         <w:tc>
           <w:tcPr>
-            <w:tcW w:type="dxa" w:w="530"/>
+            <w:tcW w:type="dxa" w:w="526"/>
           </w:tcPr>
           <w:p>
             <w:pPr>
@@ -22327,7 +22327,7 @@
         </w:tc>
         <w:tc>
           <w:tcPr>
-            <w:tcW w:type="dxa" w:w="570"/>
+            <w:tcW w:type="dxa" w:w="564"/>
           </w:tcPr>
           <w:p>
             <w:pPr>
@@ -22344,7 +22344,7 @@
         </w:tc>
         <w:tc>
           <w:tcPr>
-            <w:tcW w:type="dxa" w:w="570"/>
+            <w:tcW w:type="dxa" w:w="564"/>
           </w:tcPr>
           <w:p>
             <w:pPr>
@@ -22361,7 +22361,7 @@
         </w:tc>
         <w:tc>
           <w:tcPr>
-            <w:tcW w:type="dxa" w:w="2501"/>
+            <w:tcW w:type="dxa" w:w="2551"/>
           </w:tcPr>
           <w:p>
             <w:pPr>
@@ -22380,7 +22380,7 @@
       <w:tr>
         <w:tc>
           <w:tcPr>
-            <w:tcW w:type="dxa" w:w="2252"/>
+            <w:tcW w:type="dxa" w:w="2231"/>
           </w:tcPr>
           <w:p>
             <w:pPr>
@@ -22397,7 +22397,7 @@
         </w:tc>
         <w:tc>
           <w:tcPr>
-            <w:tcW w:type="dxa" w:w="2649"/>
+            <w:tcW w:type="dxa" w:w="2635"/>
           </w:tcPr>
           <w:p>
             <w:pPr>
@@ -22414,7 +22414,7 @@
         </w:tc>
         <w:tc>
           <w:tcPr>
-            <w:tcW w:type="dxa" w:w="530"/>
+            <w:tcW w:type="dxa" w:w="526"/>
           </w:tcPr>
           <w:p>
             <w:pPr>
@@ -22431,7 +22431,7 @@
         </w:tc>
         <w:tc>
           <w:tcPr>
-            <w:tcW w:type="dxa" w:w="570"/>
+            <w:tcW w:type="dxa" w:w="564"/>
           </w:tcPr>
           <w:p>
             <w:pPr>
@@ -22448,7 +22448,7 @@
         </w:tc>
         <w:tc>
           <w:tcPr>
-            <w:tcW w:type="dxa" w:w="570"/>
+            <w:tcW w:type="dxa" w:w="564"/>
           </w:tcPr>
           <w:p>
             <w:pPr>
@@ -22465,7 +22465,7 @@
         </w:tc>
         <w:tc>
           <w:tcPr>
-            <w:tcW w:type="dxa" w:w="2501"/>
+            <w:tcW w:type="dxa" w:w="2551"/>
           </w:tcPr>
           <w:p>
             <w:pPr>
@@ -22484,7 +22484,7 @@
       <w:tr>
         <w:tc>
           <w:tcPr>
-            <w:tcW w:type="dxa" w:w="2252"/>
+            <w:tcW w:type="dxa" w:w="2231"/>
           </w:tcPr>
           <w:p>
             <w:pPr>
@@ -22501,7 +22501,7 @@
         </w:tc>
         <w:tc>
           <w:tcPr>
-            <w:tcW w:type="dxa" w:w="2649"/>
+            <w:tcW w:type="dxa" w:w="2635"/>
           </w:tcPr>
           <w:p>
             <w:pPr>
@@ -22531,7 +22531,7 @@
         </w:tc>
         <w:tc>
           <w:tcPr>
-            <w:tcW w:type="dxa" w:w="530"/>
+            <w:tcW w:type="dxa" w:w="526"/>
           </w:tcPr>
           <w:p>
             <w:pPr>
@@ -22548,7 +22548,7 @@
         </w:tc>
         <w:tc>
           <w:tcPr>
-            <w:tcW w:type="dxa" w:w="570"/>
+            <w:tcW w:type="dxa" w:w="564"/>
           </w:tcPr>
           <w:p>
             <w:pPr>
@@ -22565,7 +22565,7 @@
         </w:tc>
         <w:tc>
           <w:tcPr>
-            <w:tcW w:type="dxa" w:w="570"/>
+            <w:tcW w:type="dxa" w:w="564"/>
           </w:tcPr>
           <w:p>
             <w:pPr>
@@ -22582,7 +22582,7 @@
         </w:tc>
         <w:tc>
           <w:tcPr>
-            <w:tcW w:type="dxa" w:w="2501"/>
+            <w:tcW w:type="dxa" w:w="2551"/>
           </w:tcPr>
           <w:p>
             <w:pPr>
@@ -22601,7 +22601,7 @@
       <w:tr>
         <w:tc>
           <w:tcPr>
-            <w:tcW w:type="dxa" w:w="2252"/>
+            <w:tcW w:type="dxa" w:w="2231"/>
           </w:tcPr>
           <w:p>
             <w:pPr>
@@ -22618,7 +22618,7 @@
         </w:tc>
         <w:tc>
           <w:tcPr>
-            <w:tcW w:type="dxa" w:w="2649"/>
+            <w:tcW w:type="dxa" w:w="2635"/>
           </w:tcPr>
           <w:p>
             <w:pPr>
@@ -22635,7 +22635,7 @@
         </w:tc>
         <w:tc>
           <w:tcPr>
-            <w:tcW w:type="dxa" w:w="530"/>
+            <w:tcW w:type="dxa" w:w="526"/>
           </w:tcPr>
           <w:p>
             <w:pPr>
@@ -22652,7 +22652,7 @@
         </w:tc>
         <w:tc>
           <w:tcPr>
-            <w:tcW w:type="dxa" w:w="570"/>
+            <w:tcW w:type="dxa" w:w="564"/>
           </w:tcPr>
           <w:p>
             <w:pPr>
@@ -22669,7 +22669,7 @@
         </w:tc>
         <w:tc>
           <w:tcPr>
-            <w:tcW w:type="dxa" w:w="570"/>
+            <w:tcW w:type="dxa" w:w="564"/>
           </w:tcPr>
           <w:p>
             <w:pPr>
@@ -22686,7 +22686,7 @@
         </w:tc>
         <w:tc>
           <w:tcPr>
-            <w:tcW w:type="dxa" w:w="2501"/>
+            <w:tcW w:type="dxa" w:w="2551"/>
           </w:tcPr>
           <w:p>
             <w:pPr>
@@ -22705,7 +22705,7 @@
       <w:tr>
         <w:tc>
           <w:tcPr>
-            <w:tcW w:type="dxa" w:w="2252"/>
+            <w:tcW w:type="dxa" w:w="2231"/>
           </w:tcPr>
           <w:p>
             <w:pPr>
@@ -22722,7 +22722,7 @@
         </w:tc>
         <w:tc>
           <w:tcPr>
-            <w:tcW w:type="dxa" w:w="2649"/>
+            <w:tcW w:type="dxa" w:w="2635"/>
           </w:tcPr>
           <w:p>
             <w:pPr>
@@ -22739,7 +22739,7 @@
         </w:tc>
         <w:tc>
           <w:tcPr>
-            <w:tcW w:type="dxa" w:w="530"/>
+            <w:tcW w:type="dxa" w:w="526"/>
           </w:tcPr>
           <w:p>
             <w:pPr>
@@ -22756,7 +22756,7 @@
         </w:tc>
         <w:tc>
           <w:tcPr>
-            <w:tcW w:type="dxa" w:w="570"/>
+            <w:tcW w:type="dxa" w:w="564"/>
           </w:tcPr>
           <w:p>
             <w:pPr>
@@ -22773,7 +22773,7 @@
         </w:tc>
         <w:tc>
           <w:tcPr>
-            <w:tcW w:type="dxa" w:w="570"/>
+            <w:tcW w:type="dxa" w:w="564"/>
           </w:tcPr>
           <w:p>
             <w:pPr>
@@ -22790,7 +22790,7 @@
         </w:tc>
         <w:tc>
           <w:tcPr>
-            <w:tcW w:type="dxa" w:w="2501"/>
+            <w:tcW w:type="dxa" w:w="2551"/>
           </w:tcPr>
           <w:p>
             <w:pPr>
@@ -22802,6 +22802,318 @@
                 <w:sz w:val="16"/>
               </w:rPr>
               <w:t xml:space="preserve">D-0220 · D-0221</w:t>
+            </w:r>
+          </w:p>
+        </w:tc>
+      </w:tr>
+      <w:tr>
+        <w:tc>
+          <w:tcPr>
+            <w:tcW w:type="dxa" w:w="2231"/>
+          </w:tcPr>
+          <w:p>
+            <w:pPr>
+              <w:pStyle w:val="Compact"/>
+              <w:spacing w:after="0" w:line="264" w:lineRule="auto"/>
+            </w:pPr>
+            <w:r>
+              <w:rPr>
+                <w:sz w:val="16"/>
+              </w:rPr>
+              <w:t xml:space="preserve">REQ-INF-013</w:t>
+            </w:r>
+          </w:p>
+        </w:tc>
+        <w:tc>
+          <w:tcPr>
+            <w:tcW w:type="dxa" w:w="2635"/>
+          </w:tcPr>
+          <w:p>
+            <w:pPr>
+              <w:pStyle w:val="Compact"/>
+              <w:spacing w:after="0" w:line="264" w:lineRule="auto"/>
+            </w:pPr>
+            <w:r>
+              <w:rPr>
+                <w:sz w:val="16"/>
+              </w:rPr>
+              <w:t xml:space="preserve">평가 실행을 실험 추적기로 모아 본다</w:t>
+            </w:r>
+          </w:p>
+        </w:tc>
+        <w:tc>
+          <w:tcPr>
+            <w:tcW w:type="dxa" w:w="526"/>
+          </w:tcPr>
+          <w:p>
+            <w:pPr>
+              <w:pStyle w:val="Compact"/>
+              <w:spacing w:after="0" w:line="264" w:lineRule="auto"/>
+            </w:pPr>
+            <w:r>
+              <w:rPr>
+                <w:sz w:val="16"/>
+              </w:rPr>
+              <w:t xml:space="preserve">S</w:t>
+            </w:r>
+          </w:p>
+        </w:tc>
+        <w:tc>
+          <w:tcPr>
+            <w:tcW w:type="dxa" w:w="564"/>
+          </w:tcPr>
+          <w:p>
+            <w:pPr>
+              <w:pStyle w:val="Compact"/>
+              <w:spacing w:after="0" w:line="264" w:lineRule="auto"/>
+            </w:pPr>
+            <w:r>
+              <w:rPr>
+                <w:sz w:val="16"/>
+              </w:rPr>
+              <w:t xml:space="preserve">P1</w:t>
+            </w:r>
+          </w:p>
+        </w:tc>
+        <w:tc>
+          <w:tcPr>
+            <w:tcW w:type="dxa" w:w="564"/>
+          </w:tcPr>
+          <w:p>
+            <w:pPr>
+              <w:pStyle w:val="Compact"/>
+              <w:spacing w:after="0" w:line="264" w:lineRule="auto"/>
+            </w:pPr>
+            <w:r>
+              <w:rPr>
+                <w:sz w:val="16"/>
+              </w:rPr>
+              <w:t xml:space="preserve">완료</w:t>
+            </w:r>
+          </w:p>
+        </w:tc>
+        <w:tc>
+          <w:tcPr>
+            <w:tcW w:type="dxa" w:w="2551"/>
+          </w:tcPr>
+          <w:p>
+            <w:pPr>
+              <w:pStyle w:val="Compact"/>
+              <w:spacing w:after="0" w:line="264" w:lineRule="auto"/>
+            </w:pPr>
+            <w:r>
+              <w:rPr>
+                <w:sz w:val="16"/>
+              </w:rPr>
+              <w:t xml:space="preserve">MLflow — 정본은 JSON, 추적기는 보는 창 (D-0224)</w:t>
+            </w:r>
+          </w:p>
+        </w:tc>
+      </w:tr>
+      <w:tr>
+        <w:tc>
+          <w:tcPr>
+            <w:tcW w:type="dxa" w:w="2231"/>
+          </w:tcPr>
+          <w:p>
+            <w:pPr>
+              <w:pStyle w:val="Compact"/>
+              <w:spacing w:after="0" w:line="264" w:lineRule="auto"/>
+            </w:pPr>
+            <w:r>
+              <w:rPr>
+                <w:sz w:val="16"/>
+              </w:rPr>
+              <w:t xml:space="preserve">REQ-INF-014</w:t>
+            </w:r>
+          </w:p>
+        </w:tc>
+        <w:tc>
+          <w:tcPr>
+            <w:tcW w:type="dxa" w:w="2635"/>
+          </w:tcPr>
+          <w:p>
+            <w:pPr>
+              <w:pStyle w:val="Compact"/>
+              <w:spacing w:after="0" w:line="264" w:lineRule="auto"/>
+            </w:pPr>
+            <w:r>
+              <w:rPr>
+                <w:sz w:val="16"/>
+              </w:rPr>
+              <w:t xml:space="preserve">인제스트 → 평가를 단계 상태가 남는 흐름으로 돈다</w:t>
+            </w:r>
+          </w:p>
+        </w:tc>
+        <w:tc>
+          <w:tcPr>
+            <w:tcW w:type="dxa" w:w="526"/>
+          </w:tcPr>
+          <w:p>
+            <w:pPr>
+              <w:pStyle w:val="Compact"/>
+              <w:spacing w:after="0" w:line="264" w:lineRule="auto"/>
+            </w:pPr>
+            <w:r>
+              <w:rPr>
+                <w:sz w:val="16"/>
+              </w:rPr>
+              <w:t xml:space="preserve">S</w:t>
+            </w:r>
+          </w:p>
+        </w:tc>
+        <w:tc>
+          <w:tcPr>
+            <w:tcW w:type="dxa" w:w="564"/>
+          </w:tcPr>
+          <w:p>
+            <w:pPr>
+              <w:pStyle w:val="Compact"/>
+              <w:spacing w:after="0" w:line="264" w:lineRule="auto"/>
+            </w:pPr>
+            <w:r>
+              <w:rPr>
+                <w:sz w:val="16"/>
+              </w:rPr>
+              <w:t xml:space="preserve">P1</w:t>
+            </w:r>
+          </w:p>
+        </w:tc>
+        <w:tc>
+          <w:tcPr>
+            <w:tcW w:type="dxa" w:w="564"/>
+          </w:tcPr>
+          <w:p>
+            <w:pPr>
+              <w:pStyle w:val="Compact"/>
+              <w:spacing w:after="0" w:line="264" w:lineRule="auto"/>
+            </w:pPr>
+            <w:r>
+              <w:rPr>
+                <w:sz w:val="16"/>
+              </w:rPr>
+              <w:t xml:space="preserve">완료</w:t>
+            </w:r>
+          </w:p>
+        </w:tc>
+        <w:tc>
+          <w:tcPr>
+            <w:tcW w:type="dxa" w:w="2551"/>
+          </w:tcPr>
+          <w:p>
+            <w:pPr>
+              <w:pStyle w:val="Compact"/>
+              <w:spacing w:after="0" w:line="264" w:lineRule="auto"/>
+            </w:pPr>
+            <w:r>
+              <w:rPr>
+                <w:sz w:val="16"/>
+              </w:rPr>
+              <w:t xml:space="preserve">Prefect — CLI를 부르기만 한다 (D-0224)</w:t>
+            </w:r>
+          </w:p>
+        </w:tc>
+      </w:tr>
+      <w:tr>
+        <w:tc>
+          <w:tcPr>
+            <w:tcW w:type="dxa" w:w="2231"/>
+          </w:tcPr>
+          <w:p>
+            <w:pPr>
+              <w:pStyle w:val="Compact"/>
+              <w:spacing w:after="0" w:line="264" w:lineRule="auto"/>
+            </w:pPr>
+            <w:r>
+              <w:rPr>
+                <w:sz w:val="16"/>
+              </w:rPr>
+              <w:t xml:space="preserve">REQ-INF-015</w:t>
+            </w:r>
+          </w:p>
+        </w:tc>
+        <w:tc>
+          <w:tcPr>
+            <w:tcW w:type="dxa" w:w="2635"/>
+          </w:tcPr>
+          <w:p>
+            <w:pPr>
+              <w:pStyle w:val="Compact"/>
+              <w:spacing w:after="0" w:line="264" w:lineRule="auto"/>
+            </w:pPr>
+            <w:r>
+              <w:rPr>
+                <w:sz w:val="16"/>
+              </w:rPr>
+              <w:t xml:space="preserve">GPU 기기가 엔진 재개 조건을 넘는지 버튼 하나로 잰다</w:t>
+            </w:r>
+          </w:p>
+        </w:tc>
+        <w:tc>
+          <w:tcPr>
+            <w:tcW w:type="dxa" w:w="526"/>
+          </w:tcPr>
+          <w:p>
+            <w:pPr>
+              <w:pStyle w:val="Compact"/>
+              <w:spacing w:after="0" w:line="264" w:lineRule="auto"/>
+            </w:pPr>
+            <w:r>
+              <w:rPr>
+                <w:sz w:val="16"/>
+              </w:rPr>
+              <w:t xml:space="preserve">S</w:t>
+            </w:r>
+          </w:p>
+        </w:tc>
+        <w:tc>
+          <w:tcPr>
+            <w:tcW w:type="dxa" w:w="564"/>
+          </w:tcPr>
+          <w:p>
+            <w:pPr>
+              <w:pStyle w:val="Compact"/>
+              <w:spacing w:after="0" w:line="264" w:lineRule="auto"/>
+            </w:pPr>
+            <w:r>
+              <w:rPr>
+                <w:sz w:val="16"/>
+              </w:rPr>
+              <w:t xml:space="preserve">P6</w:t>
+            </w:r>
+          </w:p>
+        </w:tc>
+        <w:tc>
+          <w:tcPr>
+            <w:tcW w:type="dxa" w:w="564"/>
+          </w:tcPr>
+          <w:p>
+            <w:pPr>
+              <w:pStyle w:val="Compact"/>
+              <w:spacing w:after="0" w:line="264" w:lineRule="auto"/>
+            </w:pPr>
+            <w:r>
+              <w:rPr>
+                <w:sz w:val="16"/>
+              </w:rPr>
+              <w:t xml:space="preserve">완료</w:t>
+            </w:r>
+          </w:p>
+        </w:tc>
+        <w:tc>
+          <w:tcPr>
+            <w:tcW w:type="dxa" w:w="2551"/>
+          </w:tcPr>
+          <w:p>
+            <w:pPr>
+              <w:pStyle w:val="Compact"/>
+              <w:spacing w:after="0" w:line="264" w:lineRule="auto"/>
+            </w:pPr>
+            <w:r>
+              <w:rPr>
+                <w:sz w:val="16"/>
+              </w:rPr>
+              <w:t xml:space="preserve">셀프호스티드 러너 · 손으로만 (D-0224)</w:t>
             </w:r>
           </w:p>
         </w:tc>
@@ -24852,9 +25164,9 @@
         <w:tblLook w:firstRow="1" w:lastRow="0" w:firstColumn="0" w:lastColumn="0" w:noHBand="0" w:noVBand="0" w:val="0020"/>
       </w:tblPr>
       <w:tblGrid>
-        <w:gridCol w:w="2832"/>
-        <w:gridCol w:w="1544"/>
-        <w:gridCol w:w="4695"/>
+        <w:gridCol w:w="2649"/>
+        <w:gridCol w:w="1402"/>
+        <w:gridCol w:w="5019"/>
       </w:tblGrid>
       <w:tr>
         <w:trPr>
@@ -24862,7 +25174,7 @@
         </w:trPr>
         <w:tc>
           <w:tcPr>
-            <w:tcW w:type="dxa" w:w="2833"/>
+            <w:tcW w:type="dxa" w:w="2649"/>
             <w:shd w:val="clear" w:color="auto" w:fill="E8EEF5"/>
           </w:tcPr>
           <w:p>
@@ -24882,7 +25194,7 @@
         </w:tc>
         <w:tc>
           <w:tcPr>
-            <w:tcW w:type="dxa" w:w="1544"/>
+            <w:tcW w:type="dxa" w:w="1403"/>
             <w:shd w:val="clear" w:color="auto" w:fill="E8EEF5"/>
           </w:tcPr>
           <w:p>
@@ -24902,7 +25214,7 @@
         </w:tc>
         <w:tc>
           <w:tcPr>
-            <w:tcW w:type="dxa" w:w="4695"/>
+            <w:tcW w:type="dxa" w:w="5020"/>
             <w:shd w:val="clear" w:color="auto" w:fill="E8EEF5"/>
           </w:tcPr>
           <w:p>
@@ -24924,7 +25236,7 @@
       <w:tr>
         <w:tc>
           <w:tcPr>
-            <w:tcW w:type="dxa" w:w="2833"/>
+            <w:tcW w:type="dxa" w:w="2649"/>
           </w:tcPr>
           <w:p>
             <w:pPr>
@@ -24941,7 +25253,7 @@
         </w:tc>
         <w:tc>
           <w:tcPr>
-            <w:tcW w:type="dxa" w:w="1544"/>
+            <w:tcW w:type="dxa" w:w="1403"/>
           </w:tcPr>
           <w:p>
             <w:pPr>
@@ -24960,7 +25272,7 @@
         </w:tc>
         <w:tc>
           <w:tcPr>
-            <w:tcW w:type="dxa" w:w="4695"/>
+            <w:tcW w:type="dxa" w:w="5020"/>
           </w:tcPr>
           <w:p>
             <w:pPr>
@@ -24979,7 +25291,7 @@
       <w:tr>
         <w:tc>
           <w:tcPr>
-            <w:tcW w:type="dxa" w:w="2833"/>
+            <w:tcW w:type="dxa" w:w="2649"/>
           </w:tcPr>
           <w:p>
             <w:pPr>
@@ -24996,7 +25308,7 @@
         </w:tc>
         <w:tc>
           <w:tcPr>
-            <w:tcW w:type="dxa" w:w="1544"/>
+            <w:tcW w:type="dxa" w:w="1403"/>
           </w:tcPr>
           <w:p>
             <w:pPr>
@@ -25013,7 +25325,7 @@
         </w:tc>
         <w:tc>
           <w:tcPr>
-            <w:tcW w:type="dxa" w:w="4695"/>
+            <w:tcW w:type="dxa" w:w="5020"/>
           </w:tcPr>
           <w:p>
             <w:pPr>
@@ -25032,7 +25344,7 @@
       <w:tr>
         <w:tc>
           <w:tcPr>
-            <w:tcW w:type="dxa" w:w="2833"/>
+            <w:tcW w:type="dxa" w:w="2649"/>
           </w:tcPr>
           <w:p>
             <w:pPr>
@@ -25049,7 +25361,7 @@
         </w:tc>
         <w:tc>
           <w:tcPr>
-            <w:tcW w:type="dxa" w:w="1544"/>
+            <w:tcW w:type="dxa" w:w="1403"/>
           </w:tcPr>
           <w:p>
             <w:pPr>
@@ -25066,7 +25378,7 @@
         </w:tc>
         <w:tc>
           <w:tcPr>
-            <w:tcW w:type="dxa" w:w="4695"/>
+            <w:tcW w:type="dxa" w:w="5020"/>
           </w:tcPr>
           <w:p>
             <w:pPr>
@@ -25085,7 +25397,7 @@
       <w:tr>
         <w:tc>
           <w:tcPr>
-            <w:tcW w:type="dxa" w:w="2833"/>
+            <w:tcW w:type="dxa" w:w="2649"/>
           </w:tcPr>
           <w:p>
             <w:pPr>
@@ -25102,7 +25414,7 @@
         </w:tc>
         <w:tc>
           <w:tcPr>
-            <w:tcW w:type="dxa" w:w="1544"/>
+            <w:tcW w:type="dxa" w:w="1403"/>
           </w:tcPr>
           <w:p>
             <w:pPr>
@@ -25119,7 +25431,7 @@
         </w:tc>
         <w:tc>
           <w:tcPr>
-            <w:tcW w:type="dxa" w:w="4695"/>
+            <w:tcW w:type="dxa" w:w="5020"/>
           </w:tcPr>
           <w:p>
             <w:pPr>
@@ -25138,7 +25450,7 @@
       <w:tr>
         <w:tc>
           <w:tcPr>
-            <w:tcW w:type="dxa" w:w="2833"/>
+            <w:tcW w:type="dxa" w:w="2649"/>
           </w:tcPr>
           <w:p>
             <w:pPr>
@@ -25155,7 +25467,7 @@
         </w:tc>
         <w:tc>
           <w:tcPr>
-            <w:tcW w:type="dxa" w:w="1544"/>
+            <w:tcW w:type="dxa" w:w="1403"/>
           </w:tcPr>
           <w:p>
             <w:pPr>
@@ -25172,7 +25484,7 @@
         </w:tc>
         <w:tc>
           <w:tcPr>
-            <w:tcW w:type="dxa" w:w="4695"/>
+            <w:tcW w:type="dxa" w:w="5020"/>
           </w:tcPr>
           <w:p>
             <w:pPr>
@@ -25191,7 +25503,7 @@
       <w:tr>
         <w:tc>
           <w:tcPr>
-            <w:tcW w:type="dxa" w:w="2833"/>
+            <w:tcW w:type="dxa" w:w="2649"/>
           </w:tcPr>
           <w:p>
             <w:pPr>
@@ -25208,7 +25520,7 @@
         </w:tc>
         <w:tc>
           <w:tcPr>
-            <w:tcW w:type="dxa" w:w="1544"/>
+            <w:tcW w:type="dxa" w:w="1403"/>
           </w:tcPr>
           <w:p>
             <w:pPr>
@@ -25225,7 +25537,7 @@
         </w:tc>
         <w:tc>
           <w:tcPr>
-            <w:tcW w:type="dxa" w:w="4695"/>
+            <w:tcW w:type="dxa" w:w="5020"/>
           </w:tcPr>
           <w:p>
             <w:pPr>
@@ -25244,7 +25556,7 @@
       <w:tr>
         <w:tc>
           <w:tcPr>
-            <w:tcW w:type="dxa" w:w="2833"/>
+            <w:tcW w:type="dxa" w:w="2649"/>
           </w:tcPr>
           <w:p>
             <w:pPr>
@@ -25261,7 +25573,7 @@
         </w:tc>
         <w:tc>
           <w:tcPr>
-            <w:tcW w:type="dxa" w:w="1544"/>
+            <w:tcW w:type="dxa" w:w="1403"/>
           </w:tcPr>
           <w:p>
             <w:pPr>
@@ -25278,18 +25590,18 @@
         </w:tc>
         <w:tc>
           <w:tcPr>
-            <w:tcW w:type="dxa" w:w="4695"/>
-          </w:tcPr>
-          <w:p>
-            <w:pPr>
-              <w:pStyle w:val="Compact"/>
-              <w:spacing w:after="0" w:line="264" w:lineRule="auto"/>
-            </w:pPr>
-            <w:r>
-              <w:rPr>
-                <w:sz w:val="16"/>
-              </w:rPr>
-              <w:t xml:space="preserve">망을 타는 모듈은 허용 목록 2곳뿐이며 문자열만 보낸다. 늘면 검사가 빨개진다 (D-0134)</w:t>
+            <w:tcW w:type="dxa" w:w="5020"/>
+          </w:tcPr>
+          <w:p>
+            <w:pPr>
+              <w:pStyle w:val="Compact"/>
+              <w:spacing w:after="0" w:line="264" w:lineRule="auto"/>
+            </w:pPr>
+            <w:r>
+              <w:rPr>
+                <w:sz w:val="16"/>
+              </w:rPr>
+              <w:t xml:space="preserve">망을 타는 모듈은 허용 목록 4곳뿐이다. 밖으로는 MusicBrainz 2곳이 문자열만, MLflow · Prefect 2곳은 로컬 주소만 받는다. 늘면 검사가 빨개진다 (D-0134 · D-0224)</w:t>
             </w:r>
           </w:p>
         </w:tc>
@@ -25308,7 +25620,7 @@
     <w:tbl>
       <w:tblPr>
         <w:tblStyle w:val="Table"/>
-        <w:tblW w:w="9071" w:type="dxa"/>
+        <w:tblW w:w="9072" w:type="dxa"/>
         <w:tblBorders>
           <w:top w:val="single" w:sz="4" w:color="BFC8D3"/>
           <w:left w:val="single" w:sz="4" w:color="BFC8D3"/>
@@ -25321,9 +25633,9 @@
         <w:tblLook w:firstRow="1" w:lastRow="0" w:firstColumn="0" w:lastColumn="0" w:noHBand="0" w:noVBand="0" w:val="0020"/>
       </w:tblPr>
       <w:tblGrid>
-        <w:gridCol w:w="2896"/>
-        <w:gridCol w:w="1411"/>
-        <w:gridCol w:w="4764"/>
+        <w:gridCol w:w="2832"/>
+        <w:gridCol w:w="1373"/>
+        <w:gridCol w:w="4866"/>
       </w:tblGrid>
       <w:tr>
         <w:trPr>
@@ -25331,7 +25643,7 @@
         </w:trPr>
         <w:tc>
           <w:tcPr>
-            <w:tcW w:type="dxa" w:w="2896"/>
+            <w:tcW w:type="dxa" w:w="2832"/>
             <w:shd w:val="clear" w:color="auto" w:fill="E8EEF5"/>
           </w:tcPr>
           <w:p>
@@ -25351,7 +25663,7 @@
         </w:tc>
         <w:tc>
           <w:tcPr>
-            <w:tcW w:type="dxa" w:w="1411"/>
+            <w:tcW w:type="dxa" w:w="1373"/>
             <w:shd w:val="clear" w:color="auto" w:fill="E8EEF5"/>
           </w:tcPr>
           <w:p>
@@ -25371,7 +25683,7 @@
         </w:tc>
         <w:tc>
           <w:tcPr>
-            <w:tcW w:type="dxa" w:w="4764"/>
+            <w:tcW w:type="dxa" w:w="4867"/>
             <w:shd w:val="clear" w:color="auto" w:fill="E8EEF5"/>
           </w:tcPr>
           <w:p>
@@ -25393,7 +25705,7 @@
       <w:tr>
         <w:tc>
           <w:tcPr>
-            <w:tcW w:type="dxa" w:w="2896"/>
+            <w:tcW w:type="dxa" w:w="2832"/>
           </w:tcPr>
           <w:p>
             <w:pPr>
@@ -25410,7 +25722,7 @@
         </w:tc>
         <w:tc>
           <w:tcPr>
-            <w:tcW w:type="dxa" w:w="1411"/>
+            <w:tcW w:type="dxa" w:w="1373"/>
           </w:tcPr>
           <w:p>
             <w:pPr>
@@ -25427,7 +25739,7 @@
         </w:tc>
         <w:tc>
           <w:tcPr>
-            <w:tcW w:type="dxa" w:w="4764"/>
+            <w:tcW w:type="dxa" w:w="4867"/>
           </w:tcPr>
           <w:p>
             <w:pPr>
@@ -25446,7 +25758,7 @@
       <w:tr>
         <w:tc>
           <w:tcPr>
-            <w:tcW w:type="dxa" w:w="2896"/>
+            <w:tcW w:type="dxa" w:w="2832"/>
           </w:tcPr>
           <w:p>
             <w:pPr>
@@ -25463,7 +25775,7 @@
         </w:tc>
         <w:tc>
           <w:tcPr>
-            <w:tcW w:type="dxa" w:w="1411"/>
+            <w:tcW w:type="dxa" w:w="1373"/>
           </w:tcPr>
           <w:p>
             <w:pPr>
@@ -25480,7 +25792,7 @@
         </w:tc>
         <w:tc>
           <w:tcPr>
-            <w:tcW w:type="dxa" w:w="4764"/>
+            <w:tcW w:type="dxa" w:w="4867"/>
           </w:tcPr>
           <w:p>
             <w:pPr>
@@ -25499,7 +25811,7 @@
       <w:tr>
         <w:tc>
           <w:tcPr>
-            <w:tcW w:type="dxa" w:w="2896"/>
+            <w:tcW w:type="dxa" w:w="2832"/>
           </w:tcPr>
           <w:p>
             <w:pPr>
@@ -25516,7 +25828,7 @@
         </w:tc>
         <w:tc>
           <w:tcPr>
-            <w:tcW w:type="dxa" w:w="1411"/>
+            <w:tcW w:type="dxa" w:w="1373"/>
           </w:tcPr>
           <w:p>
             <w:pPr>
@@ -25533,20 +25845,110 @@
         </w:tc>
         <w:tc>
           <w:tcPr>
-            <w:tcW w:type="dxa" w:w="4764"/>
-          </w:tcPr>
-          <w:p>
-            <w:pPr>
-              <w:pStyle w:val="Compact"/>
-              <w:spacing w:after="0" w:line="264" w:lineRule="auto"/>
-            </w:pPr>
+            <w:tcW w:type="dxa" w:w="4867"/>
+          </w:tcPr>
+          <w:p>
+            <w:pPr>
+              <w:pStyle w:val="Compact"/>
+              <w:spacing w:after="0" w:line="264" w:lineRule="auto"/>
+            </w:pPr>
+            <w:r>
+              <w:rPr>
+                <w:sz w:val="16"/>
+              </w:rPr>
+              <w:t xml:space="preserve">바닥은</w:t>
+            </w:r>
+            <w:r>
+              <w:rPr>
+                <w:sz w:val="16"/>
+              </w:rPr>
+              <w:t xml:space="preserve"> </w:t>
+            </w:r>
+            <w:r>
+              <w:rPr>
+                <w:rStyle w:val="VerbatimChar"/>
+                <w:sz w:val="16"/>
+              </w:rPr>
+              <w:t xml:space="preserve">core/pyproject.toml</w:t>
+            </w:r>
+            <w:r>
+              <w:rPr>
+                <w:sz w:val="16"/>
+              </w:rPr>
+              <w:t xml:space="preserve"> </w:t>
+            </w:r>
+            <w:r>
+              <w:rPr>
+                <w:sz w:val="16"/>
+              </w:rPr>
+              <w:t xml:space="preserve">한 곳이며 래칫이다 — 실측이 3%p 넘게 앞서면 올린다 (D-0223)</w:t>
+            </w:r>
+          </w:p>
+        </w:tc>
+      </w:tr>
+      <w:tr>
+        <w:tc>
+          <w:tcPr>
+            <w:tcW w:type="dxa" w:w="2832"/>
+          </w:tcPr>
+          <w:p>
+            <w:pPr>
+              <w:pStyle w:val="Compact"/>
+              <w:spacing w:after="0" w:line="264" w:lineRule="auto"/>
+            </w:pPr>
+            <w:r>
+              <w:rPr>
+                <w:sz w:val="16"/>
+              </w:rPr>
+              <w:t xml:space="preserve">NFR-MNT-004</w:t>
+            </w:r>
+          </w:p>
+        </w:tc>
+        <w:tc>
+          <w:tcPr>
+            <w:tcW w:type="dxa" w:w="1373"/>
+          </w:tcPr>
+          <w:p>
+            <w:pPr>
+              <w:pStyle w:val="Compact"/>
+              <w:spacing w:after="0" w:line="264" w:lineRule="auto"/>
+            </w:pPr>
+            <w:r>
+              <w:rPr>
+                <w:sz w:val="16"/>
+              </w:rPr>
+              <w:t xml:space="preserve">결정 기록</w:t>
+            </w:r>
+          </w:p>
+        </w:tc>
+        <w:tc>
+          <w:tcPr>
+            <w:tcW w:type="dxa" w:w="4867"/>
+          </w:tcPr>
+          <w:p>
+            <w:pPr>
+              <w:pStyle w:val="Compact"/>
+              <w:spacing w:after="0" w:line="264" w:lineRule="auto"/>
+            </w:pPr>
+            <w:r>
+              <w:rPr>
+                <w:sz w:val="16"/>
+              </w:rPr>
+              <w:t xml:space="preserve">설계 판단은 DECISIONS.md에 배경·후보·선택·결과와</w:t>
+            </w:r>
+            <w:r>
+              <w:rPr>
+                <w:sz w:val="16"/>
+              </w:rPr>
+              <w:t xml:space="preserve"> </w:t>
+            </w:r>
             <w:r>
               <w:rPr>
                 <w:b/>
                 <w:bCs/>
                 <w:sz w:val="16"/>
               </w:rPr>
-              <w:t xml:space="preserve">83% 이상 (CI 게이트).</w:t>
+              <w:t xml:space="preserve">강제자 · 재현</w:t>
             </w:r>
             <w:r>
               <w:rPr>
@@ -25558,60 +25960,114 @@
               <w:rPr>
                 <w:sz w:val="16"/>
               </w:rPr>
-              <w:t xml:space="preserve">올린 뒤 내리지 않는다</w:t>
-            </w:r>
-          </w:p>
-        </w:tc>
-      </w:tr>
-      <w:tr>
-        <w:tc>
-          <w:tcPr>
-            <w:tcW w:type="dxa" w:w="2896"/>
-          </w:tcPr>
-          <w:p>
-            <w:pPr>
-              <w:pStyle w:val="Compact"/>
-              <w:spacing w:after="0" w:line="264" w:lineRule="auto"/>
-            </w:pPr>
-            <w:r>
-              <w:rPr>
-                <w:sz w:val="16"/>
-              </w:rPr>
-              <w:t xml:space="preserve">NFR-MNT-004</w:t>
-            </w:r>
-          </w:p>
-        </w:tc>
-        <w:tc>
-          <w:tcPr>
-            <w:tcW w:type="dxa" w:w="1411"/>
-          </w:tcPr>
-          <w:p>
-            <w:pPr>
-              <w:pStyle w:val="Compact"/>
-              <w:spacing w:after="0" w:line="264" w:lineRule="auto"/>
-            </w:pPr>
-            <w:r>
-              <w:rPr>
-                <w:sz w:val="16"/>
-              </w:rPr>
-              <w:t xml:space="preserve">결정 기록</w:t>
-            </w:r>
-          </w:p>
-        </w:tc>
-        <w:tc>
-          <w:tcPr>
-            <w:tcW w:type="dxa" w:w="4764"/>
-          </w:tcPr>
-          <w:p>
-            <w:pPr>
-              <w:pStyle w:val="Compact"/>
-              <w:spacing w:after="0" w:line="264" w:lineRule="auto"/>
-            </w:pPr>
-            <w:r>
-              <w:rPr>
-                <w:sz w:val="16"/>
-              </w:rPr>
-              <w:t xml:space="preserve">설계 판단은 DECISIONS.md에 배경·후보·선택·결과와</w:t>
+              <w:t xml:space="preserve">줄로 기록. 형식은 검사가 본다</w:t>
+            </w:r>
+          </w:p>
+        </w:tc>
+      </w:tr>
+      <w:tr>
+        <w:tc>
+          <w:tcPr>
+            <w:tcW w:type="dxa" w:w="2832"/>
+          </w:tcPr>
+          <w:p>
+            <w:pPr>
+              <w:pStyle w:val="Compact"/>
+              <w:spacing w:after="0" w:line="264" w:lineRule="auto"/>
+            </w:pPr>
+            <w:r>
+              <w:rPr>
+                <w:sz w:val="16"/>
+              </w:rPr>
+              <w:t xml:space="preserve">NFR-MNT-005</w:t>
+            </w:r>
+          </w:p>
+        </w:tc>
+        <w:tc>
+          <w:tcPr>
+            <w:tcW w:type="dxa" w:w="1373"/>
+          </w:tcPr>
+          <w:p>
+            <w:pPr>
+              <w:pStyle w:val="Compact"/>
+              <w:spacing w:after="0" w:line="264" w:lineRule="auto"/>
+            </w:pPr>
+            <w:r>
+              <w:rPr>
+                <w:sz w:val="16"/>
+              </w:rPr>
+              <w:t xml:space="preserve">파일 길이</w:t>
+            </w:r>
+          </w:p>
+        </w:tc>
+        <w:tc>
+          <w:tcPr>
+            <w:tcW w:type="dxa" w:w="4867"/>
+          </w:tcPr>
+          <w:p>
+            <w:pPr>
+              <w:pStyle w:val="Compact"/>
+              <w:spacing w:after="0" w:line="264" w:lineRule="auto"/>
+            </w:pPr>
+            <w:r>
+              <w:rPr>
+                <w:sz w:val="16"/>
+              </w:rPr>
+              <w:t xml:space="preserve">코드 600줄 · 시험 700줄 상한. 넘는 파일은 래칫 — 늘어도 줄어도 빨개진다 (D-0117)</w:t>
+            </w:r>
+          </w:p>
+        </w:tc>
+      </w:tr>
+      <w:tr>
+        <w:tc>
+          <w:tcPr>
+            <w:tcW w:type="dxa" w:w="2832"/>
+          </w:tcPr>
+          <w:p>
+            <w:pPr>
+              <w:pStyle w:val="Compact"/>
+              <w:spacing w:after="0" w:line="264" w:lineRule="auto"/>
+            </w:pPr>
+            <w:r>
+              <w:rPr>
+                <w:sz w:val="16"/>
+              </w:rPr>
+              <w:t xml:space="preserve">NFR-MNT-006</w:t>
+            </w:r>
+          </w:p>
+        </w:tc>
+        <w:tc>
+          <w:tcPr>
+            <w:tcW w:type="dxa" w:w="1373"/>
+          </w:tcPr>
+          <w:p>
+            <w:pPr>
+              <w:pStyle w:val="Compact"/>
+              <w:spacing w:after="0" w:line="264" w:lineRule="auto"/>
+            </w:pPr>
+            <w:r>
+              <w:rPr>
+                <w:sz w:val="16"/>
+              </w:rPr>
+              <w:t xml:space="preserve">관문 일치</w:t>
+            </w:r>
+          </w:p>
+        </w:tc>
+        <w:tc>
+          <w:tcPr>
+            <w:tcW w:type="dxa" w:w="4867"/>
+          </w:tcPr>
+          <w:p>
+            <w:pPr>
+              <w:pStyle w:val="Compact"/>
+              <w:spacing w:after="0" w:line="264" w:lineRule="auto"/>
+            </w:pPr>
+            <w:r>
+              <w:rPr>
+                <w:rStyle w:val="VerbatimChar"/>
+                <w:sz w:val="16"/>
+              </w:rPr>
+              <w:t xml:space="preserve">make check</w:t>
             </w:r>
             <w:r>
               <w:rPr>
@@ -25621,139 +26077,6 @@
             </w:r>
             <w:r>
               <w:rPr>
-                <w:b/>
-                <w:bCs/>
-                <w:sz w:val="16"/>
-              </w:rPr>
-              <w:t xml:space="preserve">강제자 · 재현</w:t>
-            </w:r>
-            <w:r>
-              <w:rPr>
-                <w:sz w:val="16"/>
-              </w:rPr>
-              <w:t xml:space="preserve"> </w:t>
-            </w:r>
-            <w:r>
-              <w:rPr>
-                <w:sz w:val="16"/>
-              </w:rPr>
-              <w:t xml:space="preserve">줄로 기록. 형식은 검사가 본다</w:t>
-            </w:r>
-          </w:p>
-        </w:tc>
-      </w:tr>
-      <w:tr>
-        <w:tc>
-          <w:tcPr>
-            <w:tcW w:type="dxa" w:w="2896"/>
-          </w:tcPr>
-          <w:p>
-            <w:pPr>
-              <w:pStyle w:val="Compact"/>
-              <w:spacing w:after="0" w:line="264" w:lineRule="auto"/>
-            </w:pPr>
-            <w:r>
-              <w:rPr>
-                <w:sz w:val="16"/>
-              </w:rPr>
-              <w:t xml:space="preserve">NFR-MNT-005</w:t>
-            </w:r>
-          </w:p>
-        </w:tc>
-        <w:tc>
-          <w:tcPr>
-            <w:tcW w:type="dxa" w:w="1411"/>
-          </w:tcPr>
-          <w:p>
-            <w:pPr>
-              <w:pStyle w:val="Compact"/>
-              <w:spacing w:after="0" w:line="264" w:lineRule="auto"/>
-            </w:pPr>
-            <w:r>
-              <w:rPr>
-                <w:sz w:val="16"/>
-              </w:rPr>
-              <w:t xml:space="preserve">파일 길이</w:t>
-            </w:r>
-          </w:p>
-        </w:tc>
-        <w:tc>
-          <w:tcPr>
-            <w:tcW w:type="dxa" w:w="4764"/>
-          </w:tcPr>
-          <w:p>
-            <w:pPr>
-              <w:pStyle w:val="Compact"/>
-              <w:spacing w:after="0" w:line="264" w:lineRule="auto"/>
-            </w:pPr>
-            <w:r>
-              <w:rPr>
-                <w:sz w:val="16"/>
-              </w:rPr>
-              <w:t xml:space="preserve">코드 600줄 · 시험 700줄 상한. 넘는 파일은 래칫 — 늘어도 줄어도 빨개진다 (D-0117)</w:t>
-            </w:r>
-          </w:p>
-        </w:tc>
-      </w:tr>
-      <w:tr>
-        <w:tc>
-          <w:tcPr>
-            <w:tcW w:type="dxa" w:w="2896"/>
-          </w:tcPr>
-          <w:p>
-            <w:pPr>
-              <w:pStyle w:val="Compact"/>
-              <w:spacing w:after="0" w:line="264" w:lineRule="auto"/>
-            </w:pPr>
-            <w:r>
-              <w:rPr>
-                <w:sz w:val="16"/>
-              </w:rPr>
-              <w:t xml:space="preserve">NFR-MNT-006</w:t>
-            </w:r>
-          </w:p>
-        </w:tc>
-        <w:tc>
-          <w:tcPr>
-            <w:tcW w:type="dxa" w:w="1411"/>
-          </w:tcPr>
-          <w:p>
-            <w:pPr>
-              <w:pStyle w:val="Compact"/>
-              <w:spacing w:after="0" w:line="264" w:lineRule="auto"/>
-            </w:pPr>
-            <w:r>
-              <w:rPr>
-                <w:sz w:val="16"/>
-              </w:rPr>
-              <w:t xml:space="preserve">관문 일치</w:t>
-            </w:r>
-          </w:p>
-        </w:tc>
-        <w:tc>
-          <w:tcPr>
-            <w:tcW w:type="dxa" w:w="4764"/>
-          </w:tcPr>
-          <w:p>
-            <w:pPr>
-              <w:pStyle w:val="Compact"/>
-              <w:spacing w:after="0" w:line="264" w:lineRule="auto"/>
-            </w:pPr>
-            <w:r>
-              <w:rPr>
-                <w:rStyle w:val="VerbatimChar"/>
-                <w:sz w:val="16"/>
-              </w:rPr>
-              <w:t xml:space="preserve">make check</w:t>
-            </w:r>
-            <w:r>
-              <w:rPr>
-                <w:sz w:val="16"/>
-              </w:rPr>
-              <w:t xml:space="preserve"> </w:t>
-            </w:r>
-            <w:r>
-              <w:rPr>
                 <w:sz w:val="16"/>
               </w:rPr>
               <w:t xml:space="preserve">· CI · 커밋 훅의 검사 차집합이 선언과 같다 (D-0219)</w:t>
@@ -25764,7 +26087,7 @@
       <w:tr>
         <w:tc>
           <w:tcPr>
-            <w:tcW w:type="dxa" w:w="2896"/>
+            <w:tcW w:type="dxa" w:w="2832"/>
           </w:tcPr>
           <w:p>
             <w:pPr>
@@ -25781,7 +26104,7 @@
         </w:tc>
         <w:tc>
           <w:tcPr>
-            <w:tcW w:type="dxa" w:w="1411"/>
+            <w:tcW w:type="dxa" w:w="1373"/>
           </w:tcPr>
           <w:p>
             <w:pPr>
@@ -25798,7 +26121,7 @@
         </w:tc>
         <w:tc>
           <w:tcPr>
-            <w:tcW w:type="dxa" w:w="4764"/>
+            <w:tcW w:type="dxa" w:w="4867"/>
           </w:tcPr>
           <w:p>
             <w:pPr>
@@ -25817,7 +26140,7 @@
       <w:tr>
         <w:tc>
           <w:tcPr>
-            <w:tcW w:type="dxa" w:w="2896"/>
+            <w:tcW w:type="dxa" w:w="2832"/>
           </w:tcPr>
           <w:p>
             <w:pPr>
@@ -25834,7 +26157,7 @@
         </w:tc>
         <w:tc>
           <w:tcPr>
-            <w:tcW w:type="dxa" w:w="1411"/>
+            <w:tcW w:type="dxa" w:w="1373"/>
           </w:tcPr>
           <w:p>
             <w:pPr>
@@ -25851,7 +26174,7 @@
         </w:tc>
         <w:tc>
           <w:tcPr>
-            <w:tcW w:type="dxa" w:w="4764"/>
+            <w:tcW w:type="dxa" w:w="4867"/>
           </w:tcPr>
           <w:p>
             <w:pPr>
@@ -25870,7 +26193,7 @@
       <w:tr>
         <w:tc>
           <w:tcPr>
-            <w:tcW w:type="dxa" w:w="2896"/>
+            <w:tcW w:type="dxa" w:w="2832"/>
           </w:tcPr>
           <w:p>
             <w:pPr>
@@ -25887,7 +26210,7 @@
         </w:tc>
         <w:tc>
           <w:tcPr>
-            <w:tcW w:type="dxa" w:w="1411"/>
+            <w:tcW w:type="dxa" w:w="1373"/>
           </w:tcPr>
           <w:p>
             <w:pPr>
@@ -25904,7 +26227,7 @@
         </w:tc>
         <w:tc>
           <w:tcPr>
-            <w:tcW w:type="dxa" w:w="4764"/>
+            <w:tcW w:type="dxa" w:w="4867"/>
           </w:tcPr>
           <w:p>
             <w:pPr>
@@ -42646,7 +42969,7 @@
         <w:t xml:space="preserve"> </w:t>
       </w:r>
       <w:r>
-        <w:t xml:space="preserve">목록 2곳(MusicBrainz 조회 · 문자열만)이며 늘면</w:t>
+        <w:t xml:space="preserve">목록 4곳이며 늘면</w:t>
       </w:r>
       <w:r>
         <w:t xml:space="preserve"> </w:t>
@@ -42658,7 +42981,13 @@
         <w:t xml:space="preserve">check_egress</w:t>
       </w:r>
       <w:r>
-        <w:t xml:space="preserve">가 빨개진다.</w:t>
+        <w:t xml:space="preserve">가 빨개진다. 밖으로 가는 것은 MusicBrainz 조회 2곳(문자열만)이고,</w:t>
+      </w:r>
+      <w:r>
+        <w:t xml:space="preserve"> </w:t>
+      </w:r>
+      <w:r>
+        <w:t xml:space="preserve">MLflow · Prefect 2곳은 로컬 주소가 아니면 거절하며 둘의 사용 통계도 끈다 (D-0224).</w:t>
       </w:r>
     </w:p>
     <w:bookmarkEnd w:id="160"/>
@@ -50202,9 +50531,9 @@
         <w:tblLook w:firstRow="1" w:lastRow="0" w:firstColumn="0" w:lastColumn="0" w:noHBand="0" w:noVBand="0" w:val="0020"/>
       </w:tblPr>
       <w:tblGrid>
-        <w:gridCol w:w="3316"/>
-        <w:gridCol w:w="3043"/>
-        <w:gridCol w:w="2711"/>
+        <w:gridCol w:w="2878"/>
+        <w:gridCol w:w="3454"/>
+        <w:gridCol w:w="2738"/>
       </w:tblGrid>
       <w:tr>
         <w:trPr>
@@ -50212,7 +50541,7 @@
         </w:trPr>
         <w:tc>
           <w:tcPr>
-            <w:tcW w:type="dxa" w:w="3316"/>
+            <w:tcW w:type="dxa" w:w="2878"/>
             <w:shd w:val="clear" w:color="auto" w:fill="E8EEF5"/>
           </w:tcPr>
           <w:p>
@@ -50232,7 +50561,7 @@
         </w:tc>
         <w:tc>
           <w:tcPr>
-            <w:tcW w:type="dxa" w:w="3044"/>
+            <w:tcW w:type="dxa" w:w="3455"/>
             <w:shd w:val="clear" w:color="auto" w:fill="E8EEF5"/>
           </w:tcPr>
           <w:p>
@@ -50252,7 +50581,7 @@
         </w:tc>
         <w:tc>
           <w:tcPr>
-            <w:tcW w:type="dxa" w:w="2712"/>
+            <w:tcW w:type="dxa" w:w="2739"/>
             <w:shd w:val="clear" w:color="auto" w:fill="E8EEF5"/>
           </w:tcPr>
           <w:p>
@@ -50274,7 +50603,7 @@
       <w:tr>
         <w:tc>
           <w:tcPr>
-            <w:tcW w:type="dxa" w:w="3316"/>
+            <w:tcW w:type="dxa" w:w="2878"/>
           </w:tcPr>
           <w:p>
             <w:pPr>
@@ -50291,7 +50620,7 @@
         </w:tc>
         <w:tc>
           <w:tcPr>
-            <w:tcW w:type="dxa" w:w="3044"/>
+            <w:tcW w:type="dxa" w:w="3455"/>
           </w:tcPr>
           <w:p>
             <w:pPr>
@@ -50308,7 +50637,7 @@
         </w:tc>
         <w:tc>
           <w:tcPr>
-            <w:tcW w:type="dxa" w:w="2712"/>
+            <w:tcW w:type="dxa" w:w="2739"/>
           </w:tcPr>
           <w:p>
             <w:pPr>
@@ -50327,7 +50656,7 @@
       <w:tr>
         <w:tc>
           <w:tcPr>
-            <w:tcW w:type="dxa" w:w="3316"/>
+            <w:tcW w:type="dxa" w:w="2878"/>
           </w:tcPr>
           <w:p>
             <w:pPr>
@@ -50344,7 +50673,7 @@
         </w:tc>
         <w:tc>
           <w:tcPr>
-            <w:tcW w:type="dxa" w:w="3044"/>
+            <w:tcW w:type="dxa" w:w="3455"/>
           </w:tcPr>
           <w:p>
             <w:pPr>
@@ -50361,7 +50690,7 @@
         </w:tc>
         <w:tc>
           <w:tcPr>
-            <w:tcW w:type="dxa" w:w="2712"/>
+            <w:tcW w:type="dxa" w:w="2739"/>
           </w:tcPr>
           <w:p>
             <w:pPr>
@@ -50380,7 +50709,7 @@
       <w:tr>
         <w:tc>
           <w:tcPr>
-            <w:tcW w:type="dxa" w:w="3316"/>
+            <w:tcW w:type="dxa" w:w="2878"/>
           </w:tcPr>
           <w:p>
             <w:pPr>
@@ -50397,7 +50726,7 @@
         </w:tc>
         <w:tc>
           <w:tcPr>
-            <w:tcW w:type="dxa" w:w="3044"/>
+            <w:tcW w:type="dxa" w:w="3455"/>
           </w:tcPr>
           <w:p>
             <w:pPr>
@@ -50414,7 +50743,7 @@
         </w:tc>
         <w:tc>
           <w:tcPr>
-            <w:tcW w:type="dxa" w:w="2712"/>
+            <w:tcW w:type="dxa" w:w="2739"/>
           </w:tcPr>
           <w:p>
             <w:pPr>
@@ -50433,7 +50762,7 @@
       <w:tr>
         <w:tc>
           <w:tcPr>
-            <w:tcW w:type="dxa" w:w="3316"/>
+            <w:tcW w:type="dxa" w:w="2878"/>
           </w:tcPr>
           <w:p>
             <w:pPr>
@@ -50450,7 +50779,7 @@
         </w:tc>
         <w:tc>
           <w:tcPr>
-            <w:tcW w:type="dxa" w:w="3044"/>
+            <w:tcW w:type="dxa" w:w="3455"/>
           </w:tcPr>
           <w:p>
             <w:pPr>
@@ -50467,7 +50796,7 @@
         </w:tc>
         <w:tc>
           <w:tcPr>
-            <w:tcW w:type="dxa" w:w="2712"/>
+            <w:tcW w:type="dxa" w:w="2739"/>
           </w:tcPr>
           <w:p>
             <w:pPr>
@@ -50486,7 +50815,7 @@
       <w:tr>
         <w:tc>
           <w:tcPr>
-            <w:tcW w:type="dxa" w:w="3316"/>
+            <w:tcW w:type="dxa" w:w="2878"/>
           </w:tcPr>
           <w:p>
             <w:pPr>
@@ -50503,7 +50832,7 @@
         </w:tc>
         <w:tc>
           <w:tcPr>
-            <w:tcW w:type="dxa" w:w="3044"/>
+            <w:tcW w:type="dxa" w:w="3455"/>
           </w:tcPr>
           <w:p>
             <w:pPr>
@@ -50520,7 +50849,7 @@
         </w:tc>
         <w:tc>
           <w:tcPr>
-            <w:tcW w:type="dxa" w:w="2712"/>
+            <w:tcW w:type="dxa" w:w="2739"/>
           </w:tcPr>
           <w:p>
             <w:pPr>
@@ -50536,7 +50865,201 @@
           </w:p>
         </w:tc>
       </w:tr>
+      <w:tr>
+        <w:tc>
+          <w:tcPr>
+            <w:tcW w:type="dxa" w:w="2878"/>
+          </w:tcPr>
+          <w:p>
+            <w:pPr>
+              <w:pStyle w:val="Compact"/>
+              <w:spacing w:after="0" w:line="264" w:lineRule="auto"/>
+            </w:pPr>
+            <w:r>
+              <w:rPr>
+                <w:sz w:val="16"/>
+              </w:rPr>
+              <w:t xml:space="preserve">MLflow (</w:t>
+            </w:r>
+            <w:r>
+              <w:rPr>
+                <w:rStyle w:val="VerbatimChar"/>
+                <w:sz w:val="16"/>
+              </w:rPr>
+              <w:t xml:space="preserve">ml</w:t>
+            </w:r>
+            <w:r>
+              <w:rPr>
+                <w:sz w:val="16"/>
+              </w:rPr>
+              <w:t xml:space="preserve">)</w:t>
+            </w:r>
+          </w:p>
+        </w:tc>
+        <w:tc>
+          <w:tcPr>
+            <w:tcW w:type="dxa" w:w="3455"/>
+          </w:tcPr>
+          <w:p>
+            <w:pPr>
+              <w:pStyle w:val="Compact"/>
+              <w:spacing w:after="0" w:line="264" w:lineRule="auto"/>
+            </w:pPr>
+            <w:r>
+              <w:rPr>
+                <w:sz w:val="16"/>
+              </w:rPr>
+              <w:t xml:space="preserve">평가 실행 추적 —</w:t>
+            </w:r>
+            <w:r>
+              <w:rPr>
+                <w:sz w:val="16"/>
+              </w:rPr>
+              <w:t xml:space="preserve"> </w:t>
+            </w:r>
+            <w:r>
+              <w:rPr>
+                <w:rStyle w:val="VerbatimChar"/>
+                <w:sz w:val="16"/>
+              </w:rPr>
+              <w:t xml:space="preserve">make mlflow-sync</w:t>
+            </w:r>
+          </w:p>
+        </w:tc>
+        <w:tc>
+          <w:tcPr>
+            <w:tcW w:type="dxa" w:w="2739"/>
+          </w:tcPr>
+          <w:p>
+            <w:pPr>
+              <w:pStyle w:val="Compact"/>
+              <w:spacing w:after="0" w:line="264" w:lineRule="auto"/>
+            </w:pPr>
+            <w:r>
+              <w:rPr>
+                <w:sz w:val="16"/>
+              </w:rPr>
+              <w:t xml:space="preserve">연결 · 로컬만 (D-0224)</w:t>
+            </w:r>
+          </w:p>
+        </w:tc>
+      </w:tr>
+      <w:tr>
+        <w:tc>
+          <w:tcPr>
+            <w:tcW w:type="dxa" w:w="2878"/>
+          </w:tcPr>
+          <w:p>
+            <w:pPr>
+              <w:pStyle w:val="Compact"/>
+              <w:spacing w:after="0" w:line="264" w:lineRule="auto"/>
+            </w:pPr>
+            <w:r>
+              <w:rPr>
+                <w:sz w:val="16"/>
+              </w:rPr>
+              <w:t xml:space="preserve">Prefect (</w:t>
+            </w:r>
+            <w:r>
+              <w:rPr>
+                <w:rStyle w:val="VerbatimChar"/>
+                <w:sz w:val="16"/>
+              </w:rPr>
+              <w:t xml:space="preserve">ml</w:t>
+            </w:r>
+            <w:r>
+              <w:rPr>
+                <w:sz w:val="16"/>
+              </w:rPr>
+              <w:t xml:space="preserve">)</w:t>
+            </w:r>
+          </w:p>
+        </w:tc>
+        <w:tc>
+          <w:tcPr>
+            <w:tcW w:type="dxa" w:w="3455"/>
+          </w:tcPr>
+          <w:p>
+            <w:pPr>
+              <w:pStyle w:val="Compact"/>
+              <w:spacing w:after="0" w:line="264" w:lineRule="auto"/>
+            </w:pPr>
+            <w:r>
+              <w:rPr>
+                <w:sz w:val="16"/>
+              </w:rPr>
+              <w:t xml:space="preserve">인제스트 → 평가 흐름 —</w:t>
+            </w:r>
+            <w:r>
+              <w:rPr>
+                <w:sz w:val="16"/>
+              </w:rPr>
+              <w:t xml:space="preserve"> </w:t>
+            </w:r>
+            <w:r>
+              <w:rPr>
+                <w:rStyle w:val="VerbatimChar"/>
+                <w:sz w:val="16"/>
+              </w:rPr>
+              <w:t xml:space="preserve">make flow</w:t>
+            </w:r>
+          </w:p>
+        </w:tc>
+        <w:tc>
+          <w:tcPr>
+            <w:tcW w:type="dxa" w:w="2739"/>
+          </w:tcPr>
+          <w:p>
+            <w:pPr>
+              <w:pStyle w:val="Compact"/>
+              <w:spacing w:after="0" w:line="264" w:lineRule="auto"/>
+            </w:pPr>
+            <w:r>
+              <w:rPr>
+                <w:sz w:val="16"/>
+              </w:rPr>
+              <w:t xml:space="preserve">연결 · 로컬만 (D-0224)</w:t>
+            </w:r>
+          </w:p>
+        </w:tc>
+      </w:tr>
     </w:tbl>
+    <w:p>
+      <w:pPr>
+        <w:pStyle w:val="BodyText"/>
+      </w:pPr>
+      <w:r>
+        <w:rPr>
+          <w:b/>
+          <w:bCs/>
+        </w:rPr>
+        <w:t xml:space="preserve">MLflow · Prefect는 보는 창이다.</w:t>
+      </w:r>
+      <w:r>
+        <w:t xml:space="preserve"> </w:t>
+      </w:r>
+      <w:r>
+        <w:t xml:space="preserve">평가의 정본은</w:t>
+      </w:r>
+      <w:r>
+        <w:t xml:space="preserve"> </w:t>
+      </w:r>
+      <w:r>
+        <w:rPr>
+          <w:rStyle w:val="VerbatimChar"/>
+        </w:rPr>
+        <w:t xml:space="preserve">var/ingest/eval/*.eval.json</w:t>
+      </w:r>
+      <w:r>
+        <w:t xml:space="preserve">이고, 흐름은</w:t>
+      </w:r>
+      <w:r>
+        <w:t xml:space="preserve"> </w:t>
+      </w:r>
+      <w:r>
+        <w:t xml:space="preserve">이미 있는 CLI를 차례로 부를 뿐이다. 둘을 지워도 결과는 그대로 선다.</w:t>
+      </w:r>
+    </w:p>
     <w:bookmarkEnd w:id="196"/>
     <w:bookmarkStart w:id="197" w:name="ci-구성"/>
     <w:p>
@@ -50563,8 +51086,8 @@
         <w:tblLook w:firstRow="1" w:lastRow="0" w:firstColumn="0" w:lastColumn="0" w:noHBand="0" w:noVBand="0" w:val="0020"/>
       </w:tblPr>
       <w:tblGrid>
-        <w:gridCol w:w="2835"/>
-        <w:gridCol w:w="6236"/>
+        <w:gridCol w:w="2750"/>
+        <w:gridCol w:w="6321"/>
       </w:tblGrid>
       <w:tr>
         <w:trPr>
@@ -50572,7 +51095,7 @@
         </w:trPr>
         <w:tc>
           <w:tcPr>
-            <w:tcW w:type="dxa" w:w="2835"/>
+            <w:tcW w:type="dxa" w:w="2750"/>
             <w:shd w:val="clear" w:color="auto" w:fill="E8EEF5"/>
           </w:tcPr>
           <w:p>
@@ -50592,7 +51115,7 @@
         </w:tc>
         <w:tc>
           <w:tcPr>
-            <w:tcW w:type="dxa" w:w="6237"/>
+            <w:tcW w:type="dxa" w:w="6322"/>
             <w:shd w:val="clear" w:color="auto" w:fill="E8EEF5"/>
           </w:tcPr>
           <w:p>
@@ -50614,7 +51137,7 @@
       <w:tr>
         <w:tc>
           <w:tcPr>
-            <w:tcW w:type="dxa" w:w="2835"/>
+            <w:tcW w:type="dxa" w:w="2750"/>
           </w:tcPr>
           <w:p>
             <w:pPr>
@@ -50631,7 +51154,7 @@
         </w:tc>
         <w:tc>
           <w:tcPr>
-            <w:tcW w:type="dxa" w:w="6237"/>
+            <w:tcW w:type="dxa" w:w="6322"/>
           </w:tcPr>
           <w:p>
             <w:pPr>
@@ -50650,7 +51173,7 @@
       <w:tr>
         <w:tc>
           <w:tcPr>
-            <w:tcW w:type="dxa" w:w="2835"/>
+            <w:tcW w:type="dxa" w:w="2750"/>
           </w:tcPr>
           <w:p>
             <w:pPr>
@@ -50667,7 +51190,7 @@
         </w:tc>
         <w:tc>
           <w:tcPr>
-            <w:tcW w:type="dxa" w:w="6237"/>
+            <w:tcW w:type="dxa" w:w="6322"/>
           </w:tcPr>
           <w:p>
             <w:pPr>
@@ -50686,7 +51209,7 @@
       <w:tr>
         <w:tc>
           <w:tcPr>
-            <w:tcW w:type="dxa" w:w="2835"/>
+            <w:tcW w:type="dxa" w:w="2750"/>
           </w:tcPr>
           <w:p>
             <w:pPr>
@@ -50703,7 +51226,7 @@
         </w:tc>
         <w:tc>
           <w:tcPr>
-            <w:tcW w:type="dxa" w:w="6237"/>
+            <w:tcW w:type="dxa" w:w="6322"/>
           </w:tcPr>
           <w:p>
             <w:pPr>
@@ -50722,7 +51245,7 @@
       <w:tr>
         <w:tc>
           <w:tcPr>
-            <w:tcW w:type="dxa" w:w="2835"/>
+            <w:tcW w:type="dxa" w:w="2750"/>
           </w:tcPr>
           <w:p>
             <w:pPr>
@@ -50753,7 +51276,7 @@
         </w:tc>
         <w:tc>
           <w:tcPr>
-            <w:tcW w:type="dxa" w:w="6237"/>
+            <w:tcW w:type="dxa" w:w="6322"/>
           </w:tcPr>
           <w:p>
             <w:pPr>
@@ -50779,7 +51302,7 @@
       <w:tr>
         <w:tc>
           <w:tcPr>
-            <w:tcW w:type="dxa" w:w="2835"/>
+            <w:tcW w:type="dxa" w:w="2750"/>
           </w:tcPr>
           <w:p>
             <w:pPr>
@@ -50798,7 +51321,7 @@
         </w:tc>
         <w:tc>
           <w:tcPr>
-            <w:tcW w:type="dxa" w:w="6237"/>
+            <w:tcW w:type="dxa" w:w="6322"/>
           </w:tcPr>
           <w:p>
             <w:pPr>
@@ -50849,7 +51372,7 @@
       <w:tr>
         <w:tc>
           <w:tcPr>
-            <w:tcW w:type="dxa" w:w="2835"/>
+            <w:tcW w:type="dxa" w:w="2750"/>
           </w:tcPr>
           <w:p>
             <w:pPr>
@@ -50866,7 +51389,7 @@
         </w:tc>
         <w:tc>
           <w:tcPr>
-            <w:tcW w:type="dxa" w:w="6237"/>
+            <w:tcW w:type="dxa" w:w="6322"/>
           </w:tcPr>
           <w:p>
             <w:pPr>
@@ -50891,6 +51414,70 @@
                 <w:sz w:val="16"/>
               </w:rPr>
               <w:t xml:space="preserve">) · GitHub Actions 주 1회 묶음 제안. GPU 묶음은 주 버전 자동 상향 안 함 (D-0223)</w:t>
+            </w:r>
+          </w:p>
+        </w:tc>
+      </w:tr>
+      <w:tr>
+        <w:tc>
+          <w:tcPr>
+            <w:tcW w:type="dxa" w:w="2750"/>
+          </w:tcPr>
+          <w:p>
+            <w:pPr>
+              <w:pStyle w:val="Compact"/>
+              <w:spacing w:after="0" w:line="264" w:lineRule="auto"/>
+            </w:pPr>
+            <w:r>
+              <w:rPr>
+                <w:b/>
+                <w:bCs/>
+                <w:sz w:val="16"/>
+              </w:rPr>
+              <w:t xml:space="preserve">gpu-smoke</w:t>
+            </w:r>
+          </w:p>
+        </w:tc>
+        <w:tc>
+          <w:tcPr>
+            <w:tcW w:type="dxa" w:w="6322"/>
+          </w:tcPr>
+          <w:p>
+            <w:pPr>
+              <w:pStyle w:val="Compact"/>
+              <w:spacing w:after="0" w:line="264" w:lineRule="auto"/>
+            </w:pPr>
+            <w:r>
+              <w:rPr>
+                <w:sz w:val="16"/>
+              </w:rPr>
+              <w:t xml:space="preserve">셀프호스티드 러너(GTX 1660 Ti)에서</w:t>
+            </w:r>
+            <w:r>
+              <w:rPr>
+                <w:sz w:val="16"/>
+              </w:rPr>
+              <w:t xml:space="preserve"> </w:t>
+            </w:r>
+            <w:r>
+              <w:rPr>
+                <w:b/>
+                <w:bCs/>
+                <w:sz w:val="16"/>
+              </w:rPr>
+              <w:t xml:space="preserve">손으로만.</w:t>
+            </w:r>
+            <w:r>
+              <w:rPr>
+                <w:sz w:val="16"/>
+              </w:rPr>
+              <w:t xml:space="preserve"> </w:t>
+            </w:r>
+            <w:r>
+              <w:rPr>
+                <w:sz w:val="16"/>
+              </w:rPr>
+              <w:t xml:space="preserve">드라이버 · 환경 · 엔진 재개 조건(VRAM · bf16) 판정. push · PR에 걸면 시험이 빨개진다 (D-0224)</w:t>
             </w:r>
           </w:p>
         </w:tc>

</xml_diff>

<commit_message>
tools+ci: make sync 하나 · 봇 월 1회 · tidy · 워크플로 린트 (D-0225)
</commit_message>
<xml_diff>
--- a/docs/proposal.docx
+++ b/docs/proposal.docx
@@ -48890,8 +48890,8 @@
         <w:tblLook w:firstRow="1" w:lastRow="0" w:firstColumn="0" w:lastColumn="0" w:noHBand="0" w:noVBand="0" w:val="0020"/>
       </w:tblPr>
       <w:tblGrid>
-        <w:gridCol w:w="1816"/>
-        <w:gridCol w:w="7255"/>
+        <w:gridCol w:w="1715"/>
+        <w:gridCol w:w="7356"/>
       </w:tblGrid>
       <w:tr>
         <w:trPr>
@@ -48899,7 +48899,7 @@
         </w:trPr>
         <w:tc>
           <w:tcPr>
-            <w:tcW w:type="dxa" w:w="1817"/>
+            <w:tcW w:type="dxa" w:w="1716"/>
             <w:shd w:val="clear" w:color="auto" w:fill="E8EEF5"/>
           </w:tcPr>
           <w:p>
@@ -48919,7 +48919,7 @@
         </w:tc>
         <w:tc>
           <w:tcPr>
-            <w:tcW w:type="dxa" w:w="7255"/>
+            <w:tcW w:type="dxa" w:w="7356"/>
             <w:shd w:val="clear" w:color="auto" w:fill="E8EEF5"/>
           </w:tcPr>
           <w:p>
@@ -48941,7 +48941,7 @@
       <w:tr>
         <w:tc>
           <w:tcPr>
-            <w:tcW w:type="dxa" w:w="1817"/>
+            <w:tcW w:type="dxa" w:w="1716"/>
           </w:tcPr>
           <w:p>
             <w:pPr>
@@ -48958,7 +48958,7 @@
         </w:tc>
         <w:tc>
           <w:tcPr>
-            <w:tcW w:type="dxa" w:w="7255"/>
+            <w:tcW w:type="dxa" w:w="7356"/>
           </w:tcPr>
           <w:p>
             <w:pPr>
@@ -48977,7 +48977,7 @@
       <w:tr>
         <w:tc>
           <w:tcPr>
-            <w:tcW w:type="dxa" w:w="1817"/>
+            <w:tcW w:type="dxa" w:w="1716"/>
           </w:tcPr>
           <w:p>
             <w:pPr>
@@ -48994,7 +48994,7 @@
         </w:tc>
         <w:tc>
           <w:tcPr>
-            <w:tcW w:type="dxa" w:w="7255"/>
+            <w:tcW w:type="dxa" w:w="7356"/>
           </w:tcPr>
           <w:p>
             <w:pPr>
@@ -49032,7 +49032,7 @@
       <w:tr>
         <w:tc>
           <w:tcPr>
-            <w:tcW w:type="dxa" w:w="1817"/>
+            <w:tcW w:type="dxa" w:w="1716"/>
           </w:tcPr>
           <w:p>
             <w:pPr>
@@ -49049,7 +49049,7 @@
         </w:tc>
         <w:tc>
           <w:tcPr>
-            <w:tcW w:type="dxa" w:w="7255"/>
+            <w:tcW w:type="dxa" w:w="7356"/>
           </w:tcPr>
           <w:p>
             <w:pPr>
@@ -49075,13 +49075,50 @@
               </w:rPr>
               <w:t xml:space="preserve">uv.lock</w:t>
             </w:r>
-          </w:p>
-        </w:tc>
-      </w:tr>
-      <w:tr>
-        <w:tc>
-          <w:tcPr>
-            <w:tcW w:type="dxa" w:w="1817"/>
+            <w:r>
+              <w:rPr>
+                <w:sz w:val="16"/>
+              </w:rPr>
+              <w:t xml:space="preserve"> </w:t>
+            </w:r>
+            <w:r>
+              <w:rPr>
+                <w:sz w:val="16"/>
+              </w:rPr>
+              <w:t xml:space="preserve">· 환경은</w:t>
+            </w:r>
+            <w:r>
+              <w:rPr>
+                <w:sz w:val="16"/>
+              </w:rPr>
+              <w:t xml:space="preserve"> </w:t>
+            </w:r>
+            <w:r>
+              <w:rPr>
+                <w:rStyle w:val="VerbatimChar"/>
+                <w:sz w:val="16"/>
+              </w:rPr>
+              <w:t xml:space="preserve">make sync</w:t>
+            </w:r>
+            <w:r>
+              <w:rPr>
+                <w:sz w:val="16"/>
+              </w:rPr>
+              <w:t xml:space="preserve"> </w:t>
+            </w:r>
+            <w:r>
+              <w:rPr>
+                <w:sz w:val="16"/>
+              </w:rPr>
+              <w:t xml:space="preserve">하나 — 묶음을 골라 치면 나머지가 지워진다 (D-0225)</w:t>
+            </w:r>
+          </w:p>
+        </w:tc>
+      </w:tr>
+      <w:tr>
+        <w:tc>
+          <w:tcPr>
+            <w:tcW w:type="dxa" w:w="1716"/>
           </w:tcPr>
           <w:p>
             <w:pPr>
@@ -49098,7 +49135,7 @@
         </w:tc>
         <w:tc>
           <w:tcPr>
-            <w:tcW w:type="dxa" w:w="7255"/>
+            <w:tcW w:type="dxa" w:w="7356"/>
           </w:tcPr>
           <w:p>
             <w:pPr>
@@ -49130,7 +49167,7 @@
       <w:tr>
         <w:tc>
           <w:tcPr>
-            <w:tcW w:type="dxa" w:w="1817"/>
+            <w:tcW w:type="dxa" w:w="1716"/>
           </w:tcPr>
           <w:p>
             <w:pPr>
@@ -49147,7 +49184,7 @@
         </w:tc>
         <w:tc>
           <w:tcPr>
-            <w:tcW w:type="dxa" w:w="7255"/>
+            <w:tcW w:type="dxa" w:w="7356"/>
           </w:tcPr>
           <w:p>
             <w:pPr>
@@ -49192,7 +49229,7 @@
       <w:tr>
         <w:tc>
           <w:tcPr>
-            <w:tcW w:type="dxa" w:w="1817"/>
+            <w:tcW w:type="dxa" w:w="1716"/>
           </w:tcPr>
           <w:p>
             <w:pPr>
@@ -49209,7 +49246,7 @@
         </w:tc>
         <w:tc>
           <w:tcPr>
-            <w:tcW w:type="dxa" w:w="7255"/>
+            <w:tcW w:type="dxa" w:w="7356"/>
           </w:tcPr>
           <w:p>
             <w:pPr>
@@ -49412,9 +49449,9 @@
         <w:tblLook w:firstRow="1" w:lastRow="0" w:firstColumn="0" w:lastColumn="0" w:noHBand="0" w:noVBand="0" w:val="0020"/>
       </w:tblPr>
       <w:tblGrid>
-        <w:gridCol w:w="1636"/>
-        <w:gridCol w:w="4987"/>
-        <w:gridCol w:w="2447"/>
+        <w:gridCol w:w="1574"/>
+        <w:gridCol w:w="5064"/>
+        <w:gridCol w:w="2433"/>
       </w:tblGrid>
       <w:tr>
         <w:trPr>
@@ -49422,7 +49459,7 @@
         </w:trPr>
         <w:tc>
           <w:tcPr>
-            <w:tcW w:type="dxa" w:w="1637"/>
+            <w:tcW w:type="dxa" w:w="1574"/>
             <w:shd w:val="clear" w:color="auto" w:fill="E8EEF5"/>
           </w:tcPr>
           <w:p>
@@ -49442,7 +49479,7 @@
         </w:tc>
         <w:tc>
           <w:tcPr>
-            <w:tcW w:type="dxa" w:w="4987"/>
+            <w:tcW w:type="dxa" w:w="5064"/>
             <w:shd w:val="clear" w:color="auto" w:fill="E8EEF5"/>
           </w:tcPr>
           <w:p>
@@ -49462,7 +49499,7 @@
         </w:tc>
         <w:tc>
           <w:tcPr>
-            <w:tcW w:type="dxa" w:w="2448"/>
+            <w:tcW w:type="dxa" w:w="2434"/>
             <w:shd w:val="clear" w:color="auto" w:fill="E8EEF5"/>
           </w:tcPr>
           <w:p>
@@ -49484,7 +49521,7 @@
       <w:tr>
         <w:tc>
           <w:tcPr>
-            <w:tcW w:type="dxa" w:w="1637"/>
+            <w:tcW w:type="dxa" w:w="1574"/>
           </w:tcPr>
           <w:p>
             <w:pPr>
@@ -49501,7 +49538,7 @@
         </w:tc>
         <w:tc>
           <w:tcPr>
-            <w:tcW w:type="dxa" w:w="4987"/>
+            <w:tcW w:type="dxa" w:w="5064"/>
           </w:tcPr>
           <w:p>
             <w:pPr>
@@ -49518,7 +49555,7 @@
         </w:tc>
         <w:tc>
           <w:tcPr>
-            <w:tcW w:type="dxa" w:w="2448"/>
+            <w:tcW w:type="dxa" w:w="2434"/>
           </w:tcPr>
           <w:p>
             <w:pPr>
@@ -49537,7 +49574,7 @@
       <w:tr>
         <w:tc>
           <w:tcPr>
-            <w:tcW w:type="dxa" w:w="1637"/>
+            <w:tcW w:type="dxa" w:w="1574"/>
           </w:tcPr>
           <w:p>
             <w:pPr>
@@ -49554,7 +49591,7 @@
         </w:tc>
         <w:tc>
           <w:tcPr>
-            <w:tcW w:type="dxa" w:w="4987"/>
+            <w:tcW w:type="dxa" w:w="5064"/>
           </w:tcPr>
           <w:p>
             <w:pPr>
@@ -49571,7 +49608,7 @@
         </w:tc>
         <w:tc>
           <w:tcPr>
-            <w:tcW w:type="dxa" w:w="2448"/>
+            <w:tcW w:type="dxa" w:w="2434"/>
           </w:tcPr>
           <w:p>
             <w:pPr>
@@ -49590,7 +49627,7 @@
       <w:tr>
         <w:tc>
           <w:tcPr>
-            <w:tcW w:type="dxa" w:w="1637"/>
+            <w:tcW w:type="dxa" w:w="1574"/>
           </w:tcPr>
           <w:p>
             <w:pPr>
@@ -49607,7 +49644,7 @@
         </w:tc>
         <w:tc>
           <w:tcPr>
-            <w:tcW w:type="dxa" w:w="4987"/>
+            <w:tcW w:type="dxa" w:w="5064"/>
           </w:tcPr>
           <w:p>
             <w:pPr>
@@ -49624,7 +49661,7 @@
         </w:tc>
         <w:tc>
           <w:tcPr>
-            <w:tcW w:type="dxa" w:w="2448"/>
+            <w:tcW w:type="dxa" w:w="2434"/>
           </w:tcPr>
           <w:p>
             <w:pPr>
@@ -49643,7 +49680,7 @@
       <w:tr>
         <w:tc>
           <w:tcPr>
-            <w:tcW w:type="dxa" w:w="1637"/>
+            <w:tcW w:type="dxa" w:w="1574"/>
           </w:tcPr>
           <w:p>
             <w:pPr>
@@ -49660,7 +49697,7 @@
         </w:tc>
         <w:tc>
           <w:tcPr>
-            <w:tcW w:type="dxa" w:w="4987"/>
+            <w:tcW w:type="dxa" w:w="5064"/>
           </w:tcPr>
           <w:p>
             <w:pPr>
@@ -49677,7 +49714,7 @@
         </w:tc>
         <w:tc>
           <w:tcPr>
-            <w:tcW w:type="dxa" w:w="2448"/>
+            <w:tcW w:type="dxa" w:w="2434"/>
           </w:tcPr>
           <w:p>
             <w:pPr>
@@ -49696,7 +49733,7 @@
       <w:tr>
         <w:tc>
           <w:tcPr>
-            <w:tcW w:type="dxa" w:w="1637"/>
+            <w:tcW w:type="dxa" w:w="1574"/>
           </w:tcPr>
           <w:p>
             <w:pPr>
@@ -49713,7 +49750,7 @@
         </w:tc>
         <w:tc>
           <w:tcPr>
-            <w:tcW w:type="dxa" w:w="4987"/>
+            <w:tcW w:type="dxa" w:w="5064"/>
           </w:tcPr>
           <w:p>
             <w:pPr>
@@ -49730,7 +49767,7 @@
         </w:tc>
         <w:tc>
           <w:tcPr>
-            <w:tcW w:type="dxa" w:w="2448"/>
+            <w:tcW w:type="dxa" w:w="2434"/>
           </w:tcPr>
           <w:p>
             <w:pPr>
@@ -49749,7 +49786,7 @@
       <w:tr>
         <w:tc>
           <w:tcPr>
-            <w:tcW w:type="dxa" w:w="1637"/>
+            <w:tcW w:type="dxa" w:w="1574"/>
           </w:tcPr>
           <w:p>
             <w:pPr>
@@ -49766,7 +49803,7 @@
         </w:tc>
         <w:tc>
           <w:tcPr>
-            <w:tcW w:type="dxa" w:w="4987"/>
+            <w:tcW w:type="dxa" w:w="5064"/>
           </w:tcPr>
           <w:p>
             <w:pPr>
@@ -49783,7 +49820,7 @@
         </w:tc>
         <w:tc>
           <w:tcPr>
-            <w:tcW w:type="dxa" w:w="2448"/>
+            <w:tcW w:type="dxa" w:w="2434"/>
           </w:tcPr>
           <w:p>
             <w:pPr>
@@ -49802,7 +49839,7 @@
       <w:tr>
         <w:tc>
           <w:tcPr>
-            <w:tcW w:type="dxa" w:w="1637"/>
+            <w:tcW w:type="dxa" w:w="1574"/>
           </w:tcPr>
           <w:p>
             <w:pPr>
@@ -49819,7 +49856,7 @@
         </w:tc>
         <w:tc>
           <w:tcPr>
-            <w:tcW w:type="dxa" w:w="4987"/>
+            <w:tcW w:type="dxa" w:w="5064"/>
           </w:tcPr>
           <w:p>
             <w:pPr>
@@ -49836,7 +49873,7 @@
         </w:tc>
         <w:tc>
           <w:tcPr>
-            <w:tcW w:type="dxa" w:w="2448"/>
+            <w:tcW w:type="dxa" w:w="2434"/>
           </w:tcPr>
           <w:p>
             <w:pPr>
@@ -49855,7 +49892,7 @@
       <w:tr>
         <w:tc>
           <w:tcPr>
-            <w:tcW w:type="dxa" w:w="1637"/>
+            <w:tcW w:type="dxa" w:w="1574"/>
           </w:tcPr>
           <w:p>
             <w:pPr>
@@ -49872,7 +49909,7 @@
         </w:tc>
         <w:tc>
           <w:tcPr>
-            <w:tcW w:type="dxa" w:w="4987"/>
+            <w:tcW w:type="dxa" w:w="5064"/>
           </w:tcPr>
           <w:p>
             <w:pPr>
@@ -49889,7 +49926,7 @@
         </w:tc>
         <w:tc>
           <w:tcPr>
-            <w:tcW w:type="dxa" w:w="2448"/>
+            <w:tcW w:type="dxa" w:w="2434"/>
           </w:tcPr>
           <w:p>
             <w:pPr>
@@ -49908,7 +49945,7 @@
       <w:tr>
         <w:tc>
           <w:tcPr>
-            <w:tcW w:type="dxa" w:w="1637"/>
+            <w:tcW w:type="dxa" w:w="1574"/>
           </w:tcPr>
           <w:p>
             <w:pPr>
@@ -49925,7 +49962,7 @@
         </w:tc>
         <w:tc>
           <w:tcPr>
-            <w:tcW w:type="dxa" w:w="4987"/>
+            <w:tcW w:type="dxa" w:w="5064"/>
           </w:tcPr>
           <w:p>
             <w:pPr>
@@ -49942,7 +49979,7 @@
         </w:tc>
         <w:tc>
           <w:tcPr>
-            <w:tcW w:type="dxa" w:w="2448"/>
+            <w:tcW w:type="dxa" w:w="2434"/>
           </w:tcPr>
           <w:p>
             <w:pPr>
@@ -49961,7 +49998,7 @@
       <w:tr>
         <w:tc>
           <w:tcPr>
-            <w:tcW w:type="dxa" w:w="1637"/>
+            <w:tcW w:type="dxa" w:w="1574"/>
           </w:tcPr>
           <w:p>
             <w:pPr>
@@ -49978,43 +50015,43 @@
         </w:tc>
         <w:tc>
           <w:tcPr>
-            <w:tcW w:type="dxa" w:w="4987"/>
-          </w:tcPr>
-          <w:p>
-            <w:pPr>
-              <w:pStyle w:val="Compact"/>
-              <w:spacing w:after="0" w:line="264" w:lineRule="auto"/>
-            </w:pPr>
-            <w:r>
-              <w:rPr>
-                <w:sz w:val="16"/>
-              </w:rPr>
-              <w:t xml:space="preserve">ruff · mypy strict · 시험 코드 타입 래칫</w:t>
-            </w:r>
-          </w:p>
-        </w:tc>
-        <w:tc>
-          <w:tcPr>
-            <w:tcW w:type="dxa" w:w="2448"/>
-          </w:tcPr>
-          <w:p>
-            <w:pPr>
-              <w:pStyle w:val="Compact"/>
-              <w:spacing w:after="0" w:line="264" w:lineRule="auto"/>
-            </w:pPr>
-            <w:r>
-              <w:rPr>
-                <w:sz w:val="16"/>
-              </w:rPr>
-              <w:t xml:space="preserve">D-0149 · D-0150</w:t>
-            </w:r>
-          </w:p>
-        </w:tc>
-      </w:tr>
-      <w:tr>
-        <w:tc>
-          <w:tcPr>
-            <w:tcW w:type="dxa" w:w="1637"/>
+            <w:tcW w:type="dxa" w:w="5064"/>
+          </w:tcPr>
+          <w:p>
+            <w:pPr>
+              <w:pStyle w:val="Compact"/>
+              <w:spacing w:after="0" w:line="264" w:lineRule="auto"/>
+            </w:pPr>
+            <w:r>
+              <w:rPr>
+                <w:sz w:val="16"/>
+              </w:rPr>
+              <w:t xml:space="preserve">ruff · mypy strict · 시험 코드 타입 래칫 · 워크플로(actionlint) · 셸(shellcheck)</w:t>
+            </w:r>
+          </w:p>
+        </w:tc>
+        <w:tc>
+          <w:tcPr>
+            <w:tcW w:type="dxa" w:w="2434"/>
+          </w:tcPr>
+          <w:p>
+            <w:pPr>
+              <w:pStyle w:val="Compact"/>
+              <w:spacing w:after="0" w:line="264" w:lineRule="auto"/>
+            </w:pPr>
+            <w:r>
+              <w:rPr>
+                <w:sz w:val="16"/>
+              </w:rPr>
+              <w:t xml:space="preserve">D-0149 · D-0150 · D-0225</w:t>
+            </w:r>
+          </w:p>
+        </w:tc>
+      </w:tr>
+      <w:tr>
+        <w:tc>
+          <w:tcPr>
+            <w:tcW w:type="dxa" w:w="1574"/>
           </w:tcPr>
           <w:p>
             <w:pPr>
@@ -50031,7 +50068,7 @@
         </w:tc>
         <w:tc>
           <w:tcPr>
-            <w:tcW w:type="dxa" w:w="4987"/>
+            <w:tcW w:type="dxa" w:w="5064"/>
           </w:tcPr>
           <w:p>
             <w:pPr>
@@ -50048,7 +50085,7 @@
         </w:tc>
         <w:tc>
           <w:tcPr>
-            <w:tcW w:type="dxa" w:w="2448"/>
+            <w:tcW w:type="dxa" w:w="2434"/>
           </w:tcPr>
           <w:p>
             <w:pPr>
@@ -50067,7 +50104,7 @@
       <w:tr>
         <w:tc>
           <w:tcPr>
-            <w:tcW w:type="dxa" w:w="1637"/>
+            <w:tcW w:type="dxa" w:w="1574"/>
           </w:tcPr>
           <w:p>
             <w:pPr>
@@ -50084,7 +50121,7 @@
         </w:tc>
         <w:tc>
           <w:tcPr>
-            <w:tcW w:type="dxa" w:w="4987"/>
+            <w:tcW w:type="dxa" w:w="5064"/>
           </w:tcPr>
           <w:p>
             <w:pPr>
@@ -50126,7 +50163,7 @@
         </w:tc>
         <w:tc>
           <w:tcPr>
-            <w:tcW w:type="dxa" w:w="2448"/>
+            <w:tcW w:type="dxa" w:w="2434"/>
           </w:tcPr>
           <w:p>
             <w:pPr>
@@ -50228,7 +50265,7 @@
       <w:r>
         <w:drawing>
           <wp:inline>
-            <wp:extent cx="5334000" cy="6492805"/>
+            <wp:extent cx="5334000" cy="6848017"/>
             <wp:effectExtent b="0" l="0" r="0" t="0"/>
             <wp:docPr descr="make check · CI · 커밋 훅 대조 (실물에서 읽었다)" title="" id="189" name="Picture"/>
             <a:graphic>
@@ -50249,7 +50286,7 @@
                   <pic:spPr bwMode="auto">
                     <a:xfrm>
                       <a:off x="0" y="0"/>
-                      <a:ext cx="5334000" cy="6492805"/>
+                      <a:ext cx="5334000" cy="6848017"/>
                     </a:xfrm>
                     <a:prstGeom prst="rect">
                       <a:avLst/>
@@ -51086,8 +51123,8 @@
         <w:tblLook w:firstRow="1" w:lastRow="0" w:firstColumn="0" w:lastColumn="0" w:noHBand="0" w:noVBand="0" w:val="0020"/>
       </w:tblPr>
       <w:tblGrid>
-        <w:gridCol w:w="2750"/>
-        <w:gridCol w:w="6321"/>
+        <w:gridCol w:w="2699"/>
+        <w:gridCol w:w="6372"/>
       </w:tblGrid>
       <w:tr>
         <w:trPr>
@@ -51095,7 +51132,7 @@
         </w:trPr>
         <w:tc>
           <w:tcPr>
-            <w:tcW w:type="dxa" w:w="2750"/>
+            <w:tcW w:type="dxa" w:w="2700"/>
             <w:shd w:val="clear" w:color="auto" w:fill="E8EEF5"/>
           </w:tcPr>
           <w:p>
@@ -51115,7 +51152,7 @@
         </w:tc>
         <w:tc>
           <w:tcPr>
-            <w:tcW w:type="dxa" w:w="6322"/>
+            <w:tcW w:type="dxa" w:w="6372"/>
             <w:shd w:val="clear" w:color="auto" w:fill="E8EEF5"/>
           </w:tcPr>
           <w:p>
@@ -51137,7 +51174,7 @@
       <w:tr>
         <w:tc>
           <w:tcPr>
-            <w:tcW w:type="dxa" w:w="2750"/>
+            <w:tcW w:type="dxa" w:w="2700"/>
           </w:tcPr>
           <w:p>
             <w:pPr>
@@ -51154,7 +51191,7 @@
         </w:tc>
         <w:tc>
           <w:tcPr>
-            <w:tcW w:type="dxa" w:w="6322"/>
+            <w:tcW w:type="dxa" w:w="6372"/>
           </w:tcPr>
           <w:p>
             <w:pPr>
@@ -51173,7 +51210,7 @@
       <w:tr>
         <w:tc>
           <w:tcPr>
-            <w:tcW w:type="dxa" w:w="2750"/>
+            <w:tcW w:type="dxa" w:w="2700"/>
           </w:tcPr>
           <w:p>
             <w:pPr>
@@ -51190,7 +51227,7 @@
         </w:tc>
         <w:tc>
           <w:tcPr>
-            <w:tcW w:type="dxa" w:w="6322"/>
+            <w:tcW w:type="dxa" w:w="6372"/>
           </w:tcPr>
           <w:p>
             <w:pPr>
@@ -51209,7 +51246,7 @@
       <w:tr>
         <w:tc>
           <w:tcPr>
-            <w:tcW w:type="dxa" w:w="2750"/>
+            <w:tcW w:type="dxa" w:w="2700"/>
           </w:tcPr>
           <w:p>
             <w:pPr>
@@ -51226,7 +51263,7 @@
         </w:tc>
         <w:tc>
           <w:tcPr>
-            <w:tcW w:type="dxa" w:w="6322"/>
+            <w:tcW w:type="dxa" w:w="6372"/>
           </w:tcPr>
           <w:p>
             <w:pPr>
@@ -51245,7 +51282,7 @@
       <w:tr>
         <w:tc>
           <w:tcPr>
-            <w:tcW w:type="dxa" w:w="2750"/>
+            <w:tcW w:type="dxa" w:w="2700"/>
           </w:tcPr>
           <w:p>
             <w:pPr>
@@ -51276,7 +51313,7 @@
         </w:tc>
         <w:tc>
           <w:tcPr>
-            <w:tcW w:type="dxa" w:w="6322"/>
+            <w:tcW w:type="dxa" w:w="6372"/>
           </w:tcPr>
           <w:p>
             <w:pPr>
@@ -51302,7 +51339,7 @@
       <w:tr>
         <w:tc>
           <w:tcPr>
-            <w:tcW w:type="dxa" w:w="2750"/>
+            <w:tcW w:type="dxa" w:w="2700"/>
           </w:tcPr>
           <w:p>
             <w:pPr>
@@ -51321,7 +51358,7 @@
         </w:tc>
         <w:tc>
           <w:tcPr>
-            <w:tcW w:type="dxa" w:w="6322"/>
+            <w:tcW w:type="dxa" w:w="6372"/>
           </w:tcPr>
           <w:p>
             <w:pPr>
@@ -51372,7 +51409,7 @@
       <w:tr>
         <w:tc>
           <w:tcPr>
-            <w:tcW w:type="dxa" w:w="2750"/>
+            <w:tcW w:type="dxa" w:w="2700"/>
           </w:tcPr>
           <w:p>
             <w:pPr>
@@ -51389,7 +51426,7 @@
         </w:tc>
         <w:tc>
           <w:tcPr>
-            <w:tcW w:type="dxa" w:w="6322"/>
+            <w:tcW w:type="dxa" w:w="6372"/>
           </w:tcPr>
           <w:p>
             <w:pPr>
@@ -51413,34 +51450,85 @@
               <w:rPr>
                 <w:sz w:val="16"/>
               </w:rPr>
-              <w:t xml:space="preserve">) · GitHub Actions 주 1회 묶음 제안. GPU 묶음은 주 버전 자동 상향 안 함 (D-0223)</w:t>
-            </w:r>
-          </w:p>
-        </w:tc>
-      </w:tr>
-      <w:tr>
-        <w:tc>
-          <w:tcPr>
-            <w:tcW w:type="dxa" w:w="2750"/>
-          </w:tcPr>
-          <w:p>
-            <w:pPr>
-              <w:pStyle w:val="Compact"/>
-              <w:spacing w:after="0" w:line="264" w:lineRule="auto"/>
-            </w:pPr>
+              <w:t xml:space="preserve">) · GitHub Actions</w:t>
+            </w:r>
+            <w:r>
+              <w:rPr>
+                <w:sz w:val="16"/>
+              </w:rPr>
+              <w:t xml:space="preserve"> </w:t>
+            </w:r>
             <w:r>
               <w:rPr>
                 <w:b/>
                 <w:bCs/>
                 <w:sz w:val="16"/>
               </w:rPr>
+              <w:t xml:space="preserve">월 1회 · 생태계마다 PR 하나.</w:t>
+            </w:r>
+            <w:r>
+              <w:rPr>
+                <w:sz w:val="16"/>
+              </w:rPr>
+              <w:t xml:space="preserve"> </w:t>
+            </w:r>
+            <w:r>
+              <w:rPr>
+                <w:sz w:val="16"/>
+              </w:rPr>
+              <w:t xml:space="preserve">GPU 묶음은 주 버전 자동 상향 안 함. 로컬 찌꺼기는</w:t>
+            </w:r>
+            <w:r>
+              <w:rPr>
+                <w:sz w:val="16"/>
+              </w:rPr>
+              <w:t xml:space="preserve"> </w:t>
+            </w:r>
+            <w:r>
+              <w:rPr>
+                <w:rStyle w:val="VerbatimChar"/>
+                <w:sz w:val="16"/>
+              </w:rPr>
+              <w:t xml:space="preserve">make tidy</w:t>
+            </w:r>
+            <w:r>
+              <w:rPr>
+                <w:sz w:val="16"/>
+              </w:rPr>
+              <w:t xml:space="preserve"> </w:t>
+            </w:r>
+            <w:r>
+              <w:rPr>
+                <w:sz w:val="16"/>
+              </w:rPr>
+              <w:t xml:space="preserve">(D-0223 · D-0225)</w:t>
+            </w:r>
+          </w:p>
+        </w:tc>
+      </w:tr>
+      <w:tr>
+        <w:tc>
+          <w:tcPr>
+            <w:tcW w:type="dxa" w:w="2700"/>
+          </w:tcPr>
+          <w:p>
+            <w:pPr>
+              <w:pStyle w:val="Compact"/>
+              <w:spacing w:after="0" w:line="264" w:lineRule="auto"/>
+            </w:pPr>
+            <w:r>
+              <w:rPr>
+                <w:b/>
+                <w:bCs/>
+                <w:sz w:val="16"/>
+              </w:rPr>
               <w:t xml:space="preserve">gpu-smoke</w:t>
             </w:r>
           </w:p>
         </w:tc>
         <w:tc>
           <w:tcPr>
-            <w:tcW w:type="dxa" w:w="6322"/>
+            <w:tcW w:type="dxa" w:w="6372"/>
           </w:tcPr>
           <w:p>
             <w:pPr>

</xml_diff>

<commit_message>
feat: 상업 가능한 취향 축을 잴 길 — eval clap (O-68 · D-0231)
</commit_message>
<xml_diff>
--- a/docs/proposal.docx
+++ b/docs/proposal.docx
@@ -13542,12 +13542,12 @@
         <w:tblLook w:firstRow="1" w:lastRow="0" w:firstColumn="0" w:lastColumn="0" w:noHBand="0" w:noVBand="0" w:val="0020"/>
       </w:tblPr>
       <w:tblGrid>
-        <w:gridCol w:w="2146"/>
-        <w:gridCol w:w="2609"/>
-        <w:gridCol w:w="516"/>
-        <w:gridCol w:w="546"/>
-        <w:gridCol w:w="702"/>
-        <w:gridCol w:w="2551"/>
+        <w:gridCol w:w="2128"/>
+        <w:gridCol w:w="2567"/>
+        <w:gridCol w:w="513"/>
+        <w:gridCol w:w="542"/>
+        <w:gridCol w:w="698"/>
+        <w:gridCol w:w="2621"/>
       </w:tblGrid>
       <w:tr>
         <w:trPr>
@@ -13555,7 +13555,7 @@
         </w:trPr>
         <w:tc>
           <w:tcPr>
-            <w:tcW w:type="dxa" w:w="2146"/>
+            <w:tcW w:type="dxa" w:w="2128"/>
             <w:shd w:val="clear" w:color="auto" w:fill="E8EEF5"/>
           </w:tcPr>
           <w:p>
@@ -13575,7 +13575,7 @@
         </w:tc>
         <w:tc>
           <w:tcPr>
-            <w:tcW w:type="dxa" w:w="2609"/>
+            <w:tcW w:type="dxa" w:w="2567"/>
             <w:shd w:val="clear" w:color="auto" w:fill="E8EEF5"/>
           </w:tcPr>
           <w:p>
@@ -13595,7 +13595,7 @@
         </w:tc>
         <w:tc>
           <w:tcPr>
-            <w:tcW w:type="dxa" w:w="516"/>
+            <w:tcW w:type="dxa" w:w="514"/>
             <w:shd w:val="clear" w:color="auto" w:fill="E8EEF5"/>
           </w:tcPr>
           <w:p>
@@ -13615,7 +13615,7 @@
         </w:tc>
         <w:tc>
           <w:tcPr>
-            <w:tcW w:type="dxa" w:w="546"/>
+            <w:tcW w:type="dxa" w:w="542"/>
             <w:shd w:val="clear" w:color="auto" w:fill="E8EEF5"/>
           </w:tcPr>
           <w:p>
@@ -13635,7 +13635,7 @@
         </w:tc>
         <w:tc>
           <w:tcPr>
-            <w:tcW w:type="dxa" w:w="703"/>
+            <w:tcW w:type="dxa" w:w="699"/>
             <w:shd w:val="clear" w:color="auto" w:fill="E8EEF5"/>
           </w:tcPr>
           <w:p>
@@ -13655,7 +13655,7 @@
         </w:tc>
         <w:tc>
           <w:tcPr>
-            <w:tcW w:type="dxa" w:w="2551"/>
+            <w:tcW w:type="dxa" w:w="2621"/>
             <w:shd w:val="clear" w:color="auto" w:fill="E8EEF5"/>
           </w:tcPr>
           <w:p>
@@ -13677,7 +13677,7 @@
       <w:tr>
         <w:tc>
           <w:tcPr>
-            <w:tcW w:type="dxa" w:w="2146"/>
+            <w:tcW w:type="dxa" w:w="2128"/>
           </w:tcPr>
           <w:p>
             <w:pPr>
@@ -13694,7 +13694,7 @@
         </w:tc>
         <w:tc>
           <w:tcPr>
-            <w:tcW w:type="dxa" w:w="2609"/>
+            <w:tcW w:type="dxa" w:w="2567"/>
           </w:tcPr>
           <w:p>
             <w:pPr>
@@ -13711,7 +13711,7 @@
         </w:tc>
         <w:tc>
           <w:tcPr>
-            <w:tcW w:type="dxa" w:w="516"/>
+            <w:tcW w:type="dxa" w:w="514"/>
           </w:tcPr>
           <w:p>
             <w:pPr>
@@ -13728,7 +13728,7 @@
         </w:tc>
         <w:tc>
           <w:tcPr>
-            <w:tcW w:type="dxa" w:w="546"/>
+            <w:tcW w:type="dxa" w:w="542"/>
           </w:tcPr>
           <w:p>
             <w:pPr>
@@ -13745,7 +13745,7 @@
         </w:tc>
         <w:tc>
           <w:tcPr>
-            <w:tcW w:type="dxa" w:w="703"/>
+            <w:tcW w:type="dxa" w:w="699"/>
           </w:tcPr>
           <w:p>
             <w:pPr>
@@ -13762,7 +13762,7 @@
         </w:tc>
         <w:tc>
           <w:tcPr>
-            <w:tcW w:type="dxa" w:w="2551"/>
+            <w:tcW w:type="dxa" w:w="2621"/>
           </w:tcPr>
           <w:p>
             <w:pPr>
@@ -13781,7 +13781,7 @@
       <w:tr>
         <w:tc>
           <w:tcPr>
-            <w:tcW w:type="dxa" w:w="2146"/>
+            <w:tcW w:type="dxa" w:w="2128"/>
           </w:tcPr>
           <w:p>
             <w:pPr>
@@ -13798,7 +13798,7 @@
         </w:tc>
         <w:tc>
           <w:tcPr>
-            <w:tcW w:type="dxa" w:w="2609"/>
+            <w:tcW w:type="dxa" w:w="2567"/>
           </w:tcPr>
           <w:p>
             <w:pPr>
@@ -13815,7 +13815,7 @@
         </w:tc>
         <w:tc>
           <w:tcPr>
-            <w:tcW w:type="dxa" w:w="516"/>
+            <w:tcW w:type="dxa" w:w="514"/>
           </w:tcPr>
           <w:p>
             <w:pPr>
@@ -13832,7 +13832,7 @@
         </w:tc>
         <w:tc>
           <w:tcPr>
-            <w:tcW w:type="dxa" w:w="546"/>
+            <w:tcW w:type="dxa" w:w="542"/>
           </w:tcPr>
           <w:p>
             <w:pPr>
@@ -13849,7 +13849,7 @@
         </w:tc>
         <w:tc>
           <w:tcPr>
-            <w:tcW w:type="dxa" w:w="703"/>
+            <w:tcW w:type="dxa" w:w="699"/>
           </w:tcPr>
           <w:p>
             <w:pPr>
@@ -13866,7 +13866,7 @@
         </w:tc>
         <w:tc>
           <w:tcPr>
-            <w:tcW w:type="dxa" w:w="2551"/>
+            <w:tcW w:type="dxa" w:w="2621"/>
           </w:tcPr>
           <w:p>
             <w:pPr>
@@ -13885,7 +13885,7 @@
       <w:tr>
         <w:tc>
           <w:tcPr>
-            <w:tcW w:type="dxa" w:w="2146"/>
+            <w:tcW w:type="dxa" w:w="2128"/>
           </w:tcPr>
           <w:p>
             <w:pPr>
@@ -13902,7 +13902,7 @@
         </w:tc>
         <w:tc>
           <w:tcPr>
-            <w:tcW w:type="dxa" w:w="2609"/>
+            <w:tcW w:type="dxa" w:w="2567"/>
           </w:tcPr>
           <w:p>
             <w:pPr>
@@ -13919,7 +13919,7 @@
         </w:tc>
         <w:tc>
           <w:tcPr>
-            <w:tcW w:type="dxa" w:w="516"/>
+            <w:tcW w:type="dxa" w:w="514"/>
           </w:tcPr>
           <w:p>
             <w:pPr>
@@ -13936,7 +13936,7 @@
         </w:tc>
         <w:tc>
           <w:tcPr>
-            <w:tcW w:type="dxa" w:w="546"/>
+            <w:tcW w:type="dxa" w:w="542"/>
           </w:tcPr>
           <w:p>
             <w:pPr>
@@ -13953,7 +13953,7 @@
         </w:tc>
         <w:tc>
           <w:tcPr>
-            <w:tcW w:type="dxa" w:w="703"/>
+            <w:tcW w:type="dxa" w:w="699"/>
           </w:tcPr>
           <w:p>
             <w:pPr>
@@ -13970,7 +13970,7 @@
         </w:tc>
         <w:tc>
           <w:tcPr>
-            <w:tcW w:type="dxa" w:w="2551"/>
+            <w:tcW w:type="dxa" w:w="2621"/>
           </w:tcPr>
           <w:p>
             <w:pPr>
@@ -13989,7 +13989,7 @@
       <w:tr>
         <w:tc>
           <w:tcPr>
-            <w:tcW w:type="dxa" w:w="2146"/>
+            <w:tcW w:type="dxa" w:w="2128"/>
           </w:tcPr>
           <w:p>
             <w:pPr>
@@ -14006,7 +14006,7 @@
         </w:tc>
         <w:tc>
           <w:tcPr>
-            <w:tcW w:type="dxa" w:w="2609"/>
+            <w:tcW w:type="dxa" w:w="2567"/>
           </w:tcPr>
           <w:p>
             <w:pPr>
@@ -14023,7 +14023,7 @@
         </w:tc>
         <w:tc>
           <w:tcPr>
-            <w:tcW w:type="dxa" w:w="516"/>
+            <w:tcW w:type="dxa" w:w="514"/>
           </w:tcPr>
           <w:p>
             <w:pPr>
@@ -14040,7 +14040,7 @@
         </w:tc>
         <w:tc>
           <w:tcPr>
-            <w:tcW w:type="dxa" w:w="546"/>
+            <w:tcW w:type="dxa" w:w="542"/>
           </w:tcPr>
           <w:p>
             <w:pPr>
@@ -14057,7 +14057,7 @@
         </w:tc>
         <w:tc>
           <w:tcPr>
-            <w:tcW w:type="dxa" w:w="703"/>
+            <w:tcW w:type="dxa" w:w="699"/>
           </w:tcPr>
           <w:p>
             <w:pPr>
@@ -14074,7 +14074,7 @@
         </w:tc>
         <w:tc>
           <w:tcPr>
-            <w:tcW w:type="dxa" w:w="2551"/>
+            <w:tcW w:type="dxa" w:w="2621"/>
           </w:tcPr>
           <w:p>
             <w:pPr>
@@ -14093,7 +14093,7 @@
       <w:tr>
         <w:tc>
           <w:tcPr>
-            <w:tcW w:type="dxa" w:w="2146"/>
+            <w:tcW w:type="dxa" w:w="2128"/>
           </w:tcPr>
           <w:p>
             <w:pPr>
@@ -14110,7 +14110,7 @@
         </w:tc>
         <w:tc>
           <w:tcPr>
-            <w:tcW w:type="dxa" w:w="2609"/>
+            <w:tcW w:type="dxa" w:w="2567"/>
           </w:tcPr>
           <w:p>
             <w:pPr>
@@ -14127,7 +14127,7 @@
         </w:tc>
         <w:tc>
           <w:tcPr>
-            <w:tcW w:type="dxa" w:w="516"/>
+            <w:tcW w:type="dxa" w:w="514"/>
           </w:tcPr>
           <w:p>
             <w:pPr>
@@ -14144,7 +14144,7 @@
         </w:tc>
         <w:tc>
           <w:tcPr>
-            <w:tcW w:type="dxa" w:w="546"/>
+            <w:tcW w:type="dxa" w:w="542"/>
           </w:tcPr>
           <w:p>
             <w:pPr>
@@ -14161,7 +14161,7 @@
         </w:tc>
         <w:tc>
           <w:tcPr>
-            <w:tcW w:type="dxa" w:w="703"/>
+            <w:tcW w:type="dxa" w:w="699"/>
           </w:tcPr>
           <w:p>
             <w:pPr>
@@ -14178,7 +14178,7 @@
         </w:tc>
         <w:tc>
           <w:tcPr>
-            <w:tcW w:type="dxa" w:w="2551"/>
+            <w:tcW w:type="dxa" w:w="2621"/>
           </w:tcPr>
           <w:p>
             <w:pPr>
@@ -14197,7 +14197,7 @@
       <w:tr>
         <w:tc>
           <w:tcPr>
-            <w:tcW w:type="dxa" w:w="2146"/>
+            <w:tcW w:type="dxa" w:w="2128"/>
           </w:tcPr>
           <w:p>
             <w:pPr>
@@ -14214,7 +14214,7 @@
         </w:tc>
         <w:tc>
           <w:tcPr>
-            <w:tcW w:type="dxa" w:w="2609"/>
+            <w:tcW w:type="dxa" w:w="2567"/>
           </w:tcPr>
           <w:p>
             <w:pPr>
@@ -14231,7 +14231,7 @@
         </w:tc>
         <w:tc>
           <w:tcPr>
-            <w:tcW w:type="dxa" w:w="516"/>
+            <w:tcW w:type="dxa" w:w="514"/>
           </w:tcPr>
           <w:p>
             <w:pPr>
@@ -14248,7 +14248,7 @@
         </w:tc>
         <w:tc>
           <w:tcPr>
-            <w:tcW w:type="dxa" w:w="546"/>
+            <w:tcW w:type="dxa" w:w="542"/>
           </w:tcPr>
           <w:p>
             <w:pPr>
@@ -14265,7 +14265,7 @@
         </w:tc>
         <w:tc>
           <w:tcPr>
-            <w:tcW w:type="dxa" w:w="703"/>
+            <w:tcW w:type="dxa" w:w="699"/>
           </w:tcPr>
           <w:p>
             <w:pPr>
@@ -14282,7 +14282,7 @@
         </w:tc>
         <w:tc>
           <w:tcPr>
-            <w:tcW w:type="dxa" w:w="2551"/>
+            <w:tcW w:type="dxa" w:w="2621"/>
           </w:tcPr>
           <w:p>
             <w:pPr>
@@ -14301,7 +14301,7 @@
       <w:tr>
         <w:tc>
           <w:tcPr>
-            <w:tcW w:type="dxa" w:w="2146"/>
+            <w:tcW w:type="dxa" w:w="2128"/>
           </w:tcPr>
           <w:p>
             <w:pPr>
@@ -14318,7 +14318,7 @@
         </w:tc>
         <w:tc>
           <w:tcPr>
-            <w:tcW w:type="dxa" w:w="2609"/>
+            <w:tcW w:type="dxa" w:w="2567"/>
           </w:tcPr>
           <w:p>
             <w:pPr>
@@ -14335,7 +14335,7 @@
         </w:tc>
         <w:tc>
           <w:tcPr>
-            <w:tcW w:type="dxa" w:w="516"/>
+            <w:tcW w:type="dxa" w:w="514"/>
           </w:tcPr>
           <w:p>
             <w:pPr>
@@ -14352,7 +14352,7 @@
         </w:tc>
         <w:tc>
           <w:tcPr>
-            <w:tcW w:type="dxa" w:w="546"/>
+            <w:tcW w:type="dxa" w:w="542"/>
           </w:tcPr>
           <w:p>
             <w:pPr>
@@ -14369,7 +14369,7 @@
         </w:tc>
         <w:tc>
           <w:tcPr>
-            <w:tcW w:type="dxa" w:w="703"/>
+            <w:tcW w:type="dxa" w:w="699"/>
           </w:tcPr>
           <w:p>
             <w:pPr>
@@ -14386,7 +14386,7 @@
         </w:tc>
         <w:tc>
           <w:tcPr>
-            <w:tcW w:type="dxa" w:w="2551"/>
+            <w:tcW w:type="dxa" w:w="2621"/>
           </w:tcPr>
           <w:p>
             <w:pPr>
@@ -14405,7 +14405,7 @@
       <w:tr>
         <w:tc>
           <w:tcPr>
-            <w:tcW w:type="dxa" w:w="2146"/>
+            <w:tcW w:type="dxa" w:w="2128"/>
           </w:tcPr>
           <w:p>
             <w:pPr>
@@ -14422,7 +14422,7 @@
         </w:tc>
         <w:tc>
           <w:tcPr>
-            <w:tcW w:type="dxa" w:w="2609"/>
+            <w:tcW w:type="dxa" w:w="2567"/>
           </w:tcPr>
           <w:p>
             <w:pPr>
@@ -14439,7 +14439,7 @@
         </w:tc>
         <w:tc>
           <w:tcPr>
-            <w:tcW w:type="dxa" w:w="516"/>
+            <w:tcW w:type="dxa" w:w="514"/>
           </w:tcPr>
           <w:p>
             <w:pPr>
@@ -14456,7 +14456,7 @@
         </w:tc>
         <w:tc>
           <w:tcPr>
-            <w:tcW w:type="dxa" w:w="546"/>
+            <w:tcW w:type="dxa" w:w="542"/>
           </w:tcPr>
           <w:p>
             <w:pPr>
@@ -14473,7 +14473,7 @@
         </w:tc>
         <w:tc>
           <w:tcPr>
-            <w:tcW w:type="dxa" w:w="703"/>
+            <w:tcW w:type="dxa" w:w="699"/>
           </w:tcPr>
           <w:p>
             <w:pPr>
@@ -14490,7 +14490,7 @@
         </w:tc>
         <w:tc>
           <w:tcPr>
-            <w:tcW w:type="dxa" w:w="2551"/>
+            <w:tcW w:type="dxa" w:w="2621"/>
           </w:tcPr>
           <w:p>
             <w:pPr>
@@ -14509,7 +14509,7 @@
       <w:tr>
         <w:tc>
           <w:tcPr>
-            <w:tcW w:type="dxa" w:w="2146"/>
+            <w:tcW w:type="dxa" w:w="2128"/>
           </w:tcPr>
           <w:p>
             <w:pPr>
@@ -14526,7 +14526,7 @@
         </w:tc>
         <w:tc>
           <w:tcPr>
-            <w:tcW w:type="dxa" w:w="2609"/>
+            <w:tcW w:type="dxa" w:w="2567"/>
           </w:tcPr>
           <w:p>
             <w:pPr>
@@ -14543,7 +14543,7 @@
         </w:tc>
         <w:tc>
           <w:tcPr>
-            <w:tcW w:type="dxa" w:w="516"/>
+            <w:tcW w:type="dxa" w:w="514"/>
           </w:tcPr>
           <w:p>
             <w:pPr>
@@ -14560,7 +14560,7 @@
         </w:tc>
         <w:tc>
           <w:tcPr>
-            <w:tcW w:type="dxa" w:w="546"/>
+            <w:tcW w:type="dxa" w:w="542"/>
           </w:tcPr>
           <w:p>
             <w:pPr>
@@ -14577,7 +14577,7 @@
         </w:tc>
         <w:tc>
           <w:tcPr>
-            <w:tcW w:type="dxa" w:w="703"/>
+            <w:tcW w:type="dxa" w:w="699"/>
           </w:tcPr>
           <w:p>
             <w:pPr>
@@ -14594,7 +14594,7 @@
         </w:tc>
         <w:tc>
           <w:tcPr>
-            <w:tcW w:type="dxa" w:w="2551"/>
+            <w:tcW w:type="dxa" w:w="2621"/>
           </w:tcPr>
           <w:p>
             <w:pPr>
@@ -14631,15 +14631,34 @@
               <w:rPr>
                 <w:sz w:val="16"/>
               </w:rPr>
-              <w:t xml:space="preserve">— CLAP 대체 실측 (O-68)</w:t>
-            </w:r>
-          </w:p>
-        </w:tc>
-      </w:tr>
-      <w:tr>
-        <w:tc>
-          <w:tcPr>
-            <w:tcW w:type="dxa" w:w="2146"/>
+              <w:t xml:space="preserve">— CLAP(</w:t>
+            </w:r>
+            <w:r>
+              <w:rPr>
+                <w:rStyle w:val="VerbatimChar"/>
+                <w:sz w:val="16"/>
+              </w:rPr>
+              <w:t xml:space="preserve">larger_clap_music</w:t>
+            </w:r>
+            <w:r>
+              <w:rPr>
+                <w:sz w:val="16"/>
+              </w:rPr>
+              <w:t xml:space="preserve"> </w:t>
+            </w:r>
+            <w:r>
+              <w:rPr>
+                <w:sz w:val="16"/>
+              </w:rPr>
+              <w:t xml:space="preserve">· Apache-2.0) 추출 경로가 섰고 배치·비교가 남았다 (O-68 · D-0231)</w:t>
+            </w:r>
+          </w:p>
+        </w:tc>
+      </w:tr>
+      <w:tr>
+        <w:tc>
+          <w:tcPr>
+            <w:tcW w:type="dxa" w:w="2128"/>
           </w:tcPr>
           <w:p>
             <w:pPr>
@@ -14656,7 +14675,7 @@
         </w:tc>
         <w:tc>
           <w:tcPr>
-            <w:tcW w:type="dxa" w:w="2609"/>
+            <w:tcW w:type="dxa" w:w="2567"/>
           </w:tcPr>
           <w:p>
             <w:pPr>
@@ -14673,7 +14692,7 @@
         </w:tc>
         <w:tc>
           <w:tcPr>
-            <w:tcW w:type="dxa" w:w="516"/>
+            <w:tcW w:type="dxa" w:w="514"/>
           </w:tcPr>
           <w:p>
             <w:pPr>
@@ -14690,7 +14709,7 @@
         </w:tc>
         <w:tc>
           <w:tcPr>
-            <w:tcW w:type="dxa" w:w="546"/>
+            <w:tcW w:type="dxa" w:w="542"/>
           </w:tcPr>
           <w:p>
             <w:pPr>
@@ -14707,7 +14726,7 @@
         </w:tc>
         <w:tc>
           <w:tcPr>
-            <w:tcW w:type="dxa" w:w="703"/>
+            <w:tcW w:type="dxa" w:w="699"/>
           </w:tcPr>
           <w:p>
             <w:pPr>
@@ -14724,7 +14743,7 @@
         </w:tc>
         <w:tc>
           <w:tcPr>
-            <w:tcW w:type="dxa" w:w="2551"/>
+            <w:tcW w:type="dxa" w:w="2621"/>
           </w:tcPr>
           <w:p>
             <w:pPr>
@@ -14743,7 +14762,7 @@
       <w:tr>
         <w:tc>
           <w:tcPr>
-            <w:tcW w:type="dxa" w:w="2146"/>
+            <w:tcW w:type="dxa" w:w="2128"/>
           </w:tcPr>
           <w:p>
             <w:pPr>
@@ -14760,7 +14779,7 @@
         </w:tc>
         <w:tc>
           <w:tcPr>
-            <w:tcW w:type="dxa" w:w="2609"/>
+            <w:tcW w:type="dxa" w:w="2567"/>
           </w:tcPr>
           <w:p>
             <w:pPr>
@@ -14777,7 +14796,7 @@
         </w:tc>
         <w:tc>
           <w:tcPr>
-            <w:tcW w:type="dxa" w:w="516"/>
+            <w:tcW w:type="dxa" w:w="514"/>
           </w:tcPr>
           <w:p>
             <w:pPr>
@@ -14794,7 +14813,7 @@
         </w:tc>
         <w:tc>
           <w:tcPr>
-            <w:tcW w:type="dxa" w:w="546"/>
+            <w:tcW w:type="dxa" w:w="542"/>
           </w:tcPr>
           <w:p>
             <w:pPr>
@@ -14811,7 +14830,7 @@
         </w:tc>
         <w:tc>
           <w:tcPr>
-            <w:tcW w:type="dxa" w:w="703"/>
+            <w:tcW w:type="dxa" w:w="699"/>
           </w:tcPr>
           <w:p>
             <w:pPr>
@@ -14828,7 +14847,7 @@
         </w:tc>
         <w:tc>
           <w:tcPr>
-            <w:tcW w:type="dxa" w:w="2551"/>
+            <w:tcW w:type="dxa" w:w="2621"/>
           </w:tcPr>
           <w:p>
             <w:pPr>

</xml_diff>

<commit_message>
docs: O-68 판정 — CLAP은 MERT의 27%다, 상업 가능한 대체재가 없다 (D-0235)
</commit_message>
<xml_diff>
--- a/docs/proposal.docx
+++ b/docs/proposal.docx
@@ -9653,9 +9653,9 @@
         <w:tblLook w:firstRow="1" w:lastRow="0" w:firstColumn="0" w:lastColumn="0" w:noHBand="0" w:noVBand="0" w:val="0020"/>
       </w:tblPr>
       <w:tblGrid>
-        <w:gridCol w:w="1339"/>
-        <w:gridCol w:w="4413"/>
-        <w:gridCol w:w="3319"/>
+        <w:gridCol w:w="1305"/>
+        <w:gridCol w:w="4562"/>
+        <w:gridCol w:w="3204"/>
       </w:tblGrid>
       <w:tr>
         <w:trPr>
@@ -9663,7 +9663,7 @@
         </w:trPr>
         <w:tc>
           <w:tcPr>
-            <w:tcW w:type="dxa" w:w="1339"/>
+            <w:tcW w:type="dxa" w:w="1305"/>
             <w:shd w:val="clear" w:color="auto" w:fill="E8EEF5"/>
           </w:tcPr>
           <w:p>
@@ -9683,7 +9683,7 @@
         </w:tc>
         <w:tc>
           <w:tcPr>
-            <w:tcW w:type="dxa" w:w="4413"/>
+            <w:tcW w:type="dxa" w:w="4563"/>
             <w:shd w:val="clear" w:color="auto" w:fill="E8EEF5"/>
           </w:tcPr>
           <w:p>
@@ -9703,7 +9703,7 @@
         </w:tc>
         <w:tc>
           <w:tcPr>
-            <w:tcW w:type="dxa" w:w="3319"/>
+            <w:tcW w:type="dxa" w:w="3204"/>
             <w:shd w:val="clear" w:color="auto" w:fill="E8EEF5"/>
           </w:tcPr>
           <w:p>
@@ -9725,7 +9725,7 @@
       <w:tr>
         <w:tc>
           <w:tcPr>
-            <w:tcW w:type="dxa" w:w="1339"/>
+            <w:tcW w:type="dxa" w:w="1305"/>
           </w:tcPr>
           <w:p>
             <w:pPr>
@@ -9742,7 +9742,7 @@
         </w:tc>
         <w:tc>
           <w:tcPr>
-            <w:tcW w:type="dxa" w:w="4413"/>
+            <w:tcW w:type="dxa" w:w="4563"/>
           </w:tcPr>
           <w:p>
             <w:pPr>
@@ -9785,7 +9785,7 @@
         </w:tc>
         <w:tc>
           <w:tcPr>
-            <w:tcW w:type="dxa" w:w="3319"/>
+            <w:tcW w:type="dxa" w:w="3204"/>
           </w:tcPr>
           <w:p>
             <w:pPr>
@@ -9804,7 +9804,7 @@
       <w:tr>
         <w:tc>
           <w:tcPr>
-            <w:tcW w:type="dxa" w:w="1339"/>
+            <w:tcW w:type="dxa" w:w="1305"/>
           </w:tcPr>
           <w:p>
             <w:pPr>
@@ -9821,7 +9821,7 @@
         </w:tc>
         <w:tc>
           <w:tcPr>
-            <w:tcW w:type="dxa" w:w="4413"/>
+            <w:tcW w:type="dxa" w:w="4563"/>
           </w:tcPr>
           <w:p>
             <w:pPr>
@@ -9864,7 +9864,7 @@
         </w:tc>
         <w:tc>
           <w:tcPr>
-            <w:tcW w:type="dxa" w:w="3319"/>
+            <w:tcW w:type="dxa" w:w="3204"/>
           </w:tcPr>
           <w:p>
             <w:pPr>
@@ -9883,7 +9883,7 @@
       <w:tr>
         <w:tc>
           <w:tcPr>
-            <w:tcW w:type="dxa" w:w="1339"/>
+            <w:tcW w:type="dxa" w:w="1305"/>
           </w:tcPr>
           <w:p>
             <w:pPr>
@@ -9900,7 +9900,7 @@
         </w:tc>
         <w:tc>
           <w:tcPr>
-            <w:tcW w:type="dxa" w:w="4413"/>
+            <w:tcW w:type="dxa" w:w="4563"/>
           </w:tcPr>
           <w:p>
             <w:pPr>
@@ -9917,7 +9917,7 @@
         </w:tc>
         <w:tc>
           <w:tcPr>
-            <w:tcW w:type="dxa" w:w="3319"/>
+            <w:tcW w:type="dxa" w:w="3204"/>
           </w:tcPr>
           <w:p>
             <w:pPr>
@@ -9936,7 +9936,7 @@
       <w:tr>
         <w:tc>
           <w:tcPr>
-            <w:tcW w:type="dxa" w:w="1339"/>
+            <w:tcW w:type="dxa" w:w="1305"/>
           </w:tcPr>
           <w:p>
             <w:pPr>
@@ -9953,7 +9953,7 @@
         </w:tc>
         <w:tc>
           <w:tcPr>
-            <w:tcW w:type="dxa" w:w="4413"/>
+            <w:tcW w:type="dxa" w:w="4563"/>
           </w:tcPr>
           <w:p>
             <w:pPr>
@@ -9970,7 +9970,7 @@
         </w:tc>
         <w:tc>
           <w:tcPr>
-            <w:tcW w:type="dxa" w:w="3319"/>
+            <w:tcW w:type="dxa" w:w="3204"/>
           </w:tcPr>
           <w:p>
             <w:pPr>
@@ -9989,7 +9989,7 @@
       <w:tr>
         <w:tc>
           <w:tcPr>
-            <w:tcW w:type="dxa" w:w="1339"/>
+            <w:tcW w:type="dxa" w:w="1305"/>
           </w:tcPr>
           <w:p>
             <w:pPr>
@@ -10006,7 +10006,7 @@
         </w:tc>
         <w:tc>
           <w:tcPr>
-            <w:tcW w:type="dxa" w:w="4413"/>
+            <w:tcW w:type="dxa" w:w="4563"/>
           </w:tcPr>
           <w:p>
             <w:pPr>
@@ -10023,7 +10023,7 @@
         </w:tc>
         <w:tc>
           <w:tcPr>
-            <w:tcW w:type="dxa" w:w="3319"/>
+            <w:tcW w:type="dxa" w:w="3204"/>
           </w:tcPr>
           <w:p>
             <w:pPr>
@@ -10042,7 +10042,7 @@
       <w:tr>
         <w:tc>
           <w:tcPr>
-            <w:tcW w:type="dxa" w:w="1339"/>
+            <w:tcW w:type="dxa" w:w="1305"/>
           </w:tcPr>
           <w:p>
             <w:pPr>
@@ -10059,7 +10059,7 @@
         </w:tc>
         <w:tc>
           <w:tcPr>
-            <w:tcW w:type="dxa" w:w="4413"/>
+            <w:tcW w:type="dxa" w:w="4563"/>
           </w:tcPr>
           <w:p>
             <w:pPr>
@@ -10076,7 +10076,7 @@
         </w:tc>
         <w:tc>
           <w:tcPr>
-            <w:tcW w:type="dxa" w:w="3319"/>
+            <w:tcW w:type="dxa" w:w="3204"/>
           </w:tcPr>
           <w:p>
             <w:pPr>
@@ -10095,7 +10095,7 @@
       <w:tr>
         <w:tc>
           <w:tcPr>
-            <w:tcW w:type="dxa" w:w="1339"/>
+            <w:tcW w:type="dxa" w:w="1305"/>
           </w:tcPr>
           <w:p>
             <w:pPr>
@@ -10112,7 +10112,7 @@
         </w:tc>
         <w:tc>
           <w:tcPr>
-            <w:tcW w:type="dxa" w:w="4413"/>
+            <w:tcW w:type="dxa" w:w="4563"/>
           </w:tcPr>
           <w:p>
             <w:pPr>
@@ -10129,7 +10129,7 @@
         </w:tc>
         <w:tc>
           <w:tcPr>
-            <w:tcW w:type="dxa" w:w="3319"/>
+            <w:tcW w:type="dxa" w:w="3204"/>
           </w:tcPr>
           <w:p>
             <w:pPr>
@@ -10148,7 +10148,7 @@
       <w:tr>
         <w:tc>
           <w:tcPr>
-            <w:tcW w:type="dxa" w:w="1339"/>
+            <w:tcW w:type="dxa" w:w="1305"/>
           </w:tcPr>
           <w:p>
             <w:pPr>
@@ -10165,7 +10165,7 @@
         </w:tc>
         <w:tc>
           <w:tcPr>
-            <w:tcW w:type="dxa" w:w="4413"/>
+            <w:tcW w:type="dxa" w:w="4563"/>
           </w:tcPr>
           <w:p>
             <w:pPr>
@@ -10182,7 +10182,7 @@
         </w:tc>
         <w:tc>
           <w:tcPr>
-            <w:tcW w:type="dxa" w:w="3319"/>
+            <w:tcW w:type="dxa" w:w="3204"/>
           </w:tcPr>
           <w:p>
             <w:pPr>
@@ -10201,7 +10201,7 @@
       <w:tr>
         <w:tc>
           <w:tcPr>
-            <w:tcW w:type="dxa" w:w="1339"/>
+            <w:tcW w:type="dxa" w:w="1305"/>
           </w:tcPr>
           <w:p>
             <w:pPr>
@@ -10218,7 +10218,7 @@
         </w:tc>
         <w:tc>
           <w:tcPr>
-            <w:tcW w:type="dxa" w:w="4413"/>
+            <w:tcW w:type="dxa" w:w="4563"/>
           </w:tcPr>
           <w:p>
             <w:pPr>
@@ -10235,7 +10235,7 @@
         </w:tc>
         <w:tc>
           <w:tcPr>
-            <w:tcW w:type="dxa" w:w="3319"/>
+            <w:tcW w:type="dxa" w:w="3204"/>
           </w:tcPr>
           <w:p>
             <w:pPr>
@@ -10254,7 +10254,7 @@
       <w:tr>
         <w:tc>
           <w:tcPr>
-            <w:tcW w:type="dxa" w:w="1339"/>
+            <w:tcW w:type="dxa" w:w="1305"/>
           </w:tcPr>
           <w:p>
             <w:pPr>
@@ -10271,7 +10271,7 @@
         </w:tc>
         <w:tc>
           <w:tcPr>
-            <w:tcW w:type="dxa" w:w="4413"/>
+            <w:tcW w:type="dxa" w:w="4563"/>
           </w:tcPr>
           <w:p>
             <w:pPr>
@@ -10314,7 +10314,7 @@
         </w:tc>
         <w:tc>
           <w:tcPr>
-            <w:tcW w:type="dxa" w:w="3319"/>
+            <w:tcW w:type="dxa" w:w="3204"/>
           </w:tcPr>
           <w:p>
             <w:pPr>
@@ -10333,7 +10333,7 @@
       <w:tr>
         <w:tc>
           <w:tcPr>
-            <w:tcW w:type="dxa" w:w="1339"/>
+            <w:tcW w:type="dxa" w:w="1305"/>
           </w:tcPr>
           <w:p>
             <w:pPr>
@@ -10350,7 +10350,7 @@
         </w:tc>
         <w:tc>
           <w:tcPr>
-            <w:tcW w:type="dxa" w:w="4413"/>
+            <w:tcW w:type="dxa" w:w="4563"/>
           </w:tcPr>
           <w:p>
             <w:pPr>
@@ -10367,7 +10367,7 @@
         </w:tc>
         <w:tc>
           <w:tcPr>
-            <w:tcW w:type="dxa" w:w="3319"/>
+            <w:tcW w:type="dxa" w:w="3204"/>
           </w:tcPr>
           <w:p>
             <w:pPr>
@@ -10386,7 +10386,7 @@
       <w:tr>
         <w:tc>
           <w:tcPr>
-            <w:tcW w:type="dxa" w:w="1339"/>
+            <w:tcW w:type="dxa" w:w="1305"/>
           </w:tcPr>
           <w:p>
             <w:pPr>
@@ -10403,7 +10403,7 @@
         </w:tc>
         <w:tc>
           <w:tcPr>
-            <w:tcW w:type="dxa" w:w="4413"/>
+            <w:tcW w:type="dxa" w:w="4563"/>
           </w:tcPr>
           <w:p>
             <w:pPr>
@@ -10420,7 +10420,7 @@
         </w:tc>
         <w:tc>
           <w:tcPr>
-            <w:tcW w:type="dxa" w:w="3319"/>
+            <w:tcW w:type="dxa" w:w="3204"/>
           </w:tcPr>
           <w:p>
             <w:pPr>
@@ -10439,7 +10439,7 @@
       <w:tr>
         <w:tc>
           <w:tcPr>
-            <w:tcW w:type="dxa" w:w="1339"/>
+            <w:tcW w:type="dxa" w:w="1305"/>
           </w:tcPr>
           <w:p>
             <w:pPr>
@@ -10456,7 +10456,7 @@
         </w:tc>
         <w:tc>
           <w:tcPr>
-            <w:tcW w:type="dxa" w:w="4413"/>
+            <w:tcW w:type="dxa" w:w="4563"/>
           </w:tcPr>
           <w:p>
             <w:pPr>
@@ -10473,7 +10473,7 @@
         </w:tc>
         <w:tc>
           <w:tcPr>
-            <w:tcW w:type="dxa" w:w="3319"/>
+            <w:tcW w:type="dxa" w:w="3204"/>
           </w:tcPr>
           <w:p>
             <w:pPr>
@@ -10492,7 +10492,7 @@
       <w:tr>
         <w:tc>
           <w:tcPr>
-            <w:tcW w:type="dxa" w:w="1339"/>
+            <w:tcW w:type="dxa" w:w="1305"/>
           </w:tcPr>
           <w:p>
             <w:pPr>
@@ -10509,7 +10509,7 @@
         </w:tc>
         <w:tc>
           <w:tcPr>
-            <w:tcW w:type="dxa" w:w="4413"/>
+            <w:tcW w:type="dxa" w:w="4563"/>
           </w:tcPr>
           <w:p>
             <w:pPr>
@@ -10526,7 +10526,7 @@
         </w:tc>
         <w:tc>
           <w:tcPr>
-            <w:tcW w:type="dxa" w:w="3319"/>
+            <w:tcW w:type="dxa" w:w="3204"/>
           </w:tcPr>
           <w:p>
             <w:pPr>
@@ -10545,7 +10545,7 @@
       <w:tr>
         <w:tc>
           <w:tcPr>
-            <w:tcW w:type="dxa" w:w="1339"/>
+            <w:tcW w:type="dxa" w:w="1305"/>
           </w:tcPr>
           <w:p>
             <w:pPr>
@@ -10562,7 +10562,7 @@
         </w:tc>
         <w:tc>
           <w:tcPr>
-            <w:tcW w:type="dxa" w:w="4413"/>
+            <w:tcW w:type="dxa" w:w="4563"/>
           </w:tcPr>
           <w:p>
             <w:pPr>
@@ -10579,7 +10579,7 @@
         </w:tc>
         <w:tc>
           <w:tcPr>
-            <w:tcW w:type="dxa" w:w="3319"/>
+            <w:tcW w:type="dxa" w:w="3204"/>
           </w:tcPr>
           <w:p>
             <w:pPr>
@@ -10598,7 +10598,7 @@
       <w:tr>
         <w:tc>
           <w:tcPr>
-            <w:tcW w:type="dxa" w:w="1339"/>
+            <w:tcW w:type="dxa" w:w="1305"/>
           </w:tcPr>
           <w:p>
             <w:pPr>
@@ -10615,7 +10615,7 @@
         </w:tc>
         <w:tc>
           <w:tcPr>
-            <w:tcW w:type="dxa" w:w="4413"/>
+            <w:tcW w:type="dxa" w:w="4563"/>
           </w:tcPr>
           <w:p>
             <w:pPr>
@@ -10632,7 +10632,7 @@
         </w:tc>
         <w:tc>
           <w:tcPr>
-            <w:tcW w:type="dxa" w:w="3319"/>
+            <w:tcW w:type="dxa" w:w="3204"/>
           </w:tcPr>
           <w:p>
             <w:pPr>
@@ -10651,7 +10651,7 @@
       <w:tr>
         <w:tc>
           <w:tcPr>
-            <w:tcW w:type="dxa" w:w="1339"/>
+            <w:tcW w:type="dxa" w:w="1305"/>
           </w:tcPr>
           <w:p>
             <w:pPr>
@@ -10668,7 +10668,7 @@
         </w:tc>
         <w:tc>
           <w:tcPr>
-            <w:tcW w:type="dxa" w:w="4413"/>
+            <w:tcW w:type="dxa" w:w="4563"/>
           </w:tcPr>
           <w:p>
             <w:pPr>
@@ -10685,7 +10685,7 @@
         </w:tc>
         <w:tc>
           <w:tcPr>
-            <w:tcW w:type="dxa" w:w="3319"/>
+            <w:tcW w:type="dxa" w:w="3204"/>
           </w:tcPr>
           <w:p>
             <w:pPr>
@@ -10704,7 +10704,7 @@
       <w:tr>
         <w:tc>
           <w:tcPr>
-            <w:tcW w:type="dxa" w:w="1339"/>
+            <w:tcW w:type="dxa" w:w="1305"/>
           </w:tcPr>
           <w:p>
             <w:pPr>
@@ -10721,7 +10721,7 @@
         </w:tc>
         <w:tc>
           <w:tcPr>
-            <w:tcW w:type="dxa" w:w="4413"/>
+            <w:tcW w:type="dxa" w:w="4563"/>
           </w:tcPr>
           <w:p>
             <w:pPr>
@@ -10738,7 +10738,7 @@
         </w:tc>
         <w:tc>
           <w:tcPr>
-            <w:tcW w:type="dxa" w:w="3319"/>
+            <w:tcW w:type="dxa" w:w="3204"/>
           </w:tcPr>
           <w:p>
             <w:pPr>
@@ -10757,7 +10757,7 @@
       <w:tr>
         <w:tc>
           <w:tcPr>
-            <w:tcW w:type="dxa" w:w="1339"/>
+            <w:tcW w:type="dxa" w:w="1305"/>
           </w:tcPr>
           <w:p>
             <w:pPr>
@@ -10774,7 +10774,7 @@
         </w:tc>
         <w:tc>
           <w:tcPr>
-            <w:tcW w:type="dxa" w:w="4413"/>
+            <w:tcW w:type="dxa" w:w="4563"/>
           </w:tcPr>
           <w:p>
             <w:pPr>
@@ -10791,7 +10791,7 @@
         </w:tc>
         <w:tc>
           <w:tcPr>
-            <w:tcW w:type="dxa" w:w="3319"/>
+            <w:tcW w:type="dxa" w:w="3204"/>
           </w:tcPr>
           <w:p>
             <w:pPr>
@@ -10810,7 +10810,7 @@
       <w:tr>
         <w:tc>
           <w:tcPr>
-            <w:tcW w:type="dxa" w:w="1339"/>
+            <w:tcW w:type="dxa" w:w="1305"/>
           </w:tcPr>
           <w:p>
             <w:pPr>
@@ -10827,7 +10827,7 @@
         </w:tc>
         <w:tc>
           <w:tcPr>
-            <w:tcW w:type="dxa" w:w="4413"/>
+            <w:tcW w:type="dxa" w:w="4563"/>
           </w:tcPr>
           <w:p>
             <w:pPr>
@@ -10844,7 +10844,7 @@
         </w:tc>
         <w:tc>
           <w:tcPr>
-            <w:tcW w:type="dxa" w:w="3319"/>
+            <w:tcW w:type="dxa" w:w="3204"/>
           </w:tcPr>
           <w:p>
             <w:pPr>
@@ -10863,7 +10863,7 @@
       <w:tr>
         <w:tc>
           <w:tcPr>
-            <w:tcW w:type="dxa" w:w="1339"/>
+            <w:tcW w:type="dxa" w:w="1305"/>
           </w:tcPr>
           <w:p>
             <w:pPr>
@@ -10880,7 +10880,7 @@
         </w:tc>
         <w:tc>
           <w:tcPr>
-            <w:tcW w:type="dxa" w:w="4413"/>
+            <w:tcW w:type="dxa" w:w="4563"/>
           </w:tcPr>
           <w:p>
             <w:pPr>
@@ -10897,7 +10897,7 @@
         </w:tc>
         <w:tc>
           <w:tcPr>
-            <w:tcW w:type="dxa" w:w="3319"/>
+            <w:tcW w:type="dxa" w:w="3204"/>
           </w:tcPr>
           <w:p>
             <w:pPr>
@@ -10916,7 +10916,7 @@
       <w:tr>
         <w:tc>
           <w:tcPr>
-            <w:tcW w:type="dxa" w:w="1339"/>
+            <w:tcW w:type="dxa" w:w="1305"/>
           </w:tcPr>
           <w:p>
             <w:pPr>
@@ -10933,7 +10933,7 @@
         </w:tc>
         <w:tc>
           <w:tcPr>
-            <w:tcW w:type="dxa" w:w="4413"/>
+            <w:tcW w:type="dxa" w:w="4563"/>
           </w:tcPr>
           <w:p>
             <w:pPr>
@@ -10950,7 +10950,7 @@
         </w:tc>
         <w:tc>
           <w:tcPr>
-            <w:tcW w:type="dxa" w:w="3319"/>
+            <w:tcW w:type="dxa" w:w="3204"/>
           </w:tcPr>
           <w:p>
             <w:pPr>
@@ -10969,7 +10969,7 @@
       <w:tr>
         <w:tc>
           <w:tcPr>
-            <w:tcW w:type="dxa" w:w="1339"/>
+            <w:tcW w:type="dxa" w:w="1305"/>
           </w:tcPr>
           <w:p>
             <w:pPr>
@@ -10986,7 +10986,7 @@
         </w:tc>
         <w:tc>
           <w:tcPr>
-            <w:tcW w:type="dxa" w:w="4413"/>
+            <w:tcW w:type="dxa" w:w="4563"/>
           </w:tcPr>
           <w:p>
             <w:pPr>
@@ -11003,7 +11003,7 @@
         </w:tc>
         <w:tc>
           <w:tcPr>
-            <w:tcW w:type="dxa" w:w="3319"/>
+            <w:tcW w:type="dxa" w:w="3204"/>
           </w:tcPr>
           <w:p>
             <w:pPr>
@@ -11022,7 +11022,7 @@
       <w:tr>
         <w:tc>
           <w:tcPr>
-            <w:tcW w:type="dxa" w:w="1339"/>
+            <w:tcW w:type="dxa" w:w="1305"/>
           </w:tcPr>
           <w:p>
             <w:pPr>
@@ -11039,7 +11039,7 @@
         </w:tc>
         <w:tc>
           <w:tcPr>
-            <w:tcW w:type="dxa" w:w="4413"/>
+            <w:tcW w:type="dxa" w:w="4563"/>
           </w:tcPr>
           <w:p>
             <w:pPr>
@@ -11082,7 +11082,7 @@
         </w:tc>
         <w:tc>
           <w:tcPr>
-            <w:tcW w:type="dxa" w:w="3319"/>
+            <w:tcW w:type="dxa" w:w="3204"/>
           </w:tcPr>
           <w:p>
             <w:pPr>
@@ -11101,7 +11101,7 @@
       <w:tr>
         <w:tc>
           <w:tcPr>
-            <w:tcW w:type="dxa" w:w="1339"/>
+            <w:tcW w:type="dxa" w:w="1305"/>
           </w:tcPr>
           <w:p>
             <w:pPr>
@@ -11118,7 +11118,7 @@
         </w:tc>
         <w:tc>
           <w:tcPr>
-            <w:tcW w:type="dxa" w:w="4413"/>
+            <w:tcW w:type="dxa" w:w="4563"/>
           </w:tcPr>
           <w:p>
             <w:pPr>
@@ -11149,7 +11149,7 @@
         </w:tc>
         <w:tc>
           <w:tcPr>
-            <w:tcW w:type="dxa" w:w="3319"/>
+            <w:tcW w:type="dxa" w:w="3204"/>
           </w:tcPr>
           <w:p>
             <w:pPr>
@@ -11168,7 +11168,7 @@
       <w:tr>
         <w:tc>
           <w:tcPr>
-            <w:tcW w:type="dxa" w:w="1339"/>
+            <w:tcW w:type="dxa" w:w="1305"/>
           </w:tcPr>
           <w:p>
             <w:pPr>
@@ -11185,7 +11185,7 @@
         </w:tc>
         <w:tc>
           <w:tcPr>
-            <w:tcW w:type="dxa" w:w="4413"/>
+            <w:tcW w:type="dxa" w:w="4563"/>
           </w:tcPr>
           <w:p>
             <w:pPr>
@@ -11221,7 +11221,7 @@
         </w:tc>
         <w:tc>
           <w:tcPr>
-            <w:tcW w:type="dxa" w:w="3319"/>
+            <w:tcW w:type="dxa" w:w="3204"/>
           </w:tcPr>
           <w:p>
             <w:pPr>
@@ -11240,7 +11240,7 @@
       <w:tr>
         <w:tc>
           <w:tcPr>
-            <w:tcW w:type="dxa" w:w="1339"/>
+            <w:tcW w:type="dxa" w:w="1305"/>
           </w:tcPr>
           <w:p>
             <w:pPr>
@@ -11257,7 +11257,7 @@
         </w:tc>
         <w:tc>
           <w:tcPr>
-            <w:tcW w:type="dxa" w:w="4413"/>
+            <w:tcW w:type="dxa" w:w="4563"/>
           </w:tcPr>
           <w:p>
             <w:pPr>
@@ -11300,7 +11300,7 @@
         </w:tc>
         <w:tc>
           <w:tcPr>
-            <w:tcW w:type="dxa" w:w="3319"/>
+            <w:tcW w:type="dxa" w:w="3204"/>
           </w:tcPr>
           <w:p>
             <w:pPr>
@@ -11312,6 +11312,85 @@
                 <w:sz w:val="16"/>
               </w:rPr>
               <w:t xml:space="preserve">D-0215 · D-0216</w:t>
+            </w:r>
+          </w:p>
+        </w:tc>
+      </w:tr>
+      <w:tr>
+        <w:tc>
+          <w:tcPr>
+            <w:tcW w:type="dxa" w:w="1305"/>
+          </w:tcPr>
+          <w:p>
+            <w:pPr>
+              <w:pStyle w:val="Compact"/>
+              <w:spacing w:after="0" w:line="264" w:lineRule="auto"/>
+            </w:pPr>
+            <w:r>
+              <w:rPr>
+                <w:sz w:val="16"/>
+              </w:rPr>
+              <w:t xml:space="preserve">O-68</w:t>
+            </w:r>
+          </w:p>
+        </w:tc>
+        <w:tc>
+          <w:tcPr>
+            <w:tcW w:type="dxa" w:w="4563"/>
+          </w:tcPr>
+          <w:p>
+            <w:pPr>
+              <w:pStyle w:val="Compact"/>
+              <w:spacing w:after="0" w:line="264" w:lineRule="auto"/>
+            </w:pPr>
+            <w:r>
+              <w:rPr>
+                <w:sz w:val="16"/>
+              </w:rPr>
+              <w:t xml:space="preserve">취향 축의 임베딩이 비상업이다 →</w:t>
+            </w:r>
+            <w:r>
+              <w:rPr>
+                <w:sz w:val="16"/>
+              </w:rPr>
+              <w:t xml:space="preserve"> </w:t>
+            </w:r>
+            <w:r>
+              <w:rPr>
+                <w:b/>
+                <w:bCs/>
+                <w:sz w:val="16"/>
+              </w:rPr>
+              <w:t xml:space="preserve">상업 가능한 대체재가 없다.</w:t>
+            </w:r>
+            <w:r>
+              <w:rPr>
+                <w:sz w:val="16"/>
+              </w:rPr>
+              <w:t xml:space="preserve"> </w:t>
+            </w:r>
+            <w:r>
+              <w:rPr>
+                <w:sz w:val="16"/>
+              </w:rPr>
+              <w:t xml:space="preserve">CLAP 단독은 MERT의 27%(M1) · 16%(M2)이고 상업 가능 최선(CLAP+MFCC)도 42%</w:t>
+            </w:r>
+          </w:p>
+        </w:tc>
+        <w:tc>
+          <w:tcPr>
+            <w:tcW w:type="dxa" w:w="3204"/>
+          </w:tcPr>
+          <w:p>
+            <w:pPr>
+              <w:pStyle w:val="Compact"/>
+              <w:spacing w:after="0" w:line="264" w:lineRule="auto"/>
+            </w:pPr>
+            <w:r>
+              <w:rPr>
+                <w:sz w:val="16"/>
+              </w:rPr>
+              <w:t xml:space="preserve">D-0233 · D-0234 · D-0235</w:t>
             </w:r>
           </w:p>
         </w:tc>
@@ -13542,12 +13621,12 @@
         <w:tblLook w:firstRow="1" w:lastRow="0" w:firstColumn="0" w:lastColumn="0" w:noHBand="0" w:noVBand="0" w:val="0020"/>
       </w:tblPr>
       <w:tblGrid>
-        <w:gridCol w:w="2117"/>
-        <w:gridCol w:w="2542"/>
-        <w:gridCol w:w="512"/>
-        <w:gridCol w:w="539"/>
-        <w:gridCol w:w="696"/>
-        <w:gridCol w:w="2663"/>
+        <w:gridCol w:w="2127"/>
+        <w:gridCol w:w="2565"/>
+        <w:gridCol w:w="513"/>
+        <w:gridCol w:w="542"/>
+        <w:gridCol w:w="698"/>
+        <w:gridCol w:w="2624"/>
       </w:tblGrid>
       <w:tr>
         <w:trPr>
@@ -13555,7 +13634,7 @@
         </w:trPr>
         <w:tc>
           <w:tcPr>
-            <w:tcW w:type="dxa" w:w="2118"/>
+            <w:tcW w:type="dxa" w:w="2128"/>
             <w:shd w:val="clear" w:color="auto" w:fill="E8EEF5"/>
           </w:tcPr>
           <w:p>
@@ -13575,7 +13654,7 @@
         </w:tc>
         <w:tc>
           <w:tcPr>
-            <w:tcW w:type="dxa" w:w="2542"/>
+            <w:tcW w:type="dxa" w:w="2565"/>
             <w:shd w:val="clear" w:color="auto" w:fill="E8EEF5"/>
           </w:tcPr>
           <w:p>
@@ -13595,7 +13674,7 @@
         </w:tc>
         <w:tc>
           <w:tcPr>
-            <w:tcW w:type="dxa" w:w="513"/>
+            <w:tcW w:type="dxa" w:w="514"/>
             <w:shd w:val="clear" w:color="auto" w:fill="E8EEF5"/>
           </w:tcPr>
           <w:p>
@@ -13615,7 +13694,7 @@
         </w:tc>
         <w:tc>
           <w:tcPr>
-            <w:tcW w:type="dxa" w:w="540"/>
+            <w:tcW w:type="dxa" w:w="542"/>
             <w:shd w:val="clear" w:color="auto" w:fill="E8EEF5"/>
           </w:tcPr>
           <w:p>
@@ -13635,7 +13714,7 @@
         </w:tc>
         <w:tc>
           <w:tcPr>
-            <w:tcW w:type="dxa" w:w="696"/>
+            <w:tcW w:type="dxa" w:w="698"/>
             <w:shd w:val="clear" w:color="auto" w:fill="E8EEF5"/>
           </w:tcPr>
           <w:p>
@@ -13655,7 +13734,7 @@
         </w:tc>
         <w:tc>
           <w:tcPr>
-            <w:tcW w:type="dxa" w:w="2663"/>
+            <w:tcW w:type="dxa" w:w="2625"/>
             <w:shd w:val="clear" w:color="auto" w:fill="E8EEF5"/>
           </w:tcPr>
           <w:p>
@@ -13677,7 +13756,7 @@
       <w:tr>
         <w:tc>
           <w:tcPr>
-            <w:tcW w:type="dxa" w:w="2118"/>
+            <w:tcW w:type="dxa" w:w="2128"/>
           </w:tcPr>
           <w:p>
             <w:pPr>
@@ -13694,7 +13773,7 @@
         </w:tc>
         <w:tc>
           <w:tcPr>
-            <w:tcW w:type="dxa" w:w="2542"/>
+            <w:tcW w:type="dxa" w:w="2565"/>
           </w:tcPr>
           <w:p>
             <w:pPr>
@@ -13711,7 +13790,7 @@
         </w:tc>
         <w:tc>
           <w:tcPr>
-            <w:tcW w:type="dxa" w:w="513"/>
+            <w:tcW w:type="dxa" w:w="514"/>
           </w:tcPr>
           <w:p>
             <w:pPr>
@@ -13728,7 +13807,7 @@
         </w:tc>
         <w:tc>
           <w:tcPr>
-            <w:tcW w:type="dxa" w:w="540"/>
+            <w:tcW w:type="dxa" w:w="542"/>
           </w:tcPr>
           <w:p>
             <w:pPr>
@@ -13745,7 +13824,7 @@
         </w:tc>
         <w:tc>
           <w:tcPr>
-            <w:tcW w:type="dxa" w:w="696"/>
+            <w:tcW w:type="dxa" w:w="698"/>
           </w:tcPr>
           <w:p>
             <w:pPr>
@@ -13762,7 +13841,7 @@
         </w:tc>
         <w:tc>
           <w:tcPr>
-            <w:tcW w:type="dxa" w:w="2663"/>
+            <w:tcW w:type="dxa" w:w="2625"/>
           </w:tcPr>
           <w:p>
             <w:pPr>
@@ -13781,7 +13860,7 @@
       <w:tr>
         <w:tc>
           <w:tcPr>
-            <w:tcW w:type="dxa" w:w="2118"/>
+            <w:tcW w:type="dxa" w:w="2128"/>
           </w:tcPr>
           <w:p>
             <w:pPr>
@@ -13798,7 +13877,7 @@
         </w:tc>
         <w:tc>
           <w:tcPr>
-            <w:tcW w:type="dxa" w:w="2542"/>
+            <w:tcW w:type="dxa" w:w="2565"/>
           </w:tcPr>
           <w:p>
             <w:pPr>
@@ -13815,7 +13894,7 @@
         </w:tc>
         <w:tc>
           <w:tcPr>
-            <w:tcW w:type="dxa" w:w="513"/>
+            <w:tcW w:type="dxa" w:w="514"/>
           </w:tcPr>
           <w:p>
             <w:pPr>
@@ -13832,7 +13911,7 @@
         </w:tc>
         <w:tc>
           <w:tcPr>
-            <w:tcW w:type="dxa" w:w="540"/>
+            <w:tcW w:type="dxa" w:w="542"/>
           </w:tcPr>
           <w:p>
             <w:pPr>
@@ -13849,7 +13928,7 @@
         </w:tc>
         <w:tc>
           <w:tcPr>
-            <w:tcW w:type="dxa" w:w="696"/>
+            <w:tcW w:type="dxa" w:w="698"/>
           </w:tcPr>
           <w:p>
             <w:pPr>
@@ -13866,7 +13945,7 @@
         </w:tc>
         <w:tc>
           <w:tcPr>
-            <w:tcW w:type="dxa" w:w="2663"/>
+            <w:tcW w:type="dxa" w:w="2625"/>
           </w:tcPr>
           <w:p>
             <w:pPr>
@@ -13885,7 +13964,7 @@
       <w:tr>
         <w:tc>
           <w:tcPr>
-            <w:tcW w:type="dxa" w:w="2118"/>
+            <w:tcW w:type="dxa" w:w="2128"/>
           </w:tcPr>
           <w:p>
             <w:pPr>
@@ -13902,7 +13981,7 @@
         </w:tc>
         <w:tc>
           <w:tcPr>
-            <w:tcW w:type="dxa" w:w="2542"/>
+            <w:tcW w:type="dxa" w:w="2565"/>
           </w:tcPr>
           <w:p>
             <w:pPr>
@@ -13919,7 +13998,7 @@
         </w:tc>
         <w:tc>
           <w:tcPr>
-            <w:tcW w:type="dxa" w:w="513"/>
+            <w:tcW w:type="dxa" w:w="514"/>
           </w:tcPr>
           <w:p>
             <w:pPr>
@@ -13936,7 +14015,7 @@
         </w:tc>
         <w:tc>
           <w:tcPr>
-            <w:tcW w:type="dxa" w:w="540"/>
+            <w:tcW w:type="dxa" w:w="542"/>
           </w:tcPr>
           <w:p>
             <w:pPr>
@@ -13953,7 +14032,7 @@
         </w:tc>
         <w:tc>
           <w:tcPr>
-            <w:tcW w:type="dxa" w:w="696"/>
+            <w:tcW w:type="dxa" w:w="698"/>
           </w:tcPr>
           <w:p>
             <w:pPr>
@@ -13970,7 +14049,7 @@
         </w:tc>
         <w:tc>
           <w:tcPr>
-            <w:tcW w:type="dxa" w:w="2663"/>
+            <w:tcW w:type="dxa" w:w="2625"/>
           </w:tcPr>
           <w:p>
             <w:pPr>
@@ -13989,7 +14068,7 @@
       <w:tr>
         <w:tc>
           <w:tcPr>
-            <w:tcW w:type="dxa" w:w="2118"/>
+            <w:tcW w:type="dxa" w:w="2128"/>
           </w:tcPr>
           <w:p>
             <w:pPr>
@@ -14006,7 +14085,7 @@
         </w:tc>
         <w:tc>
           <w:tcPr>
-            <w:tcW w:type="dxa" w:w="2542"/>
+            <w:tcW w:type="dxa" w:w="2565"/>
           </w:tcPr>
           <w:p>
             <w:pPr>
@@ -14023,7 +14102,7 @@
         </w:tc>
         <w:tc>
           <w:tcPr>
-            <w:tcW w:type="dxa" w:w="513"/>
+            <w:tcW w:type="dxa" w:w="514"/>
           </w:tcPr>
           <w:p>
             <w:pPr>
@@ -14040,7 +14119,7 @@
         </w:tc>
         <w:tc>
           <w:tcPr>
-            <w:tcW w:type="dxa" w:w="540"/>
+            <w:tcW w:type="dxa" w:w="542"/>
           </w:tcPr>
           <w:p>
             <w:pPr>
@@ -14057,7 +14136,7 @@
         </w:tc>
         <w:tc>
           <w:tcPr>
-            <w:tcW w:type="dxa" w:w="696"/>
+            <w:tcW w:type="dxa" w:w="698"/>
           </w:tcPr>
           <w:p>
             <w:pPr>
@@ -14074,7 +14153,7 @@
         </w:tc>
         <w:tc>
           <w:tcPr>
-            <w:tcW w:type="dxa" w:w="2663"/>
+            <w:tcW w:type="dxa" w:w="2625"/>
           </w:tcPr>
           <w:p>
             <w:pPr>
@@ -14093,7 +14172,7 @@
       <w:tr>
         <w:tc>
           <w:tcPr>
-            <w:tcW w:type="dxa" w:w="2118"/>
+            <w:tcW w:type="dxa" w:w="2128"/>
           </w:tcPr>
           <w:p>
             <w:pPr>
@@ -14110,7 +14189,7 @@
         </w:tc>
         <w:tc>
           <w:tcPr>
-            <w:tcW w:type="dxa" w:w="2542"/>
+            <w:tcW w:type="dxa" w:w="2565"/>
           </w:tcPr>
           <w:p>
             <w:pPr>
@@ -14127,7 +14206,7 @@
         </w:tc>
         <w:tc>
           <w:tcPr>
-            <w:tcW w:type="dxa" w:w="513"/>
+            <w:tcW w:type="dxa" w:w="514"/>
           </w:tcPr>
           <w:p>
             <w:pPr>
@@ -14144,7 +14223,7 @@
         </w:tc>
         <w:tc>
           <w:tcPr>
-            <w:tcW w:type="dxa" w:w="540"/>
+            <w:tcW w:type="dxa" w:w="542"/>
           </w:tcPr>
           <w:p>
             <w:pPr>
@@ -14161,7 +14240,7 @@
         </w:tc>
         <w:tc>
           <w:tcPr>
-            <w:tcW w:type="dxa" w:w="696"/>
+            <w:tcW w:type="dxa" w:w="698"/>
           </w:tcPr>
           <w:p>
             <w:pPr>
@@ -14178,7 +14257,7 @@
         </w:tc>
         <w:tc>
           <w:tcPr>
-            <w:tcW w:type="dxa" w:w="2663"/>
+            <w:tcW w:type="dxa" w:w="2625"/>
           </w:tcPr>
           <w:p>
             <w:pPr>
@@ -14197,7 +14276,7 @@
       <w:tr>
         <w:tc>
           <w:tcPr>
-            <w:tcW w:type="dxa" w:w="2118"/>
+            <w:tcW w:type="dxa" w:w="2128"/>
           </w:tcPr>
           <w:p>
             <w:pPr>
@@ -14214,7 +14293,7 @@
         </w:tc>
         <w:tc>
           <w:tcPr>
-            <w:tcW w:type="dxa" w:w="2542"/>
+            <w:tcW w:type="dxa" w:w="2565"/>
           </w:tcPr>
           <w:p>
             <w:pPr>
@@ -14231,7 +14310,7 @@
         </w:tc>
         <w:tc>
           <w:tcPr>
-            <w:tcW w:type="dxa" w:w="513"/>
+            <w:tcW w:type="dxa" w:w="514"/>
           </w:tcPr>
           <w:p>
             <w:pPr>
@@ -14248,7 +14327,7 @@
         </w:tc>
         <w:tc>
           <w:tcPr>
-            <w:tcW w:type="dxa" w:w="540"/>
+            <w:tcW w:type="dxa" w:w="542"/>
           </w:tcPr>
           <w:p>
             <w:pPr>
@@ -14265,7 +14344,7 @@
         </w:tc>
         <w:tc>
           <w:tcPr>
-            <w:tcW w:type="dxa" w:w="696"/>
+            <w:tcW w:type="dxa" w:w="698"/>
           </w:tcPr>
           <w:p>
             <w:pPr>
@@ -14282,7 +14361,7 @@
         </w:tc>
         <w:tc>
           <w:tcPr>
-            <w:tcW w:type="dxa" w:w="2663"/>
+            <w:tcW w:type="dxa" w:w="2625"/>
           </w:tcPr>
           <w:p>
             <w:pPr>
@@ -14301,7 +14380,7 @@
       <w:tr>
         <w:tc>
           <w:tcPr>
-            <w:tcW w:type="dxa" w:w="2118"/>
+            <w:tcW w:type="dxa" w:w="2128"/>
           </w:tcPr>
           <w:p>
             <w:pPr>
@@ -14318,7 +14397,7 @@
         </w:tc>
         <w:tc>
           <w:tcPr>
-            <w:tcW w:type="dxa" w:w="2542"/>
+            <w:tcW w:type="dxa" w:w="2565"/>
           </w:tcPr>
           <w:p>
             <w:pPr>
@@ -14335,7 +14414,7 @@
         </w:tc>
         <w:tc>
           <w:tcPr>
-            <w:tcW w:type="dxa" w:w="513"/>
+            <w:tcW w:type="dxa" w:w="514"/>
           </w:tcPr>
           <w:p>
             <w:pPr>
@@ -14352,7 +14431,7 @@
         </w:tc>
         <w:tc>
           <w:tcPr>
-            <w:tcW w:type="dxa" w:w="540"/>
+            <w:tcW w:type="dxa" w:w="542"/>
           </w:tcPr>
           <w:p>
             <w:pPr>
@@ -14369,7 +14448,7 @@
         </w:tc>
         <w:tc>
           <w:tcPr>
-            <w:tcW w:type="dxa" w:w="696"/>
+            <w:tcW w:type="dxa" w:w="698"/>
           </w:tcPr>
           <w:p>
             <w:pPr>
@@ -14386,7 +14465,7 @@
         </w:tc>
         <w:tc>
           <w:tcPr>
-            <w:tcW w:type="dxa" w:w="2663"/>
+            <w:tcW w:type="dxa" w:w="2625"/>
           </w:tcPr>
           <w:p>
             <w:pPr>
@@ -14405,7 +14484,7 @@
       <w:tr>
         <w:tc>
           <w:tcPr>
-            <w:tcW w:type="dxa" w:w="2118"/>
+            <w:tcW w:type="dxa" w:w="2128"/>
           </w:tcPr>
           <w:p>
             <w:pPr>
@@ -14422,7 +14501,7 @@
         </w:tc>
         <w:tc>
           <w:tcPr>
-            <w:tcW w:type="dxa" w:w="2542"/>
+            <w:tcW w:type="dxa" w:w="2565"/>
           </w:tcPr>
           <w:p>
             <w:pPr>
@@ -14439,7 +14518,7 @@
         </w:tc>
         <w:tc>
           <w:tcPr>
-            <w:tcW w:type="dxa" w:w="513"/>
+            <w:tcW w:type="dxa" w:w="514"/>
           </w:tcPr>
           <w:p>
             <w:pPr>
@@ -14456,7 +14535,7 @@
         </w:tc>
         <w:tc>
           <w:tcPr>
-            <w:tcW w:type="dxa" w:w="540"/>
+            <w:tcW w:type="dxa" w:w="542"/>
           </w:tcPr>
           <w:p>
             <w:pPr>
@@ -14473,7 +14552,7 @@
         </w:tc>
         <w:tc>
           <w:tcPr>
-            <w:tcW w:type="dxa" w:w="696"/>
+            <w:tcW w:type="dxa" w:w="698"/>
           </w:tcPr>
           <w:p>
             <w:pPr>
@@ -14490,7 +14569,7 @@
         </w:tc>
         <w:tc>
           <w:tcPr>
-            <w:tcW w:type="dxa" w:w="2663"/>
+            <w:tcW w:type="dxa" w:w="2625"/>
           </w:tcPr>
           <w:p>
             <w:pPr>
@@ -14509,7 +14588,7 @@
       <w:tr>
         <w:tc>
           <w:tcPr>
-            <w:tcW w:type="dxa" w:w="2118"/>
+            <w:tcW w:type="dxa" w:w="2128"/>
           </w:tcPr>
           <w:p>
             <w:pPr>
@@ -14526,7 +14605,7 @@
         </w:tc>
         <w:tc>
           <w:tcPr>
-            <w:tcW w:type="dxa" w:w="2542"/>
+            <w:tcW w:type="dxa" w:w="2565"/>
           </w:tcPr>
           <w:p>
             <w:pPr>
@@ -14543,7 +14622,7 @@
         </w:tc>
         <w:tc>
           <w:tcPr>
-            <w:tcW w:type="dxa" w:w="513"/>
+            <w:tcW w:type="dxa" w:w="514"/>
           </w:tcPr>
           <w:p>
             <w:pPr>
@@ -14560,7 +14639,7 @@
         </w:tc>
         <w:tc>
           <w:tcPr>
-            <w:tcW w:type="dxa" w:w="540"/>
+            <w:tcW w:type="dxa" w:w="542"/>
           </w:tcPr>
           <w:p>
             <w:pPr>
@@ -14577,35 +14656,35 @@
         </w:tc>
         <w:tc>
           <w:tcPr>
-            <w:tcW w:type="dxa" w:w="696"/>
-          </w:tcPr>
-          <w:p>
-            <w:pPr>
-              <w:pStyle w:val="Compact"/>
-              <w:spacing w:after="0" w:line="264" w:lineRule="auto"/>
-            </w:pPr>
-            <w:r>
-              <w:rPr>
-                <w:sz w:val="16"/>
-              </w:rPr>
-              <w:t xml:space="preserve">부분</w:t>
-            </w:r>
-          </w:p>
-        </w:tc>
-        <w:tc>
-          <w:tcPr>
-            <w:tcW w:type="dxa" w:w="2663"/>
-          </w:tcPr>
-          <w:p>
-            <w:pPr>
-              <w:pStyle w:val="Compact"/>
-              <w:spacing w:after="0" w:line="264" w:lineRule="auto"/>
-            </w:pPr>
-            <w:r>
-              <w:rPr>
-                <w:sz w:val="16"/>
-              </w:rPr>
-              <w:t xml:space="preserve">MERT 13층 × 5소스 완료.</w:t>
+            <w:tcW w:type="dxa" w:w="698"/>
+          </w:tcPr>
+          <w:p>
+            <w:pPr>
+              <w:pStyle w:val="Compact"/>
+              <w:spacing w:after="0" w:line="264" w:lineRule="auto"/>
+            </w:pPr>
+            <w:r>
+              <w:rPr>
+                <w:sz w:val="16"/>
+              </w:rPr>
+              <w:t xml:space="preserve">완료</w:t>
+            </w:r>
+          </w:p>
+        </w:tc>
+        <w:tc>
+          <w:tcPr>
+            <w:tcW w:type="dxa" w:w="2625"/>
+          </w:tcPr>
+          <w:p>
+            <w:pPr>
+              <w:pStyle w:val="Compact"/>
+              <w:spacing w:after="0" w:line="264" w:lineRule="auto"/>
+            </w:pPr>
+            <w:r>
+              <w:rPr>
+                <w:sz w:val="16"/>
+              </w:rPr>
+              <w:t xml:space="preserve">MERT 13층 × 5소스 · CLAP 1004곡.</w:t>
             </w:r>
             <w:r>
               <w:rPr>
@@ -14619,7 +14698,7 @@
                 <w:bCs/>
                 <w:sz w:val="16"/>
               </w:rPr>
-              <w:t xml:space="preserve">MERT 비상업</w:t>
+              <w:t xml:space="preserve">둘을 같은 자로 쟀고 CLAP이 MERT의 27%다</w:t>
             </w:r>
             <w:r>
               <w:rPr>
@@ -14631,26 +14710,7 @@
               <w:rPr>
                 <w:sz w:val="16"/>
               </w:rPr>
-              <w:t xml:space="preserve">— CLAP(</w:t>
-            </w:r>
-            <w:r>
-              <w:rPr>
-                <w:rStyle w:val="VerbatimChar"/>
-                <w:sz w:val="16"/>
-              </w:rPr>
-              <w:t xml:space="preserve">larger_clap_music</w:t>
-            </w:r>
-            <w:r>
-              <w:rPr>
-                <w:sz w:val="16"/>
-              </w:rPr>
-              <w:t xml:space="preserve"> </w:t>
-            </w:r>
-            <w:r>
-              <w:rPr>
-                <w:sz w:val="16"/>
-              </w:rPr>
-              <w:t xml:space="preserve">· Apache-2.0) 경로가 섰다.</w:t>
+              <w:t xml:space="preserve">(O-68 닫힘 · D-0235). 취향 축은 MERT로 가며</w:t>
             </w:r>
             <w:r>
               <w:rPr>
@@ -14664,27 +14724,15 @@
                 <w:bCs/>
                 <w:sz w:val="16"/>
               </w:rPr>
-              <w:t xml:space="preserve">첫 배치는 임베딩이 아니라 은닉 상태를 쌓았고 6GB를 버렸다</w:t>
-            </w:r>
-            <w:r>
-              <w:rPr>
-                <w:sz w:val="16"/>
-              </w:rPr>
-              <w:t xml:space="preserve"> </w:t>
-            </w:r>
-            <w:r>
-              <w:rPr>
-                <w:sz w:val="16"/>
-              </w:rPr>
-              <w:t xml:space="preserve">(D-0233). 다시 뽑아 비교하면 O-68이 닫힌다</w:t>
-            </w:r>
-          </w:p>
-        </w:tc>
-      </w:tr>
-      <w:tr>
-        <w:tc>
-          <w:tcPr>
-            <w:tcW w:type="dxa" w:w="2118"/>
+              <w:t xml:space="preserve">비상업 제약을 안고 간다</w:t>
+            </w:r>
+          </w:p>
+        </w:tc>
+      </w:tr>
+      <w:tr>
+        <w:tc>
+          <w:tcPr>
+            <w:tcW w:type="dxa" w:w="2128"/>
           </w:tcPr>
           <w:p>
             <w:pPr>
@@ -14701,7 +14749,7 @@
         </w:tc>
         <w:tc>
           <w:tcPr>
-            <w:tcW w:type="dxa" w:w="2542"/>
+            <w:tcW w:type="dxa" w:w="2565"/>
           </w:tcPr>
           <w:p>
             <w:pPr>
@@ -14718,7 +14766,7 @@
         </w:tc>
         <w:tc>
           <w:tcPr>
-            <w:tcW w:type="dxa" w:w="513"/>
+            <w:tcW w:type="dxa" w:w="514"/>
           </w:tcPr>
           <w:p>
             <w:pPr>
@@ -14735,7 +14783,7 @@
         </w:tc>
         <w:tc>
           <w:tcPr>
-            <w:tcW w:type="dxa" w:w="540"/>
+            <w:tcW w:type="dxa" w:w="542"/>
           </w:tcPr>
           <w:p>
             <w:pPr>
@@ -14752,7 +14800,7 @@
         </w:tc>
         <w:tc>
           <w:tcPr>
-            <w:tcW w:type="dxa" w:w="696"/>
+            <w:tcW w:type="dxa" w:w="698"/>
           </w:tcPr>
           <w:p>
             <w:pPr>
@@ -14769,7 +14817,7 @@
         </w:tc>
         <w:tc>
           <w:tcPr>
-            <w:tcW w:type="dxa" w:w="2663"/>
+            <w:tcW w:type="dxa" w:w="2625"/>
           </w:tcPr>
           <w:p>
             <w:pPr>
@@ -14788,7 +14836,7 @@
       <w:tr>
         <w:tc>
           <w:tcPr>
-            <w:tcW w:type="dxa" w:w="2118"/>
+            <w:tcW w:type="dxa" w:w="2128"/>
           </w:tcPr>
           <w:p>
             <w:pPr>
@@ -14805,7 +14853,7 @@
         </w:tc>
         <w:tc>
           <w:tcPr>
-            <w:tcW w:type="dxa" w:w="2542"/>
+            <w:tcW w:type="dxa" w:w="2565"/>
           </w:tcPr>
           <w:p>
             <w:pPr>
@@ -14822,7 +14870,7 @@
         </w:tc>
         <w:tc>
           <w:tcPr>
-            <w:tcW w:type="dxa" w:w="513"/>
+            <w:tcW w:type="dxa" w:w="514"/>
           </w:tcPr>
           <w:p>
             <w:pPr>
@@ -14839,7 +14887,7 @@
         </w:tc>
         <w:tc>
           <w:tcPr>
-            <w:tcW w:type="dxa" w:w="540"/>
+            <w:tcW w:type="dxa" w:w="542"/>
           </w:tcPr>
           <w:p>
             <w:pPr>
@@ -14856,7 +14904,7 @@
         </w:tc>
         <w:tc>
           <w:tcPr>
-            <w:tcW w:type="dxa" w:w="696"/>
+            <w:tcW w:type="dxa" w:w="698"/>
           </w:tcPr>
           <w:p>
             <w:pPr>
@@ -14873,7 +14921,7 @@
         </w:tc>
         <w:tc>
           <w:tcPr>
-            <w:tcW w:type="dxa" w:w="2663"/>
+            <w:tcW w:type="dxa" w:w="2625"/>
           </w:tcPr>
           <w:p>
             <w:pPr>
@@ -38651,7 +38699,7 @@
       <w:r>
         <w:drawing>
           <wp:inline>
-            <wp:extent cx="5334000" cy="3023648"/>
+            <wp:extent cx="5334000" cy="3019195"/>
             <wp:effectExtent b="0" l="0" r="0" t="0"/>
             <wp:docPr descr="4축과 모델 — 스템 분리가 편곡 · 가창의 전제다" title="" id="116" name="Picture"/>
             <a:graphic>
@@ -38672,7 +38720,7 @@
                   <pic:spPr bwMode="auto">
                     <a:xfrm>
                       <a:off x="0" y="0"/>
-                      <a:ext cx="5334000" cy="3023648"/>
+                      <a:ext cx="5334000" cy="3019195"/>
                     </a:xfrm>
                     <a:prstGeom prst="rect">
                       <a:avLst/>
@@ -48949,6 +48997,143 @@
           <w:bCs/>
         </w:rPr>
         <w:t xml:space="preserve">M2의 검정력이 M1보다 높다.</w:t>
+      </w:r>
+    </w:p>
+    <w:p>
+      <w:pPr>
+        <w:pStyle w:val="Compact"/>
+        <w:numPr>
+          <w:ilvl w:val="0"/>
+          <w:numId w:val="1005"/>
+        </w:numPr>
+      </w:pPr>
+      <w:r>
+        <w:rPr>
+          <w:b/>
+          <w:bCs/>
+        </w:rPr>
+        <w:t xml:space="preserve">상업 가능 축 실측은 D-0235 (O-68 닫힘).</w:t>
+      </w:r>
+      <w:r>
+        <w:t xml:space="preserve"> </w:t>
+      </w:r>
+      <w:r>
+        <w:t xml:space="preserve">같은 1004곡·홀짝 분할에서</w:t>
+      </w:r>
+      <w:r>
+        <w:t xml:space="preserve"> </w:t>
+      </w:r>
+      <w:r>
+        <w:rPr>
+          <w:b/>
+          <w:bCs/>
+        </w:rPr>
+        <w:t xml:space="preserve">CLAP 단독 M1 MAP@10</w:t>
+      </w:r>
+      <w:r>
+        <w:rPr>
+          <w:b/>
+          <w:bCs/>
+        </w:rPr>
+        <w:t xml:space="preserve"> </w:t>
+      </w:r>
+      <w:r>
+        <w:rPr>
+          <w:b/>
+          <w:bCs/>
+        </w:rPr>
+        <w:t xml:space="preserve">0.0527(6.6배) · M2 0.0348(3.6배)</w:t>
+      </w:r>
+      <w:r>
+        <w:t xml:space="preserve"> </w:t>
+      </w:r>
+      <w:r>
+        <w:t xml:space="preserve">— MERT</w:t>
+      </w:r>
+      <w:r>
+        <w:t xml:space="preserve"> </w:t>
+      </w:r>
+      <w:r>
+        <w:rPr>
+          <w:rStyle w:val="VerbatimChar"/>
+        </w:rPr>
+        <w:t xml:space="preserve">layer00</w:t>
+      </w:r>
+      <w:r>
+        <w:t xml:space="preserve">의</w:t>
+      </w:r>
+      <w:r>
+        <w:t xml:space="preserve"> </w:t>
+      </w:r>
+      <w:r>
+        <w:rPr>
+          <w:b/>
+          <w:bCs/>
+        </w:rPr>
+        <w:t xml:space="preserve">27% · 16%</w:t>
+      </w:r>
+      <w:r>
+        <w:t xml:space="preserve">다. 상업 가능 최선은</w:t>
+      </w:r>
+      <w:r>
+        <w:t xml:space="preserve"> </w:t>
+      </w:r>
+      <w:r>
+        <w:rPr>
+          <w:b/>
+          <w:bCs/>
+        </w:rPr>
+        <w:t xml:space="preserve">CLAP+MFCC(</w:t>
+      </w:r>
+      <w:r>
+        <w:rPr>
+          <w:rStyle w:val="VerbatimChar"/>
+          <w:b/>
+          <w:bCs/>
+        </w:rPr>
+        <w:t xml:space="preserve">--block-l2</w:t>
+      </w:r>
+      <w:r>
+        <w:rPr>
+          <w:b/>
+          <w:bCs/>
+        </w:rPr>
+        <w:t xml:space="preserve">) 0.0825(9.9배) · 0.0822(7.1배)</w:t>
+      </w:r>
+      <w:r>
+        <w:t xml:space="preserve">이며 42% · 38%다.</w:t>
+      </w:r>
+      <w:r>
+        <w:t xml:space="preserve"> </w:t>
+      </w:r>
+      <w:r>
+        <w:rPr>
+          <w:b/>
+          <w:bCs/>
+        </w:rPr>
+        <w:t xml:space="preserve">MFCC를 붙이면 CLAP은 +57%, MERT는 -32%다</w:t>
+      </w:r>
+      <w:r>
+        <w:t xml:space="preserve"> </w:t>
+      </w:r>
+      <w:r>
+        <w:t xml:space="preserve">— CLAP에 없는 음향 정보가 MFCC에 있고</w:t>
+      </w:r>
+      <w:r>
+        <w:t xml:space="preserve"> </w:t>
+      </w:r>
+      <w:r>
+        <w:t xml:space="preserve">MERT 첫 층에는 이미 있다.</w:t>
+      </w:r>
+      <w:r>
+        <w:t xml:space="preserve"> </w:t>
+      </w:r>
+      <w:r>
+        <w:rPr>
+          <w:b/>
+          <w:bCs/>
+        </w:rPr>
+        <w:t xml:space="preserve">대체재는 없다.</w:t>
       </w:r>
     </w:p>
     <w:p>

</xml_diff>